<commit_message>
Notebook rerun (MLP sigmoide) + rapport et graphes alignes
</commit_message>
<xml_diff>
--- a/VisionAI_rapport.docx
+++ b/VisionAI_rapport.docx
@@ -7,7 +7,6 @@
         <w:spacing w:before="2600"/>
         <w:jc w:val="center"/>
       </w:pPr>
-      <w:proofErr w:type="spellStart"/>
       <w:r>
         <w:rPr>
           <w:rFonts w:ascii="Cambria" w:eastAsia="Cambria" w:hAnsi="Cambria" w:cs="Cambria"/>
@@ -19,7 +18,6 @@
         </w:rPr>
         <w:t>VisionAI</w:t>
       </w:r>
-      <w:proofErr w:type="spellEnd"/>
     </w:p>
     <w:p>
       <w:pPr>
@@ -102,7 +100,7 @@
       <w:pPr>
         <w:pStyle w:val="Titre1"/>
       </w:pPr>
-      <w:bookmarkStart w:id="0" w:name="_Toc235380943"/>
+      <w:bookmarkStart w:id="0" w:name="_Toc235392527"/>
       <w:r>
         <w:rPr>
           <w:rFonts w:ascii="Cambria" w:eastAsia="Cambria" w:hAnsi="Cambria" w:cs="Cambria"/>
@@ -120,7 +118,7 @@
     <w:sdt>
       <w:sdtPr>
         <w:alias w:val="Sommaire"/>
-        <w:id w:val="136767870"/>
+        <w:id w:val="-584840836"/>
       </w:sdtPr>
       <w:sdtContent>
         <w:p>
@@ -142,7 +140,7 @@
           <w:r>
             <w:fldChar w:fldCharType="separate"/>
           </w:r>
-          <w:hyperlink w:anchor="_Toc235380943" w:history="1">
+          <w:hyperlink w:anchor="_Toc235392527" w:history="1">
             <w:r>
               <w:rPr>
                 <w:rStyle w:val="Lienhypertexte"/>
@@ -169,7 +167,7 @@
               <w:rPr>
                 <w:noProof/>
               </w:rPr>
-              <w:instrText xml:space="preserve"> PAGEREF _Toc235380943 \h </w:instrText>
+              <w:instrText xml:space="preserve"> PAGEREF _Toc235392527 \h </w:instrText>
             </w:r>
             <w:r>
               <w:rPr>
@@ -206,7 +204,7 @@
               <w:noProof/>
             </w:rPr>
           </w:pPr>
-          <w:hyperlink w:anchor="_Toc235380944" w:history="1">
+          <w:hyperlink w:anchor="_Toc235392528" w:history="1">
             <w:r>
               <w:rPr>
                 <w:rStyle w:val="Lienhypertexte"/>
@@ -233,7 +231,7 @@
               <w:rPr>
                 <w:noProof/>
               </w:rPr>
-              <w:instrText xml:space="preserve"> PAGEREF _Toc235380944 \h </w:instrText>
+              <w:instrText xml:space="preserve"> PAGEREF _Toc235392528 \h </w:instrText>
             </w:r>
             <w:r>
               <w:rPr>
@@ -270,7 +268,7 @@
               <w:noProof/>
             </w:rPr>
           </w:pPr>
-          <w:hyperlink w:anchor="_Toc235380945" w:history="1">
+          <w:hyperlink w:anchor="_Toc235392529" w:history="1">
             <w:r>
               <w:rPr>
                 <w:rStyle w:val="Lienhypertexte"/>
@@ -297,7 +295,7 @@
               <w:rPr>
                 <w:noProof/>
               </w:rPr>
-              <w:instrText xml:space="preserve"> PAGEREF _Toc235380945 \h </w:instrText>
+              <w:instrText xml:space="preserve"> PAGEREF _Toc235392529 \h </w:instrText>
             </w:r>
             <w:r>
               <w:rPr>
@@ -334,7 +332,7 @@
               <w:noProof/>
             </w:rPr>
           </w:pPr>
-          <w:hyperlink w:anchor="_Toc235380946" w:history="1">
+          <w:hyperlink w:anchor="_Toc235392530" w:history="1">
             <w:r>
               <w:rPr>
                 <w:rStyle w:val="Lienhypertexte"/>
@@ -361,7 +359,7 @@
               <w:rPr>
                 <w:noProof/>
               </w:rPr>
-              <w:instrText xml:space="preserve"> PAGEREF _Toc235380946 \h </w:instrText>
+              <w:instrText xml:space="preserve"> PAGEREF _Toc235392530 \h </w:instrText>
             </w:r>
             <w:r>
               <w:rPr>
@@ -398,7 +396,7 @@
               <w:noProof/>
             </w:rPr>
           </w:pPr>
-          <w:hyperlink w:anchor="_Toc235380947" w:history="1">
+          <w:hyperlink w:anchor="_Toc235392531" w:history="1">
             <w:r>
               <w:rPr>
                 <w:rStyle w:val="Lienhypertexte"/>
@@ -425,7 +423,7 @@
               <w:rPr>
                 <w:noProof/>
               </w:rPr>
-              <w:instrText xml:space="preserve"> PAGEREF _Toc235380947 \h </w:instrText>
+              <w:instrText xml:space="preserve"> PAGEREF _Toc235392531 \h </w:instrText>
             </w:r>
             <w:r>
               <w:rPr>
@@ -462,7 +460,7 @@
               <w:noProof/>
             </w:rPr>
           </w:pPr>
-          <w:hyperlink w:anchor="_Toc235380948" w:history="1">
+          <w:hyperlink w:anchor="_Toc235392532" w:history="1">
             <w:r>
               <w:rPr>
                 <w:rStyle w:val="Lienhypertexte"/>
@@ -489,7 +487,7 @@
               <w:rPr>
                 <w:noProof/>
               </w:rPr>
-              <w:instrText xml:space="preserve"> PAGEREF _Toc235380948 \h </w:instrText>
+              <w:instrText xml:space="preserve"> PAGEREF _Toc235392532 \h </w:instrText>
             </w:r>
             <w:r>
               <w:rPr>
@@ -526,7 +524,7 @@
               <w:noProof/>
             </w:rPr>
           </w:pPr>
-          <w:hyperlink w:anchor="_Toc235380949" w:history="1">
+          <w:hyperlink w:anchor="_Toc235392533" w:history="1">
             <w:r>
               <w:rPr>
                 <w:rStyle w:val="Lienhypertexte"/>
@@ -553,7 +551,7 @@
               <w:rPr>
                 <w:noProof/>
               </w:rPr>
-              <w:instrText xml:space="preserve"> PAGEREF _Toc235380949 \h </w:instrText>
+              <w:instrText xml:space="preserve"> PAGEREF _Toc235392533 \h </w:instrText>
             </w:r>
             <w:r>
               <w:rPr>
@@ -590,7 +588,7 @@
               <w:noProof/>
             </w:rPr>
           </w:pPr>
-          <w:hyperlink w:anchor="_Toc235380950" w:history="1">
+          <w:hyperlink w:anchor="_Toc235392534" w:history="1">
             <w:r>
               <w:rPr>
                 <w:rStyle w:val="Lienhypertexte"/>
@@ -617,7 +615,7 @@
               <w:rPr>
                 <w:noProof/>
               </w:rPr>
-              <w:instrText xml:space="preserve"> PAGEREF _Toc235380950 \h </w:instrText>
+              <w:instrText xml:space="preserve"> PAGEREF _Toc235392534 \h </w:instrText>
             </w:r>
             <w:r>
               <w:rPr>
@@ -654,7 +652,7 @@
               <w:noProof/>
             </w:rPr>
           </w:pPr>
-          <w:hyperlink w:anchor="_Toc235380951" w:history="1">
+          <w:hyperlink w:anchor="_Toc235392535" w:history="1">
             <w:r>
               <w:rPr>
                 <w:rStyle w:val="Lienhypertexte"/>
@@ -681,7 +679,7 @@
               <w:rPr>
                 <w:noProof/>
               </w:rPr>
-              <w:instrText xml:space="preserve"> PAGEREF _Toc235380951 \h </w:instrText>
+              <w:instrText xml:space="preserve"> PAGEREF _Toc235392535 \h </w:instrText>
             </w:r>
             <w:r>
               <w:rPr>
@@ -718,7 +716,7 @@
               <w:noProof/>
             </w:rPr>
           </w:pPr>
-          <w:hyperlink w:anchor="_Toc235380952" w:history="1">
+          <w:hyperlink w:anchor="_Toc235392536" w:history="1">
             <w:r>
               <w:rPr>
                 <w:rStyle w:val="Lienhypertexte"/>
@@ -745,7 +743,7 @@
               <w:rPr>
                 <w:noProof/>
               </w:rPr>
-              <w:instrText xml:space="preserve"> PAGEREF _Toc235380952 \h </w:instrText>
+              <w:instrText xml:space="preserve"> PAGEREF _Toc235392536 \h </w:instrText>
             </w:r>
             <w:r>
               <w:rPr>
@@ -782,7 +780,7 @@
               <w:noProof/>
             </w:rPr>
           </w:pPr>
-          <w:hyperlink w:anchor="_Toc235380953" w:history="1">
+          <w:hyperlink w:anchor="_Toc235392537" w:history="1">
             <w:r>
               <w:rPr>
                 <w:rStyle w:val="Lienhypertexte"/>
@@ -809,7 +807,7 @@
               <w:rPr>
                 <w:noProof/>
               </w:rPr>
-              <w:instrText xml:space="preserve"> PAGEREF _Toc235380953 \h </w:instrText>
+              <w:instrText xml:space="preserve"> PAGEREF _Toc235392537 \h </w:instrText>
             </w:r>
             <w:r>
               <w:rPr>
@@ -846,7 +844,7 @@
               <w:noProof/>
             </w:rPr>
           </w:pPr>
-          <w:hyperlink w:anchor="_Toc235380954" w:history="1">
+          <w:hyperlink w:anchor="_Toc235392538" w:history="1">
             <w:r>
               <w:rPr>
                 <w:rStyle w:val="Lienhypertexte"/>
@@ -873,7 +871,7 @@
               <w:rPr>
                 <w:noProof/>
               </w:rPr>
-              <w:instrText xml:space="preserve"> PAGEREF _Toc235380954 \h </w:instrText>
+              <w:instrText xml:space="preserve"> PAGEREF _Toc235392538 \h </w:instrText>
             </w:r>
             <w:r>
               <w:rPr>
@@ -910,7 +908,7 @@
               <w:noProof/>
             </w:rPr>
           </w:pPr>
-          <w:hyperlink w:anchor="_Toc235380955" w:history="1">
+          <w:hyperlink w:anchor="_Toc235392539" w:history="1">
             <w:r>
               <w:rPr>
                 <w:rStyle w:val="Lienhypertexte"/>
@@ -937,7 +935,7 @@
               <w:rPr>
                 <w:noProof/>
               </w:rPr>
-              <w:instrText xml:space="preserve"> PAGEREF _Toc235380955 \h </w:instrText>
+              <w:instrText xml:space="preserve"> PAGEREF _Toc235392539 \h </w:instrText>
             </w:r>
             <w:r>
               <w:rPr>
@@ -974,7 +972,7 @@
               <w:noProof/>
             </w:rPr>
           </w:pPr>
-          <w:hyperlink w:anchor="_Toc235380956" w:history="1">
+          <w:hyperlink w:anchor="_Toc235392540" w:history="1">
             <w:r>
               <w:rPr>
                 <w:rStyle w:val="Lienhypertexte"/>
@@ -1001,7 +999,7 @@
               <w:rPr>
                 <w:noProof/>
               </w:rPr>
-              <w:instrText xml:space="preserve"> PAGEREF _Toc235380956 \h </w:instrText>
+              <w:instrText xml:space="preserve"> PAGEREF _Toc235392540 \h </w:instrText>
             </w:r>
             <w:r>
               <w:rPr>
@@ -1038,7 +1036,7 @@
               <w:noProof/>
             </w:rPr>
           </w:pPr>
-          <w:hyperlink w:anchor="_Toc235380957" w:history="1">
+          <w:hyperlink w:anchor="_Toc235392541" w:history="1">
             <w:r>
               <w:rPr>
                 <w:rStyle w:val="Lienhypertexte"/>
@@ -1065,7 +1063,7 @@
               <w:rPr>
                 <w:noProof/>
               </w:rPr>
-              <w:instrText xml:space="preserve"> PAGEREF _Toc235380957 \h </w:instrText>
+              <w:instrText xml:space="preserve"> PAGEREF _Toc235392541 \h </w:instrText>
             </w:r>
             <w:r>
               <w:rPr>
@@ -1102,7 +1100,7 @@
               <w:noProof/>
             </w:rPr>
           </w:pPr>
-          <w:hyperlink w:anchor="_Toc235380958" w:history="1">
+          <w:hyperlink w:anchor="_Toc235392542" w:history="1">
             <w:r>
               <w:rPr>
                 <w:rStyle w:val="Lienhypertexte"/>
@@ -1129,7 +1127,7 @@
               <w:rPr>
                 <w:noProof/>
               </w:rPr>
-              <w:instrText xml:space="preserve"> PAGEREF _Toc235380958 \h </w:instrText>
+              <w:instrText xml:space="preserve"> PAGEREF _Toc235392542 \h </w:instrText>
             </w:r>
             <w:r>
               <w:rPr>
@@ -1166,7 +1164,7 @@
               <w:noProof/>
             </w:rPr>
           </w:pPr>
-          <w:hyperlink w:anchor="_Toc235380959" w:history="1">
+          <w:hyperlink w:anchor="_Toc235392543" w:history="1">
             <w:r>
               <w:rPr>
                 <w:rStyle w:val="Lienhypertexte"/>
@@ -1193,7 +1191,7 @@
               <w:rPr>
                 <w:noProof/>
               </w:rPr>
-              <w:instrText xml:space="preserve"> PAGEREF _Toc235380959 \h </w:instrText>
+              <w:instrText xml:space="preserve"> PAGEREF _Toc235392543 \h </w:instrText>
             </w:r>
             <w:r>
               <w:rPr>
@@ -1230,7 +1228,7 @@
               <w:noProof/>
             </w:rPr>
           </w:pPr>
-          <w:hyperlink w:anchor="_Toc235380960" w:history="1">
+          <w:hyperlink w:anchor="_Toc235392544" w:history="1">
             <w:r>
               <w:rPr>
                 <w:rStyle w:val="Lienhypertexte"/>
@@ -1257,7 +1255,7 @@
               <w:rPr>
                 <w:noProof/>
               </w:rPr>
-              <w:instrText xml:space="preserve"> PAGEREF _Toc235380960 \h </w:instrText>
+              <w:instrText xml:space="preserve"> PAGEREF _Toc235392544 \h </w:instrText>
             </w:r>
             <w:r>
               <w:rPr>
@@ -1294,7 +1292,7 @@
               <w:noProof/>
             </w:rPr>
           </w:pPr>
-          <w:hyperlink w:anchor="_Toc235380961" w:history="1">
+          <w:hyperlink w:anchor="_Toc235392545" w:history="1">
             <w:r>
               <w:rPr>
                 <w:rStyle w:val="Lienhypertexte"/>
@@ -1321,7 +1319,7 @@
               <w:rPr>
                 <w:noProof/>
               </w:rPr>
-              <w:instrText xml:space="preserve"> PAGEREF _Toc235380961 \h </w:instrText>
+              <w:instrText xml:space="preserve"> PAGEREF _Toc235392545 \h </w:instrText>
             </w:r>
             <w:r>
               <w:rPr>
@@ -1358,7 +1356,7 @@
               <w:noProof/>
             </w:rPr>
           </w:pPr>
-          <w:hyperlink w:anchor="_Toc235380962" w:history="1">
+          <w:hyperlink w:anchor="_Toc235392546" w:history="1">
             <w:r>
               <w:rPr>
                 <w:rStyle w:val="Lienhypertexte"/>
@@ -1385,7 +1383,7 @@
               <w:rPr>
                 <w:noProof/>
               </w:rPr>
-              <w:instrText xml:space="preserve"> PAGEREF _Toc235380962 \h </w:instrText>
+              <w:instrText xml:space="preserve"> PAGEREF _Toc235392546 \h </w:instrText>
             </w:r>
             <w:r>
               <w:rPr>
@@ -1422,7 +1420,7 @@
               <w:noProof/>
             </w:rPr>
           </w:pPr>
-          <w:hyperlink w:anchor="_Toc235380963" w:history="1">
+          <w:hyperlink w:anchor="_Toc235392547" w:history="1">
             <w:r>
               <w:rPr>
                 <w:rStyle w:val="Lienhypertexte"/>
@@ -1449,7 +1447,7 @@
               <w:rPr>
                 <w:noProof/>
               </w:rPr>
-              <w:instrText xml:space="preserve"> PAGEREF _Toc235380963 \h </w:instrText>
+              <w:instrText xml:space="preserve"> PAGEREF _Toc235392547 \h </w:instrText>
             </w:r>
             <w:r>
               <w:rPr>
@@ -1486,7 +1484,7 @@
               <w:noProof/>
             </w:rPr>
           </w:pPr>
-          <w:hyperlink w:anchor="_Toc235380964" w:history="1">
+          <w:hyperlink w:anchor="_Toc235392548" w:history="1">
             <w:r>
               <w:rPr>
                 <w:rStyle w:val="Lienhypertexte"/>
@@ -1513,7 +1511,7 @@
               <w:rPr>
                 <w:noProof/>
               </w:rPr>
-              <w:instrText xml:space="preserve"> PAGEREF _Toc235380964 \h </w:instrText>
+              <w:instrText xml:space="preserve"> PAGEREF _Toc235392548 \h </w:instrText>
             </w:r>
             <w:r>
               <w:rPr>
@@ -1550,7 +1548,7 @@
               <w:noProof/>
             </w:rPr>
           </w:pPr>
-          <w:hyperlink w:anchor="_Toc235380965" w:history="1">
+          <w:hyperlink w:anchor="_Toc235392549" w:history="1">
             <w:r>
               <w:rPr>
                 <w:rStyle w:val="Lienhypertexte"/>
@@ -1577,7 +1575,7 @@
               <w:rPr>
                 <w:noProof/>
               </w:rPr>
-              <w:instrText xml:space="preserve"> PAGEREF _Toc235380965 \h </w:instrText>
+              <w:instrText xml:space="preserve"> PAGEREF _Toc235392549 \h </w:instrText>
             </w:r>
             <w:r>
               <w:rPr>
@@ -1614,7 +1612,7 @@
               <w:noProof/>
             </w:rPr>
           </w:pPr>
-          <w:hyperlink w:anchor="_Toc235380966" w:history="1">
+          <w:hyperlink w:anchor="_Toc235392550" w:history="1">
             <w:r>
               <w:rPr>
                 <w:rStyle w:val="Lienhypertexte"/>
@@ -1641,7 +1639,7 @@
               <w:rPr>
                 <w:noProof/>
               </w:rPr>
-              <w:instrText xml:space="preserve"> PAGEREF _Toc235380966 \h </w:instrText>
+              <w:instrText xml:space="preserve"> PAGEREF _Toc235392550 \h </w:instrText>
             </w:r>
             <w:r>
               <w:rPr>
@@ -1678,7 +1676,7 @@
               <w:noProof/>
             </w:rPr>
           </w:pPr>
-          <w:hyperlink w:anchor="_Toc235380967" w:history="1">
+          <w:hyperlink w:anchor="_Toc235392551" w:history="1">
             <w:r>
               <w:rPr>
                 <w:rStyle w:val="Lienhypertexte"/>
@@ -1705,7 +1703,7 @@
               <w:rPr>
                 <w:noProof/>
               </w:rPr>
-              <w:instrText xml:space="preserve"> PAGEREF _Toc235380967 \h </w:instrText>
+              <w:instrText xml:space="preserve"> PAGEREF _Toc235392551 \h </w:instrText>
             </w:r>
             <w:r>
               <w:rPr>
@@ -1722,7 +1720,7 @@
               <w:rPr>
                 <w:noProof/>
               </w:rPr>
-              <w:t>16</w:t>
+              <w:t>17</w:t>
             </w:r>
             <w:r>
               <w:rPr>
@@ -1742,7 +1740,7 @@
               <w:noProof/>
             </w:rPr>
           </w:pPr>
-          <w:hyperlink w:anchor="_Toc235380968" w:history="1">
+          <w:hyperlink w:anchor="_Toc235392552" w:history="1">
             <w:r>
               <w:rPr>
                 <w:rStyle w:val="Lienhypertexte"/>
@@ -1769,7 +1767,7 @@
               <w:rPr>
                 <w:noProof/>
               </w:rPr>
-              <w:instrText xml:space="preserve"> PAGEREF _Toc235380968 \h </w:instrText>
+              <w:instrText xml:space="preserve"> PAGEREF _Toc235392552 \h </w:instrText>
             </w:r>
             <w:r>
               <w:rPr>
@@ -1806,7 +1804,7 @@
               <w:noProof/>
             </w:rPr>
           </w:pPr>
-          <w:hyperlink w:anchor="_Toc235380969" w:history="1">
+          <w:hyperlink w:anchor="_Toc235392553" w:history="1">
             <w:r>
               <w:rPr>
                 <w:rStyle w:val="Lienhypertexte"/>
@@ -1833,7 +1831,7 @@
               <w:rPr>
                 <w:noProof/>
               </w:rPr>
-              <w:instrText xml:space="preserve"> PAGEREF _Toc235380969 \h </w:instrText>
+              <w:instrText xml:space="preserve"> PAGEREF _Toc235392553 \h </w:instrText>
             </w:r>
             <w:r>
               <w:rPr>
@@ -1870,7 +1868,7 @@
               <w:noProof/>
             </w:rPr>
           </w:pPr>
-          <w:hyperlink w:anchor="_Toc235380970" w:history="1">
+          <w:hyperlink w:anchor="_Toc235392554" w:history="1">
             <w:r>
               <w:rPr>
                 <w:rStyle w:val="Lienhypertexte"/>
@@ -1897,7 +1895,7 @@
               <w:rPr>
                 <w:noProof/>
               </w:rPr>
-              <w:instrText xml:space="preserve"> PAGEREF _Toc235380970 \h </w:instrText>
+              <w:instrText xml:space="preserve"> PAGEREF _Toc235392554 \h </w:instrText>
             </w:r>
             <w:r>
               <w:rPr>
@@ -1934,7 +1932,7 @@
               <w:noProof/>
             </w:rPr>
           </w:pPr>
-          <w:hyperlink w:anchor="_Toc235380971" w:history="1">
+          <w:hyperlink w:anchor="_Toc235392555" w:history="1">
             <w:r>
               <w:rPr>
                 <w:rStyle w:val="Lienhypertexte"/>
@@ -1961,7 +1959,7 @@
               <w:rPr>
                 <w:noProof/>
               </w:rPr>
-              <w:instrText xml:space="preserve"> PAGEREF _Toc235380971 \h </w:instrText>
+              <w:instrText xml:space="preserve"> PAGEREF _Toc235392555 \h </w:instrText>
             </w:r>
             <w:r>
               <w:rPr>
@@ -1998,7 +1996,7 @@
               <w:noProof/>
             </w:rPr>
           </w:pPr>
-          <w:hyperlink w:anchor="_Toc235380972" w:history="1">
+          <w:hyperlink w:anchor="_Toc235392556" w:history="1">
             <w:r>
               <w:rPr>
                 <w:rStyle w:val="Lienhypertexte"/>
@@ -2025,7 +2023,7 @@
               <w:rPr>
                 <w:noProof/>
               </w:rPr>
-              <w:instrText xml:space="preserve"> PAGEREF _Toc235380972 \h </w:instrText>
+              <w:instrText xml:space="preserve"> PAGEREF _Toc235392556 \h </w:instrText>
             </w:r>
             <w:r>
               <w:rPr>
@@ -2062,7 +2060,7 @@
               <w:noProof/>
             </w:rPr>
           </w:pPr>
-          <w:hyperlink w:anchor="_Toc235380973" w:history="1">
+          <w:hyperlink w:anchor="_Toc235392557" w:history="1">
             <w:r>
               <w:rPr>
                 <w:rStyle w:val="Lienhypertexte"/>
@@ -2089,7 +2087,7 @@
               <w:rPr>
                 <w:noProof/>
               </w:rPr>
-              <w:instrText xml:space="preserve"> PAGEREF _Toc235380973 \h </w:instrText>
+              <w:instrText xml:space="preserve"> PAGEREF _Toc235392557 \h </w:instrText>
             </w:r>
             <w:r>
               <w:rPr>
@@ -2133,7 +2131,7 @@
         <w:pStyle w:val="Titre1"/>
         <w:spacing w:before="300" w:after="140"/>
       </w:pPr>
-      <w:bookmarkStart w:id="1" w:name="_Toc235380944"/>
+      <w:bookmarkStart w:id="1" w:name="_Toc235392528"/>
       <w:r>
         <w:rPr>
           <w:rFonts w:ascii="Cambria" w:eastAsia="Cambria" w:hAnsi="Cambria" w:cs="Cambria"/>
@@ -2154,39 +2152,13 @@
         <w:jc w:val="both"/>
       </w:pPr>
       <w:r>
-        <w:t xml:space="preserve">Ce rapport présente </w:t>
-      </w:r>
-      <w:proofErr w:type="spellStart"/>
-      <w:r>
-        <w:t>VisionAI</w:t>
-      </w:r>
-      <w:proofErr w:type="spellEnd"/>
-      <w:r>
-        <w:t xml:space="preserve">, notre projet annuel de troisième année Big Data. L'objectif imposé était d'implémenter nous-mêmes, sans recourir à une bibliothèque de Machine Learning existante, un ensemble de modèles vus en cours — modèle linéaire, Perceptron </w:t>
-      </w:r>
-      <w:proofErr w:type="spellStart"/>
-      <w:r>
-        <w:t>Multi-Couches</w:t>
-      </w:r>
-      <w:proofErr w:type="spellEnd"/>
-      <w:r>
-        <w:t xml:space="preserve"> (PMC), Radial Basis </w:t>
-      </w:r>
-      <w:proofErr w:type="spellStart"/>
-      <w:r>
-        <w:t>Function</w:t>
-      </w:r>
-      <w:proofErr w:type="spellEnd"/>
-      <w:r>
-        <w:t xml:space="preserve"> Network (RBF) et Support </w:t>
-      </w:r>
-      <w:proofErr w:type="spellStart"/>
-      <w:r>
-        <w:t>Vector</w:t>
-      </w:r>
-      <w:proofErr w:type="spellEnd"/>
-      <w:r>
-        <w:t xml:space="preserve"> Machine (SVM) — puis de les appliquer à une problématique réelle de vision par ordinateur.</w:t>
+        <w:t xml:space="preserve">Ce rapport présente VisionAI, notre projet annuel de troisième année </w:t>
+      </w:r>
+      <w:r>
+        <w:t xml:space="preserve">Intelligence Artificielle &amp; </w:t>
+      </w:r>
+      <w:r>
+        <w:t>Big Data. L'objectif imposé était d'implémenter nous-mêmes, sans recourir à une bibliothèque de Machine Learning existante, un ensemble de modèles vus en cours — modèle linéaire, Perceptron Multi-Couches (PMC), Radial Basis Function Network (RBF) et Support Vector Machine (SVM) — puis de les appliquer à une problématique réelle de vision par ordinateur.</w:t>
       </w:r>
     </w:p>
     <w:p>
@@ -2204,15 +2176,7 @@
         <w:jc w:val="both"/>
       </w:pPr>
       <w:r>
-        <w:t xml:space="preserve">Ce document décrit la démarche scientifique suivie, l'architecture technique, les fondements mathématiques et l'implémentation de chaque modèle, la validation sur les cas de tests, la constitution du </w:t>
-      </w:r>
-      <w:proofErr w:type="spellStart"/>
-      <w:r>
-        <w:t>dataset</w:t>
-      </w:r>
-      <w:proofErr w:type="spellEnd"/>
-      <w:r>
-        <w:t>, puis l'étude comparative des performances. Une part importante est consacrée aux difficultés rencontrées — en particulier une remise à plat complète du projet en cours de route — et aux enseignements que nous en tirons.</w:t>
+        <w:t>Ce document décrit la démarche scientifique suivie, l'architecture technique, les fondements mathématiques et l'implémentation de chaque modèle, la validation sur les cas de tests, la constitution du dataset, puis l'étude comparative des performances. Une part importante est consacrée aux difficultés rencontrées — en particulier une remise à plat complète du projet en cours de route — et aux enseignements que nous en tirons.</w:t>
       </w:r>
     </w:p>
     <w:p>
@@ -2221,15 +2185,7 @@
         <w:jc w:val="both"/>
       </w:pPr>
       <w:r>
-        <w:t xml:space="preserve">Ce rapport est organisé comme suit : après la problématique et les contraintes (section 2), nous décrivons notre démarche (3) et l'architecture technique (4), puis les fondements mathématiques et l'implémentation de chaque modèle (5). Suivent la validation sur les cas de tests (6), la constitution du </w:t>
-      </w:r>
-      <w:proofErr w:type="spellStart"/>
-      <w:r>
-        <w:t>dataset</w:t>
-      </w:r>
-      <w:proofErr w:type="spellEnd"/>
-      <w:r>
-        <w:t xml:space="preserve"> et le protocole (7), les expérimentations et résultats (8), l'analyse critique (9), les difficultés (10), les contributions (11) et la conclusion (12).</w:t>
+        <w:t>Ce rapport est organisé comme suit : après la problématique et les contraintes (section 2), nous décrivons notre démarche (3) et l'architecture technique (4), puis les fondements mathématiques et l'implémentation de chaque modèle (5). Suivent la validation sur les cas de tests (6), la constitution du dataset et le protocole (7), les expérimentations et résultats (8), l'analyse critique (9), les difficultés (10), les contributions (11) et la conclusion (12).</w:t>
       </w:r>
     </w:p>
     <w:p>
@@ -2237,7 +2193,7 @@
         <w:pStyle w:val="Titre1"/>
         <w:spacing w:before="300" w:after="140"/>
       </w:pPr>
-      <w:bookmarkStart w:id="2" w:name="_Toc235380945"/>
+      <w:bookmarkStart w:id="2" w:name="_Toc235392529"/>
       <w:r>
         <w:rPr>
           <w:rFonts w:ascii="Cambria" w:eastAsia="Cambria" w:hAnsi="Cambria" w:cs="Cambria"/>
@@ -2274,7 +2230,7 @@
         <w:pStyle w:val="Titre2"/>
         <w:spacing w:before="220" w:after="100"/>
       </w:pPr>
-      <w:bookmarkStart w:id="3" w:name="_Toc235380946"/>
+      <w:bookmarkStart w:id="3" w:name="_Toc235392530"/>
       <w:r>
         <w:rPr>
           <w:rFonts w:ascii="Cambria" w:eastAsia="Cambria" w:hAnsi="Cambria" w:cs="Cambria"/>
@@ -2324,13 +2280,8 @@
         </w:numPr>
         <w:spacing w:after="90"/>
       </w:pPr>
-      <w:proofErr w:type="spellStart"/>
-      <w:r>
-        <w:t>Dataset</w:t>
-      </w:r>
-      <w:proofErr w:type="spellEnd"/>
-      <w:r>
-        <w:t xml:space="preserve"> constitué par nos soins.</w:t>
+      <w:r>
+        <w:t>Dataset constitué par nos soins.</w:t>
       </w:r>
     </w:p>
     <w:p>
@@ -2364,7 +2315,7 @@
         <w:pStyle w:val="Titre1"/>
         <w:spacing w:before="300" w:after="140"/>
       </w:pPr>
-      <w:bookmarkStart w:id="4" w:name="_Toc235380947"/>
+      <w:bookmarkStart w:id="4" w:name="_Toc235392531"/>
       <w:r>
         <w:rPr>
           <w:rFonts w:ascii="Cambria" w:eastAsia="Cambria" w:hAnsi="Cambria" w:cs="Cambria"/>
@@ -2384,23 +2335,7 @@
         <w:jc w:val="both"/>
       </w:pPr>
       <w:r>
-        <w:t xml:space="preserve">Nous avons suivi une démarche en cinq temps, volontairement progressive. D'abord implémenter chaque modèle </w:t>
-      </w:r>
-      <w:proofErr w:type="spellStart"/>
-      <w:r>
-        <w:t>from</w:t>
-      </w:r>
-      <w:proofErr w:type="spellEnd"/>
-      <w:r>
-        <w:t xml:space="preserve"> scratch en Rust. Ensuite valider ces implémentations sur les jeux de tests classiques du cours (données linéairement séparables, XOR, croix, problèmes à trois classes, régression), où le comportement attendu est connu théoriquement. Puis constituer le </w:t>
-      </w:r>
-      <w:proofErr w:type="spellStart"/>
-      <w:r>
-        <w:t>dataset</w:t>
-      </w:r>
-      <w:proofErr w:type="spellEnd"/>
-      <w:r>
-        <w:t>. Ensuite expérimenter : régler les hyperparamètres, tracer les courbes, comparer. Enfin analyser et critiquer.</w:t>
+        <w:t>Nous avons suivi une démarche en cinq temps, volontairement progressive. D'abord implémenter chaque modèle from scratch en Rust. Ensuite valider ces implémentations sur les jeux de tests classiques du cours (données linéairement séparables, XOR, croix, problèmes à trois classes, régression), où le comportement attendu est connu théoriquement. Puis constituer le dataset. Ensuite expérimenter : régler les hyperparamètres, tracer les courbes, comparer. Enfin analyser et critiquer.</w:t>
       </w:r>
     </w:p>
     <w:p>
@@ -2417,7 +2352,7 @@
         <w:pStyle w:val="Titre1"/>
         <w:spacing w:before="300" w:after="140"/>
       </w:pPr>
-      <w:bookmarkStart w:id="5" w:name="_Toc235380948"/>
+      <w:bookmarkStart w:id="5" w:name="_Toc235392532"/>
       <w:r>
         <w:rPr>
           <w:rFonts w:ascii="Cambria" w:eastAsia="Cambria" w:hAnsi="Cambria" w:cs="Cambria"/>
@@ -2437,39 +2372,7 @@
         <w:jc w:val="both"/>
       </w:pPr>
       <w:r>
-        <w:t>L'architecture s'organise en quatre couches. La bibliothèque de modèles est écrite en Rust et compilée en bibliothèque dynamique (</w:t>
-      </w:r>
-      <w:proofErr w:type="spellStart"/>
-      <w:r>
-        <w:t>crate</w:t>
-      </w:r>
-      <w:proofErr w:type="spellEnd"/>
-      <w:r>
-        <w:t xml:space="preserve">-type </w:t>
-      </w:r>
-      <w:proofErr w:type="spellStart"/>
-      <w:r>
-        <w:t>cdylib</w:t>
-      </w:r>
-      <w:proofErr w:type="spellEnd"/>
-      <w:r>
-        <w:t>, produisant un .dll sous Windows). Les fonctions sont exposées avec la convention d'appel C (</w:t>
-      </w:r>
-      <w:proofErr w:type="spellStart"/>
-      <w:r>
-        <w:t>extern</w:t>
-      </w:r>
-      <w:proofErr w:type="spellEnd"/>
-      <w:r>
-        <w:t xml:space="preserve"> C, </w:t>
-      </w:r>
-      <w:proofErr w:type="spellStart"/>
-      <w:r>
-        <w:t>no_mangle</w:t>
-      </w:r>
-      <w:proofErr w:type="spellEnd"/>
-      <w:r>
-        <w:t>) pour être appelables depuis l'extérieur.</w:t>
+        <w:t>L'architecture s'organise en quatre couches. La bibliothèque de modèles est écrite en Rust et compilée en bibliothèque dynamique (crate-type cdylib, produisant un .dll sous Windows). Les fonctions sont exposées avec la convention d'appel C (extern C, no_mangle) pour être appelables depuis l'extérieur.</w:t>
       </w:r>
     </w:p>
     <w:p>
@@ -2478,23 +2381,7 @@
         <w:jc w:val="both"/>
       </w:pPr>
       <w:r>
-        <w:t xml:space="preserve">Le pont entre Rust et Python est assuré par </w:t>
-      </w:r>
-      <w:proofErr w:type="spellStart"/>
-      <w:r>
-        <w:t>ctypes</w:t>
-      </w:r>
-      <w:proofErr w:type="spellEnd"/>
-      <w:r>
-        <w:t xml:space="preserve"> : côté Python, un module charge la bibliothèque, déclare la signature de chaque fonction (types des arguments et du retour), puis transmet les données sous forme de pointeurs et de longueurs. Le modèle vit côté Rust ; Python n'en conserve qu'une poignée (un pointeur) repassée à chaque appel. Ce choix de </w:t>
-      </w:r>
-      <w:proofErr w:type="spellStart"/>
-      <w:r>
-        <w:t>ctypes</w:t>
-      </w:r>
-      <w:proofErr w:type="spellEnd"/>
-      <w:r>
-        <w:t>, plutôt que PyO3, a été fait pour la simplicité d'explication : aucune magie de macros à défendre en soutenance, seulement des fonctions C et des conversions de tableaux explicites.</w:t>
+        <w:t>Le pont entre Rust et Python est assuré par ctypes : côté Python, un module charge la bibliothèque, déclare la signature de chaque fonction (types des arguments et du retour), puis transmet les données sous forme de pointeurs et de longueurs. Le modèle vit côté Rust ; Python n'en conserve qu'une poignée (un pointeur) repassée à chaque appel. Ce choix de ctypes, plutôt que PyO3, a été fait pour la simplicité d'explication : aucune magie de macros à défendre en soutenance, seulement des fonctions C et des conversions de tableaux explicites.</w:t>
       </w:r>
     </w:p>
     <w:p>
@@ -2503,39 +2390,7 @@
         <w:jc w:val="both"/>
       </w:pPr>
       <w:r>
-        <w:t>Au-dessus, une API en Python (</w:t>
-      </w:r>
-      <w:proofErr w:type="spellStart"/>
-      <w:r>
-        <w:t>FastAPI</w:t>
-      </w:r>
-      <w:proofErr w:type="spellEnd"/>
-      <w:r>
-        <w:t>) charge les modèles entraînés — sauvegardés au format JSON — et expose des routes /</w:t>
-      </w:r>
-      <w:proofErr w:type="spellStart"/>
-      <w:r>
-        <w:t>predict</w:t>
-      </w:r>
-      <w:proofErr w:type="spellEnd"/>
-      <w:r>
-        <w:t xml:space="preserve"> et /</w:t>
-      </w:r>
-      <w:proofErr w:type="spellStart"/>
-      <w:r>
-        <w:t>models</w:t>
-      </w:r>
-      <w:proofErr w:type="spellEnd"/>
-      <w:r>
-        <w:t xml:space="preserve">. Elle reçoit une image du client, la transforme en vecteur via le même prétraitement que le </w:t>
-      </w:r>
-      <w:proofErr w:type="spellStart"/>
-      <w:r>
-        <w:t>dataset</w:t>
-      </w:r>
-      <w:proofErr w:type="spellEnd"/>
-      <w:r>
-        <w:t xml:space="preserve">, interroge le modèle choisi et renvoie la classe prédite. Enfin, un client </w:t>
+        <w:t xml:space="preserve">Au-dessus, une API en Python (FastAPI) charge les modèles entraînés — sauvegardés au format JSON — et expose des routes /predict et /models. Elle reçoit une image du client, la transforme en vecteur via le même prétraitement que le dataset, interroge le modèle choisi et renvoie la classe prédite. Enfin, un client </w:t>
       </w:r>
       <w:r>
         <w:lastRenderedPageBreak/>
@@ -2547,7 +2402,7 @@
         <w:pStyle w:val="Titre2"/>
         <w:spacing w:before="220" w:after="100"/>
       </w:pPr>
-      <w:bookmarkStart w:id="6" w:name="_Toc235380949"/>
+      <w:bookmarkStart w:id="6" w:name="_Toc235392533"/>
       <w:r>
         <w:rPr>
           <w:rFonts w:ascii="Cambria" w:eastAsia="Cambria" w:hAnsi="Cambria" w:cs="Cambria"/>
@@ -2567,31 +2422,7 @@
         <w:jc w:val="both"/>
       </w:pPr>
       <w:r>
-        <w:t xml:space="preserve">Concrètement, la bibliothèque Rust expose pour chaque modèle un petit ensemble de fonctions : </w:t>
-      </w:r>
-      <w:proofErr w:type="spellStart"/>
-      <w:r>
-        <w:t>create</w:t>
-      </w:r>
-      <w:proofErr w:type="spellEnd"/>
-      <w:r>
-        <w:t xml:space="preserve"> (crée le modèle et renvoie un pointeur), train (entraîne à partir des données), </w:t>
-      </w:r>
-      <w:proofErr w:type="spellStart"/>
-      <w:r>
-        <w:t>predict</w:t>
-      </w:r>
-      <w:proofErr w:type="spellEnd"/>
-      <w:r>
-        <w:t xml:space="preserve"> (renvoie la classe) et destroy (libère la mémoire). Côté Python, </w:t>
-      </w:r>
-      <w:proofErr w:type="spellStart"/>
-      <w:r>
-        <w:t>ctypes</w:t>
-      </w:r>
-      <w:proofErr w:type="spellEnd"/>
-      <w:r>
-        <w:t xml:space="preserve"> déclare pour chacune les types d'arguments et de retour ; les tableaux de données sont transmis sous forme de pointeurs accompagnés de leur longueur, que Rust reconstruit en tranches. Ce découplage garde l'algorithme séparé de la tuyauterie d'échange de données, ce qui facilite la relecture et la défense du code.</w:t>
+        <w:t>Concrètement, la bibliothèque Rust expose pour chaque modèle un petit ensemble de fonctions : create (crée le modèle et renvoie un pointeur), train (entraîne à partir des données), predict (renvoie la classe) et destroy (libère la mémoire). Côté Python, ctypes déclare pour chacune les types d'arguments et de retour ; les tableaux de données sont transmis sous forme de pointeurs accompagnés de leur longueur, que Rust reconstruit en tranches. Ce découplage garde l'algorithme séparé de la tuyauterie d'échange de données, ce qui facilite la relecture et la défense du code.</w:t>
       </w:r>
     </w:p>
     <w:p>
@@ -2599,7 +2430,7 @@
         <w:pStyle w:val="Titre2"/>
         <w:spacing w:before="220" w:after="100"/>
       </w:pPr>
-      <w:bookmarkStart w:id="7" w:name="_Toc235380950"/>
+      <w:bookmarkStart w:id="7" w:name="_Toc235392534"/>
       <w:r>
         <w:rPr>
           <w:rFonts w:ascii="Cambria" w:eastAsia="Cambria" w:hAnsi="Cambria" w:cs="Cambria"/>
@@ -2619,63 +2450,7 @@
         <w:jc w:val="both"/>
       </w:pPr>
       <w:r>
-        <w:t xml:space="preserve">Les modèles entraînés sont sérialisés sur disque dans deux formats : un format JSON, lisible et pratique pour l'inspection, et un format binaire (via </w:t>
-      </w:r>
-      <w:proofErr w:type="spellStart"/>
-      <w:r>
-        <w:t>save_binary</w:t>
-      </w:r>
-      <w:proofErr w:type="spellEnd"/>
-      <w:r>
-        <w:t>), plus compact et robuste. Le format par défaut est le JSON, mais il est modifiable dans server.py, le binaire constituant une option « bonus ». À noter que la structure de sauvegarde du RBF a été unifiée en un seul fichier, là où une version antérieure l'éclatait en trois fichiers (un par classifieur un-contre-tous). Au démarrage, l'API charge automatiquement les modèles disponibles ; une route dédiée permet de les recharger sans redémarrer le serveur. Au total, l'API expose quatre routes : /</w:t>
-      </w:r>
-      <w:proofErr w:type="spellStart"/>
-      <w:r>
-        <w:t>health</w:t>
-      </w:r>
-      <w:proofErr w:type="spellEnd"/>
-      <w:r>
-        <w:t>, /</w:t>
-      </w:r>
-      <w:proofErr w:type="spellStart"/>
-      <w:r>
-        <w:t>models</w:t>
-      </w:r>
-      <w:proofErr w:type="spellEnd"/>
-      <w:r>
-        <w:t>, /</w:t>
-      </w:r>
-      <w:proofErr w:type="spellStart"/>
-      <w:r>
-        <w:t>reload-models</w:t>
-      </w:r>
-      <w:proofErr w:type="spellEnd"/>
-      <w:r>
-        <w:t xml:space="preserve"> et /</w:t>
-      </w:r>
-      <w:proofErr w:type="spellStart"/>
-      <w:r>
-        <w:t>predict</w:t>
-      </w:r>
-      <w:proofErr w:type="spellEnd"/>
-      <w:r>
-        <w:t xml:space="preserve">. La route de prédiction reçoit l'image en </w:t>
-      </w:r>
-      <w:proofErr w:type="spellStart"/>
-      <w:r>
-        <w:t>multipart</w:t>
-      </w:r>
-      <w:proofErr w:type="spellEnd"/>
-      <w:r>
-        <w:t xml:space="preserve">, applique le prétraitement identique à celui du </w:t>
-      </w:r>
-      <w:proofErr w:type="spellStart"/>
-      <w:r>
-        <w:t>dataset</w:t>
-      </w:r>
-      <w:proofErr w:type="spellEnd"/>
-      <w:r>
-        <w:t xml:space="preserve"> (redimensionnement, normalisation, aplatissement), interroge le modèle sélectionné et renvoie la classe ainsi que les scores par classe.</w:t>
+        <w:t>Les modèles entraînés sont sérialisés sur disque dans deux formats : un format JSON, lisible et pratique pour l'inspection, et un format binaire (via save_binary), plus compact et robuste. Le format par défaut est le JSON, mais il est modifiable dans server.py, le binaire constituant une option « bonus ». À noter que la structure de sauvegarde du RBF a été unifiée en un seul fichier, là où une version antérieure l'éclatait en trois fichiers (un par classifieur un-contre-tous). Au démarrage, l'API charge automatiquement les modèles disponibles ; une route dédiée permet de les recharger sans redémarrer le serveur. Au total, l'API expose quatre routes : /health, /models, /reload-models et /predict. La route de prédiction reçoit l'image en multipart, applique le prétraitement identique à celui du dataset (redimensionnement, normalisation, aplatissement), interroge le modèle sélectionné et renvoie la classe ainsi que les scores par classe.</w:t>
       </w:r>
     </w:p>
     <w:p>
@@ -2683,7 +2458,7 @@
         <w:pStyle w:val="Titre1"/>
         <w:spacing w:before="300" w:after="140"/>
       </w:pPr>
-      <w:bookmarkStart w:id="8" w:name="_Toc235380951"/>
+      <w:bookmarkStart w:id="8" w:name="_Toc235392535"/>
       <w:r>
         <w:rPr>
           <w:rFonts w:ascii="Cambria" w:eastAsia="Cambria" w:hAnsi="Cambria" w:cs="Cambria"/>
@@ -2703,15 +2478,7 @@
         <w:jc w:val="both"/>
       </w:pPr>
       <w:r>
-        <w:t xml:space="preserve">Cette section décrit, pour chaque modèle, le principe mathématique et sa traduction en code. Comprendre finement ces fondements a été déterminant : c'est ce qui a permis de garantir que le code implémenté traduisait bien le comportement attendu, d'abord sur les tests du cours puis sur notre </w:t>
-      </w:r>
-      <w:proofErr w:type="spellStart"/>
-      <w:r>
-        <w:t>dataset</w:t>
-      </w:r>
-      <w:proofErr w:type="spellEnd"/>
-      <w:r>
-        <w:t>.</w:t>
+        <w:t>Cette section décrit, pour chaque modèle, le principe mathématique et sa traduction en code. Comprendre finement ces fondements a été déterminant : c'est ce qui a permis de garantir que le code implémenté traduisait bien le comportement attendu, d'abord sur les tests du cours puis sur notre dataset.</w:t>
       </w:r>
     </w:p>
     <w:p>
@@ -2719,7 +2486,7 @@
         <w:pStyle w:val="Titre2"/>
         <w:spacing w:before="220" w:after="100"/>
       </w:pPr>
-      <w:bookmarkStart w:id="9" w:name="_Toc235380952"/>
+      <w:bookmarkStart w:id="9" w:name="_Toc235392536"/>
       <w:r>
         <w:rPr>
           <w:rFonts w:ascii="Cambria" w:eastAsia="Cambria" w:hAnsi="Cambria" w:cs="Cambria"/>
@@ -2739,15 +2506,7 @@
         <w:jc w:val="both"/>
       </w:pPr>
       <w:r>
-        <w:t xml:space="preserve">Le modèle linéaire cherche un hyperplan séparateur défini par un vecteur de poids w et un biais b. La prédiction est le signe de </w:t>
-      </w:r>
-      <w:proofErr w:type="spellStart"/>
-      <w:r>
-        <w:t>w·x</w:t>
-      </w:r>
-      <w:proofErr w:type="spellEnd"/>
-      <w:r>
-        <w:t xml:space="preserve"> + b. L'apprentissage suit la règle du perceptron de Rosenblatt : pour chaque exemple, on calcule l'erreur (différence entre classe attendue et prédite) et on corrige les poids proportionnellement à cette erreur et à l'entrée, avec un pas d'apprentissage. Le biais est traité comme un poids relié à une entrée fictive égale à 1, ce qui évite à la frontière d'être contrainte de passer par l'origine. Ce modèle ne peut séparer que des données linéairement séparables : c'est sa limite fondamentale.</w:t>
+        <w:t>Le modèle linéaire cherche un hyperplan séparateur défini par un vecteur de poids w et un biais b. La prédiction est le signe de w·x + b. L'apprentissage suit la règle du perceptron de Rosenblatt : pour chaque exemple, on calcule l'erreur (différence entre classe attendue et prédite) et on corrige les poids proportionnellement à cette erreur et à l'entrée, avec un pas d'apprentissage. Le biais est traité comme un poids relié à une entrée fictive égale à 1, ce qui évite à la frontière d'être contrainte de passer par l'origine. Ce modèle ne peut séparer que des données linéairement séparables : c'est sa limite fondamentale.</w:t>
       </w:r>
     </w:p>
     <w:p>
@@ -2755,7 +2514,6 @@
         <w:shd w:val="clear" w:color="auto" w:fill="EDEFF2"/>
         <w:spacing w:before="60"/>
       </w:pPr>
-      <w:proofErr w:type="gramStart"/>
       <w:r>
         <w:rPr>
           <w:rFonts w:ascii="Consolas" w:eastAsia="Consolas" w:hAnsi="Consolas" w:cs="Consolas"/>
@@ -2763,219 +2521,60 @@
           <w:szCs w:val="19"/>
         </w:rPr>
         <w:lastRenderedPageBreak/>
-        <w:t>w</w:t>
-      </w:r>
-      <w:proofErr w:type="gramEnd"/>
+        <w:t>w &lt;- poids aleatoires (biais inclus)</w:t>
+      </w:r>
+    </w:p>
+    <w:p>
+      <w:pPr>
+        <w:shd w:val="clear" w:color="auto" w:fill="EDEFF2"/>
+      </w:pPr>
       <w:r>
         <w:rPr>
           <w:rFonts w:ascii="Consolas" w:eastAsia="Consolas" w:hAnsi="Consolas" w:cs="Consolas"/>
           <w:sz w:val="19"/>
           <w:szCs w:val="19"/>
         </w:rPr>
-        <w:t xml:space="preserve"> &lt;- poids </w:t>
-      </w:r>
-      <w:proofErr w:type="spellStart"/>
+        <w:t>predire(x) = signe( w . x + b )</w:t>
+      </w:r>
+    </w:p>
+    <w:p>
+      <w:pPr>
+        <w:shd w:val="clear" w:color="auto" w:fill="EDEFF2"/>
+      </w:pPr>
       <w:r>
         <w:rPr>
           <w:rFonts w:ascii="Consolas" w:eastAsia="Consolas" w:hAnsi="Consolas" w:cs="Consolas"/>
           <w:sz w:val="19"/>
           <w:szCs w:val="19"/>
         </w:rPr>
-        <w:t>aleatoires</w:t>
-      </w:r>
-      <w:proofErr w:type="spellEnd"/>
+        <w:t>pour chaque (x, y) :</w:t>
+      </w:r>
+    </w:p>
+    <w:p>
+      <w:pPr>
+        <w:shd w:val="clear" w:color="auto" w:fill="EDEFF2"/>
+      </w:pPr>
       <w:r>
         <w:rPr>
           <w:rFonts w:ascii="Consolas" w:eastAsia="Consolas" w:hAnsi="Consolas" w:cs="Consolas"/>
           <w:sz w:val="19"/>
           <w:szCs w:val="19"/>
         </w:rPr>
-        <w:t xml:space="preserve"> (biais inclus)</w:t>
+        <w:t xml:space="preserve">    erreur = y - prediction</w:t>
       </w:r>
     </w:p>
     <w:p>
       <w:pPr>
         <w:shd w:val="clear" w:color="auto" w:fill="EDEFF2"/>
-      </w:pPr>
-      <w:proofErr w:type="spellStart"/>
-      <w:proofErr w:type="gramStart"/>
+        <w:spacing w:after="170"/>
+      </w:pPr>
       <w:r>
         <w:rPr>
           <w:rFonts w:ascii="Consolas" w:eastAsia="Consolas" w:hAnsi="Consolas" w:cs="Consolas"/>
           <w:sz w:val="19"/>
           <w:szCs w:val="19"/>
         </w:rPr>
-        <w:t>predire</w:t>
-      </w:r>
-      <w:proofErr w:type="spellEnd"/>
-      <w:proofErr w:type="gramEnd"/>
-      <w:r>
-        <w:rPr>
-          <w:rFonts w:ascii="Consolas" w:eastAsia="Consolas" w:hAnsi="Consolas" w:cs="Consolas"/>
-          <w:sz w:val="19"/>
-          <w:szCs w:val="19"/>
-        </w:rPr>
-        <w:t xml:space="preserve">(x) = </w:t>
-      </w:r>
-      <w:proofErr w:type="gramStart"/>
-      <w:r>
-        <w:rPr>
-          <w:rFonts w:ascii="Consolas" w:eastAsia="Consolas" w:hAnsi="Consolas" w:cs="Consolas"/>
-          <w:sz w:val="19"/>
-          <w:szCs w:val="19"/>
-        </w:rPr>
-        <w:t>signe( w</w:t>
-      </w:r>
-      <w:proofErr w:type="gramEnd"/>
-      <w:r>
-        <w:rPr>
-          <w:rFonts w:ascii="Consolas" w:eastAsia="Consolas" w:hAnsi="Consolas" w:cs="Consolas"/>
-          <w:sz w:val="19"/>
-          <w:szCs w:val="19"/>
-        </w:rPr>
-        <w:t xml:space="preserve"> . </w:t>
-      </w:r>
-      <w:proofErr w:type="gramStart"/>
-      <w:r>
-        <w:rPr>
-          <w:rFonts w:ascii="Consolas" w:eastAsia="Consolas" w:hAnsi="Consolas" w:cs="Consolas"/>
-          <w:sz w:val="19"/>
-          <w:szCs w:val="19"/>
-        </w:rPr>
-        <w:t>x</w:t>
-      </w:r>
-      <w:proofErr w:type="gramEnd"/>
-      <w:r>
-        <w:rPr>
-          <w:rFonts w:ascii="Consolas" w:eastAsia="Consolas" w:hAnsi="Consolas" w:cs="Consolas"/>
-          <w:sz w:val="19"/>
-          <w:szCs w:val="19"/>
-        </w:rPr>
-        <w:t xml:space="preserve"> + </w:t>
-      </w:r>
-      <w:proofErr w:type="gramStart"/>
-      <w:r>
-        <w:rPr>
-          <w:rFonts w:ascii="Consolas" w:eastAsia="Consolas" w:hAnsi="Consolas" w:cs="Consolas"/>
-          <w:sz w:val="19"/>
-          <w:szCs w:val="19"/>
-        </w:rPr>
-        <w:t>b )</w:t>
-      </w:r>
-      <w:proofErr w:type="gramEnd"/>
-    </w:p>
-    <w:p>
-      <w:pPr>
-        <w:shd w:val="clear" w:color="auto" w:fill="EDEFF2"/>
-      </w:pPr>
-      <w:proofErr w:type="gramStart"/>
-      <w:r>
-        <w:rPr>
-          <w:rFonts w:ascii="Consolas" w:eastAsia="Consolas" w:hAnsi="Consolas" w:cs="Consolas"/>
-          <w:sz w:val="19"/>
-          <w:szCs w:val="19"/>
-        </w:rPr>
-        <w:t>pour</w:t>
-      </w:r>
-      <w:proofErr w:type="gramEnd"/>
-      <w:r>
-        <w:rPr>
-          <w:rFonts w:ascii="Consolas" w:eastAsia="Consolas" w:hAnsi="Consolas" w:cs="Consolas"/>
-          <w:sz w:val="19"/>
-          <w:szCs w:val="19"/>
-        </w:rPr>
-        <w:t xml:space="preserve"> chaque (x, y) :</w:t>
-      </w:r>
-    </w:p>
-    <w:p>
-      <w:pPr>
-        <w:shd w:val="clear" w:color="auto" w:fill="EDEFF2"/>
-      </w:pPr>
-      <w:r>
-        <w:rPr>
-          <w:rFonts w:ascii="Consolas" w:eastAsia="Consolas" w:hAnsi="Consolas" w:cs="Consolas"/>
-          <w:sz w:val="19"/>
-          <w:szCs w:val="19"/>
-        </w:rPr>
-        <w:t xml:space="preserve">    </w:t>
-      </w:r>
-      <w:proofErr w:type="gramStart"/>
-      <w:r>
-        <w:rPr>
-          <w:rFonts w:ascii="Consolas" w:eastAsia="Consolas" w:hAnsi="Consolas" w:cs="Consolas"/>
-          <w:sz w:val="19"/>
-          <w:szCs w:val="19"/>
-        </w:rPr>
-        <w:t>erreur</w:t>
-      </w:r>
-      <w:proofErr w:type="gramEnd"/>
-      <w:r>
-        <w:rPr>
-          <w:rFonts w:ascii="Consolas" w:eastAsia="Consolas" w:hAnsi="Consolas" w:cs="Consolas"/>
-          <w:sz w:val="19"/>
-          <w:szCs w:val="19"/>
-        </w:rPr>
-        <w:t xml:space="preserve"> = y - </w:t>
-      </w:r>
-      <w:proofErr w:type="spellStart"/>
-      <w:r>
-        <w:rPr>
-          <w:rFonts w:ascii="Consolas" w:eastAsia="Consolas" w:hAnsi="Consolas" w:cs="Consolas"/>
-          <w:sz w:val="19"/>
-          <w:szCs w:val="19"/>
-        </w:rPr>
-        <w:t>prediction</w:t>
-      </w:r>
-      <w:proofErr w:type="spellEnd"/>
-    </w:p>
-    <w:p>
-      <w:pPr>
-        <w:shd w:val="clear" w:color="auto" w:fill="EDEFF2"/>
-        <w:spacing w:after="170"/>
-      </w:pPr>
-      <w:r>
-        <w:rPr>
-          <w:rFonts w:ascii="Consolas" w:eastAsia="Consolas" w:hAnsi="Consolas" w:cs="Consolas"/>
-          <w:sz w:val="19"/>
-          <w:szCs w:val="19"/>
-        </w:rPr>
-        <w:t xml:space="preserve">    </w:t>
-      </w:r>
-      <w:proofErr w:type="gramStart"/>
-      <w:r>
-        <w:rPr>
-          <w:rFonts w:ascii="Consolas" w:eastAsia="Consolas" w:hAnsi="Consolas" w:cs="Consolas"/>
-          <w:sz w:val="19"/>
-          <w:szCs w:val="19"/>
-        </w:rPr>
-        <w:t>w</w:t>
-      </w:r>
-      <w:proofErr w:type="gramEnd"/>
-      <w:r>
-        <w:rPr>
-          <w:rFonts w:ascii="Consolas" w:eastAsia="Consolas" w:hAnsi="Consolas" w:cs="Consolas"/>
-          <w:sz w:val="19"/>
-          <w:szCs w:val="19"/>
-        </w:rPr>
-        <w:t xml:space="preserve"> &lt;- w + </w:t>
-      </w:r>
-      <w:proofErr w:type="spellStart"/>
-      <w:r>
-        <w:rPr>
-          <w:rFonts w:ascii="Consolas" w:eastAsia="Consolas" w:hAnsi="Consolas" w:cs="Consolas"/>
-          <w:sz w:val="19"/>
-          <w:szCs w:val="19"/>
-        </w:rPr>
-        <w:t>lr</w:t>
-      </w:r>
-      <w:proofErr w:type="spellEnd"/>
-      <w:r>
-        <w:rPr>
-          <w:rFonts w:ascii="Consolas" w:eastAsia="Consolas" w:hAnsi="Consolas" w:cs="Consolas"/>
-          <w:sz w:val="19"/>
-          <w:szCs w:val="19"/>
-        </w:rPr>
-        <w:t xml:space="preserve"> * erreur * x</w:t>
+        <w:t xml:space="preserve">    w &lt;- w + lr * erreur * x</w:t>
       </w:r>
     </w:p>
     <w:p>
@@ -2983,7 +2582,7 @@
         <w:pStyle w:val="Titre2"/>
         <w:spacing w:before="220" w:after="100"/>
       </w:pPr>
-      <w:bookmarkStart w:id="10" w:name="_Toc235380953"/>
+      <w:bookmarkStart w:id="10" w:name="_Toc235392537"/>
       <w:r>
         <w:rPr>
           <w:rFonts w:ascii="Cambria" w:eastAsia="Cambria" w:hAnsi="Cambria" w:cs="Cambria"/>
@@ -2993,9 +2592,92 @@
           <w:sz w:val="25"/>
           <w:szCs w:val="25"/>
         </w:rPr>
-        <w:t xml:space="preserve">5.2 Perceptron </w:t>
-      </w:r>
-      <w:proofErr w:type="spellStart"/>
+        <w:t>5.2 Perceptron Multi-Couches (PMC / MLP)</w:t>
+      </w:r>
+      <w:bookmarkEnd w:id="10"/>
+    </w:p>
+    <w:p>
+      <w:pPr>
+        <w:spacing w:after="200" w:line="320" w:lineRule="auto"/>
+        <w:jc w:val="both"/>
+      </w:pPr>
+      <w:r>
+        <w:t>Le PMC empile des couches de neurones. La propagation avant calcule, couche par couche, la somme pondérée des entrées suivie d'une activation non linéaire. C'est cette non-linéarité qui permet de plier la frontière et de traiter des problèmes non linéairement séparables comme le XOR. L'apprentissage se fait par rétropropagation du gradient : on calcule l'erreur en sortie, puis on la propage de la sortie vers l'entrée pour ajuster tous les poids. Conformément au NaiveMLP du cours, la fonction de coût est l'erreur quadratique moyenne (MSE) ; le signal d'erreur en sortie est (prédit − attendu) multiplié par la dérivée de l'activation de sortie. Pour la classification à trois classes, nous utilisons trois neurones de sortie en one-hot et prenons l'argmax.</w:t>
+      </w:r>
+    </w:p>
+    <w:p>
+      <w:pPr>
+        <w:shd w:val="clear" w:color="auto" w:fill="EDEFF2"/>
+        <w:spacing w:before="60"/>
+      </w:pPr>
+      <w:r>
+        <w:rPr>
+          <w:rFonts w:ascii="Consolas" w:eastAsia="Consolas" w:hAnsi="Consolas" w:cs="Consolas"/>
+          <w:sz w:val="19"/>
+          <w:szCs w:val="19"/>
+        </w:rPr>
+        <w:t>FORWARD : sortie = activation( somme( poids * entrees ) )  [couche par couche]</w:t>
+      </w:r>
+    </w:p>
+    <w:p>
+      <w:pPr>
+        <w:shd w:val="clear" w:color="auto" w:fill="EDEFF2"/>
+      </w:pPr>
+      <w:r>
+        <w:rPr>
+          <w:rFonts w:ascii="Consolas" w:eastAsia="Consolas" w:hAnsi="Consolas" w:cs="Consolas"/>
+          <w:sz w:val="19"/>
+          <w:szCs w:val="19"/>
+        </w:rPr>
+        <w:t>BACKPROP (par exemple) :</w:t>
+      </w:r>
+    </w:p>
+    <w:p>
+      <w:pPr>
+        <w:shd w:val="clear" w:color="auto" w:fill="EDEFF2"/>
+      </w:pPr>
+      <w:r>
+        <w:rPr>
+          <w:rFonts w:ascii="Consolas" w:eastAsia="Consolas" w:hAnsi="Consolas" w:cs="Consolas"/>
+          <w:sz w:val="19"/>
+          <w:szCs w:val="19"/>
+        </w:rPr>
+        <w:t xml:space="preserve">    err_sortie = (predit - attendu) * activation'</w:t>
+      </w:r>
+    </w:p>
+    <w:p>
+      <w:pPr>
+        <w:shd w:val="clear" w:color="auto" w:fill="EDEFF2"/>
+      </w:pPr>
+      <w:r>
+        <w:rPr>
+          <w:rFonts w:ascii="Consolas" w:eastAsia="Consolas" w:hAnsi="Consolas" w:cs="Consolas"/>
+          <w:sz w:val="19"/>
+          <w:szCs w:val="19"/>
+        </w:rPr>
+        <w:t xml:space="preserve">    propager l'erreur de la sortie vers l'entree</w:t>
+      </w:r>
+    </w:p>
+    <w:p>
+      <w:pPr>
+        <w:shd w:val="clear" w:color="auto" w:fill="EDEFF2"/>
+        <w:spacing w:after="170"/>
+      </w:pPr>
+      <w:r>
+        <w:rPr>
+          <w:rFonts w:ascii="Consolas" w:eastAsia="Consolas" w:hAnsi="Consolas" w:cs="Consolas"/>
+          <w:sz w:val="19"/>
+          <w:szCs w:val="19"/>
+        </w:rPr>
+        <w:t xml:space="preserve">    w &lt;- w - lr * entree * delta</w:t>
+      </w:r>
+    </w:p>
+    <w:p>
+      <w:pPr>
+        <w:pStyle w:val="Titre2"/>
+        <w:spacing w:before="220" w:after="100"/>
+      </w:pPr>
+      <w:bookmarkStart w:id="11" w:name="_Toc235392538"/>
       <w:r>
         <w:rPr>
           <w:rFonts w:ascii="Cambria" w:eastAsia="Cambria" w:hAnsi="Cambria" w:cs="Cambria"/>
@@ -3005,21 +2687,9 @@
           <w:sz w:val="25"/>
           <w:szCs w:val="25"/>
         </w:rPr>
-        <w:t>Multi-Couches</w:t>
-      </w:r>
-      <w:proofErr w:type="spellEnd"/>
-      <w:r>
-        <w:rPr>
-          <w:rFonts w:ascii="Cambria" w:eastAsia="Cambria" w:hAnsi="Cambria" w:cs="Cambria"/>
-          <w:b/>
-          <w:bCs/>
-          <w:color w:val="1E2761"/>
-          <w:sz w:val="25"/>
-          <w:szCs w:val="25"/>
-        </w:rPr>
-        <w:t xml:space="preserve"> (PMC / MLP)</w:t>
-      </w:r>
-      <w:bookmarkEnd w:id="10"/>
+        <w:t>5.3 Support Vector Machine (SVM)</w:t>
+      </w:r>
+      <w:bookmarkEnd w:id="11"/>
     </w:p>
     <w:p>
       <w:pPr>
@@ -3027,31 +2697,7 @@
         <w:jc w:val="both"/>
       </w:pPr>
       <w:r>
-        <w:t xml:space="preserve">Le PMC empile des couches de neurones. La propagation avant calcule, couche par couche, la somme pondérée des entrées suivie d'une activation non linéaire. C'est cette non-linéarité qui permet de plier la frontière et de traiter des problèmes non linéairement séparables comme le XOR. L'apprentissage se fait par rétropropagation du gradient : on calcule l'erreur en sortie, puis on la propage de la sortie vers l'entrée pour ajuster tous les poids. Conformément au </w:t>
-      </w:r>
-      <w:proofErr w:type="spellStart"/>
-      <w:r>
-        <w:t>NaiveMLP</w:t>
-      </w:r>
-      <w:proofErr w:type="spellEnd"/>
-      <w:r>
-        <w:t xml:space="preserve"> du cours, la fonction de coût est l'erreur quadratique moyenne (MSE) ; le signal d'erreur en sortie est (prédit − attendu) multiplié par la dérivée de l'activation de sortie. Pour la classification à trois classes, nous utilisons trois neurones de sortie en </w:t>
-      </w:r>
-      <w:proofErr w:type="spellStart"/>
-      <w:r>
-        <w:t>one-hot</w:t>
-      </w:r>
-      <w:proofErr w:type="spellEnd"/>
-      <w:r>
-        <w:t xml:space="preserve"> et prenons l'</w:t>
-      </w:r>
-      <w:proofErr w:type="spellStart"/>
-      <w:r>
-        <w:t>argmax</w:t>
-      </w:r>
-      <w:proofErr w:type="spellEnd"/>
-      <w:r>
-        <w:t>.</w:t>
+        <w:t>Le SVM cherche la frontière à marge maximale, celle qui laisse le plus grand couloir vide entre les classes, ce qui favorise la généralisation. Nous avons implémenté la formulation duale du cours, exprimée en multiplicateurs de Lagrange alpha (un par exemple). La décision est une somme pondérée de noyaux entre le point à classer et les exemples d'entraînement. Le sujet interdisant tout solveur externe, nous résolvons le dual par montée de gradient projetée (les alpha restent positifs). Les exemples dont alpha reste nul ne jouent aucun rôle ; seuls les vecteurs de support (alpha &gt; 0) définissent la frontière. Le point fort est le kernel trick : en remplaçant le produit scalaire par un noyau RBF, on obtient une frontière non linéaire sans calculer les coordonnées dans un espace de dimension supérieure.</w:t>
       </w:r>
     </w:p>
     <w:p>
@@ -3065,610 +2711,47 @@
           <w:sz w:val="19"/>
           <w:szCs w:val="19"/>
         </w:rPr>
-        <w:t xml:space="preserve">FORWARD : sortie = </w:t>
-      </w:r>
-      <w:proofErr w:type="gramStart"/>
+        <w:t>alpha &lt;- 0 (un par exemple)</w:t>
+      </w:r>
+    </w:p>
+    <w:p>
+      <w:pPr>
+        <w:shd w:val="clear" w:color="auto" w:fill="EDEFF2"/>
+      </w:pPr>
       <w:r>
         <w:rPr>
           <w:rFonts w:ascii="Consolas" w:eastAsia="Consolas" w:hAnsi="Consolas" w:cs="Consolas"/>
           <w:sz w:val="19"/>
           <w:szCs w:val="19"/>
         </w:rPr>
-        <w:t>activation( somme( poids</w:t>
-      </w:r>
-      <w:proofErr w:type="gramEnd"/>
+        <w:t>decision(x) = b + somme( alpha_n * y_n * K(x, x_n) )</w:t>
+      </w:r>
+    </w:p>
+    <w:p>
+      <w:pPr>
+        <w:shd w:val="clear" w:color="auto" w:fill="EDEFF2"/>
+      </w:pPr>
       <w:r>
         <w:rPr>
           <w:rFonts w:ascii="Consolas" w:eastAsia="Consolas" w:hAnsi="Consolas" w:cs="Consolas"/>
           <w:sz w:val="19"/>
           <w:szCs w:val="19"/>
         </w:rPr>
-        <w:t xml:space="preserve"> * </w:t>
-      </w:r>
-      <w:proofErr w:type="spellStart"/>
-      <w:proofErr w:type="gramStart"/>
+        <w:t>pour chaque i :</w:t>
+      </w:r>
+    </w:p>
+    <w:p>
+      <w:pPr>
+        <w:shd w:val="clear" w:color="auto" w:fill="EDEFF2"/>
+      </w:pPr>
       <w:r>
         <w:rPr>
           <w:rFonts w:ascii="Consolas" w:eastAsia="Consolas" w:hAnsi="Consolas" w:cs="Consolas"/>
           <w:sz w:val="19"/>
           <w:szCs w:val="19"/>
         </w:rPr>
-        <w:t>entrees</w:t>
-      </w:r>
-      <w:proofErr w:type="spellEnd"/>
-      <w:r>
-        <w:rPr>
-          <w:rFonts w:ascii="Consolas" w:eastAsia="Consolas" w:hAnsi="Consolas" w:cs="Consolas"/>
-          <w:sz w:val="19"/>
-          <w:szCs w:val="19"/>
-        </w:rPr>
-        <w:t xml:space="preserve"> )</w:t>
-      </w:r>
-      <w:proofErr w:type="gramEnd"/>
-      <w:r>
-        <w:rPr>
-          <w:rFonts w:ascii="Consolas" w:eastAsia="Consolas" w:hAnsi="Consolas" w:cs="Consolas"/>
-          <w:sz w:val="19"/>
-          <w:szCs w:val="19"/>
-        </w:rPr>
-        <w:t xml:space="preserve"> </w:t>
-      </w:r>
-      <w:proofErr w:type="gramStart"/>
-      <w:r>
-        <w:rPr>
-          <w:rFonts w:ascii="Consolas" w:eastAsia="Consolas" w:hAnsi="Consolas" w:cs="Consolas"/>
-          <w:sz w:val="19"/>
-          <w:szCs w:val="19"/>
-        </w:rPr>
-        <w:t>)  [</w:t>
-      </w:r>
-      <w:proofErr w:type="gramEnd"/>
-      <w:r>
-        <w:rPr>
-          <w:rFonts w:ascii="Consolas" w:eastAsia="Consolas" w:hAnsi="Consolas" w:cs="Consolas"/>
-          <w:sz w:val="19"/>
-          <w:szCs w:val="19"/>
-        </w:rPr>
-        <w:t>couche par couche]</w:t>
-      </w:r>
-    </w:p>
-    <w:p>
-      <w:pPr>
-        <w:shd w:val="clear" w:color="auto" w:fill="EDEFF2"/>
-      </w:pPr>
-      <w:r>
-        <w:rPr>
-          <w:rFonts w:ascii="Consolas" w:eastAsia="Consolas" w:hAnsi="Consolas" w:cs="Consolas"/>
-          <w:sz w:val="19"/>
-          <w:szCs w:val="19"/>
-        </w:rPr>
-        <w:t>BACKPROP (par exemple) :</w:t>
-      </w:r>
-    </w:p>
-    <w:p>
-      <w:pPr>
-        <w:shd w:val="clear" w:color="auto" w:fill="EDEFF2"/>
-      </w:pPr>
-      <w:r>
-        <w:rPr>
-          <w:rFonts w:ascii="Consolas" w:eastAsia="Consolas" w:hAnsi="Consolas" w:cs="Consolas"/>
-          <w:sz w:val="19"/>
-          <w:szCs w:val="19"/>
-        </w:rPr>
-        <w:t xml:space="preserve">    </w:t>
-      </w:r>
-      <w:proofErr w:type="spellStart"/>
-      <w:proofErr w:type="gramStart"/>
-      <w:r>
-        <w:rPr>
-          <w:rFonts w:ascii="Consolas" w:eastAsia="Consolas" w:hAnsi="Consolas" w:cs="Consolas"/>
-          <w:sz w:val="19"/>
-          <w:szCs w:val="19"/>
-        </w:rPr>
-        <w:t>err</w:t>
-      </w:r>
-      <w:proofErr w:type="gramEnd"/>
-      <w:r>
-        <w:rPr>
-          <w:rFonts w:ascii="Consolas" w:eastAsia="Consolas" w:hAnsi="Consolas" w:cs="Consolas"/>
-          <w:sz w:val="19"/>
-          <w:szCs w:val="19"/>
-        </w:rPr>
-        <w:t>_sortie</w:t>
-      </w:r>
-      <w:proofErr w:type="spellEnd"/>
-      <w:r>
-        <w:rPr>
-          <w:rFonts w:ascii="Consolas" w:eastAsia="Consolas" w:hAnsi="Consolas" w:cs="Consolas"/>
-          <w:sz w:val="19"/>
-          <w:szCs w:val="19"/>
-        </w:rPr>
-        <w:t xml:space="preserve"> = (</w:t>
-      </w:r>
-      <w:proofErr w:type="spellStart"/>
-      <w:r>
-        <w:rPr>
-          <w:rFonts w:ascii="Consolas" w:eastAsia="Consolas" w:hAnsi="Consolas" w:cs="Consolas"/>
-          <w:sz w:val="19"/>
-          <w:szCs w:val="19"/>
-        </w:rPr>
-        <w:t>predit</w:t>
-      </w:r>
-      <w:proofErr w:type="spellEnd"/>
-      <w:r>
-        <w:rPr>
-          <w:rFonts w:ascii="Consolas" w:eastAsia="Consolas" w:hAnsi="Consolas" w:cs="Consolas"/>
-          <w:sz w:val="19"/>
-          <w:szCs w:val="19"/>
-        </w:rPr>
-        <w:t xml:space="preserve"> - attendu) * activation'</w:t>
-      </w:r>
-    </w:p>
-    <w:p>
-      <w:pPr>
-        <w:shd w:val="clear" w:color="auto" w:fill="EDEFF2"/>
-      </w:pPr>
-      <w:r>
-        <w:rPr>
-          <w:rFonts w:ascii="Consolas" w:eastAsia="Consolas" w:hAnsi="Consolas" w:cs="Consolas"/>
-          <w:sz w:val="19"/>
-          <w:szCs w:val="19"/>
-        </w:rPr>
-        <w:t xml:space="preserve">    </w:t>
-      </w:r>
-      <w:proofErr w:type="gramStart"/>
-      <w:r>
-        <w:rPr>
-          <w:rFonts w:ascii="Consolas" w:eastAsia="Consolas" w:hAnsi="Consolas" w:cs="Consolas"/>
-          <w:sz w:val="19"/>
-          <w:szCs w:val="19"/>
-        </w:rPr>
-        <w:t>propager</w:t>
-      </w:r>
-      <w:proofErr w:type="gramEnd"/>
-      <w:r>
-        <w:rPr>
-          <w:rFonts w:ascii="Consolas" w:eastAsia="Consolas" w:hAnsi="Consolas" w:cs="Consolas"/>
-          <w:sz w:val="19"/>
-          <w:szCs w:val="19"/>
-        </w:rPr>
-        <w:t xml:space="preserve"> l'erreur de la sortie vers l'</w:t>
-      </w:r>
-      <w:proofErr w:type="spellStart"/>
-      <w:r>
-        <w:rPr>
-          <w:rFonts w:ascii="Consolas" w:eastAsia="Consolas" w:hAnsi="Consolas" w:cs="Consolas"/>
-          <w:sz w:val="19"/>
-          <w:szCs w:val="19"/>
-        </w:rPr>
-        <w:t>entree</w:t>
-      </w:r>
-      <w:proofErr w:type="spellEnd"/>
-    </w:p>
-    <w:p>
-      <w:pPr>
-        <w:shd w:val="clear" w:color="auto" w:fill="EDEFF2"/>
-        <w:spacing w:after="170"/>
-      </w:pPr>
-      <w:r>
-        <w:rPr>
-          <w:rFonts w:ascii="Consolas" w:eastAsia="Consolas" w:hAnsi="Consolas" w:cs="Consolas"/>
-          <w:sz w:val="19"/>
-          <w:szCs w:val="19"/>
-        </w:rPr>
-        <w:t xml:space="preserve">    </w:t>
-      </w:r>
-      <w:proofErr w:type="gramStart"/>
-      <w:r>
-        <w:rPr>
-          <w:rFonts w:ascii="Consolas" w:eastAsia="Consolas" w:hAnsi="Consolas" w:cs="Consolas"/>
-          <w:sz w:val="19"/>
-          <w:szCs w:val="19"/>
-        </w:rPr>
-        <w:t>w</w:t>
-      </w:r>
-      <w:proofErr w:type="gramEnd"/>
-      <w:r>
-        <w:rPr>
-          <w:rFonts w:ascii="Consolas" w:eastAsia="Consolas" w:hAnsi="Consolas" w:cs="Consolas"/>
-          <w:sz w:val="19"/>
-          <w:szCs w:val="19"/>
-        </w:rPr>
-        <w:t xml:space="preserve"> &lt;- w - </w:t>
-      </w:r>
-      <w:proofErr w:type="spellStart"/>
-      <w:r>
-        <w:rPr>
-          <w:rFonts w:ascii="Consolas" w:eastAsia="Consolas" w:hAnsi="Consolas" w:cs="Consolas"/>
-          <w:sz w:val="19"/>
-          <w:szCs w:val="19"/>
-        </w:rPr>
-        <w:t>lr</w:t>
-      </w:r>
-      <w:proofErr w:type="spellEnd"/>
-      <w:r>
-        <w:rPr>
-          <w:rFonts w:ascii="Consolas" w:eastAsia="Consolas" w:hAnsi="Consolas" w:cs="Consolas"/>
-          <w:sz w:val="19"/>
-          <w:szCs w:val="19"/>
-        </w:rPr>
-        <w:t xml:space="preserve"> * </w:t>
-      </w:r>
-      <w:proofErr w:type="spellStart"/>
-      <w:r>
-        <w:rPr>
-          <w:rFonts w:ascii="Consolas" w:eastAsia="Consolas" w:hAnsi="Consolas" w:cs="Consolas"/>
-          <w:sz w:val="19"/>
-          <w:szCs w:val="19"/>
-        </w:rPr>
-        <w:t>entree</w:t>
-      </w:r>
-      <w:proofErr w:type="spellEnd"/>
-      <w:r>
-        <w:rPr>
-          <w:rFonts w:ascii="Consolas" w:eastAsia="Consolas" w:hAnsi="Consolas" w:cs="Consolas"/>
-          <w:sz w:val="19"/>
-          <w:szCs w:val="19"/>
-        </w:rPr>
-        <w:t xml:space="preserve"> * delta</w:t>
-      </w:r>
-    </w:p>
-    <w:p>
-      <w:pPr>
-        <w:pStyle w:val="Titre2"/>
-        <w:spacing w:before="220" w:after="100"/>
-      </w:pPr>
-      <w:bookmarkStart w:id="11" w:name="_Toc235380954"/>
-      <w:r>
-        <w:rPr>
-          <w:rFonts w:ascii="Cambria" w:eastAsia="Cambria" w:hAnsi="Cambria" w:cs="Cambria"/>
-          <w:b/>
-          <w:bCs/>
-          <w:color w:val="1E2761"/>
-          <w:sz w:val="25"/>
-          <w:szCs w:val="25"/>
-        </w:rPr>
-        <w:t xml:space="preserve">5.3 Support </w:t>
-      </w:r>
-      <w:proofErr w:type="spellStart"/>
-      <w:r>
-        <w:rPr>
-          <w:rFonts w:ascii="Cambria" w:eastAsia="Cambria" w:hAnsi="Cambria" w:cs="Cambria"/>
-          <w:b/>
-          <w:bCs/>
-          <w:color w:val="1E2761"/>
-          <w:sz w:val="25"/>
-          <w:szCs w:val="25"/>
-        </w:rPr>
-        <w:t>Vector</w:t>
-      </w:r>
-      <w:proofErr w:type="spellEnd"/>
-      <w:r>
-        <w:rPr>
-          <w:rFonts w:ascii="Cambria" w:eastAsia="Cambria" w:hAnsi="Cambria" w:cs="Cambria"/>
-          <w:b/>
-          <w:bCs/>
-          <w:color w:val="1E2761"/>
-          <w:sz w:val="25"/>
-          <w:szCs w:val="25"/>
-        </w:rPr>
-        <w:t xml:space="preserve"> Machine (SVM)</w:t>
-      </w:r>
-      <w:bookmarkEnd w:id="11"/>
-    </w:p>
-    <w:p>
-      <w:pPr>
-        <w:spacing w:after="200" w:line="320" w:lineRule="auto"/>
-        <w:jc w:val="both"/>
-      </w:pPr>
-      <w:r>
-        <w:t>Le SVM cherche la frontière à marge maximale, celle qui laisse le plus grand couloir vide entre les classes, ce qui favorise la généralisation. Nous avons implémenté la formulation duale du cours, exprimée en multiplicateurs de Lagrange alpha (un par exemple). La décision est une somme pondérée de noyaux entre le point à classer et les exemples d'entraînement. Le sujet interdisant tout solveur externe, nous résolvons le dual par montée de gradient projetée (</w:t>
-      </w:r>
-      <w:proofErr w:type="gramStart"/>
-      <w:r>
-        <w:t>les alpha</w:t>
-      </w:r>
-      <w:proofErr w:type="gramEnd"/>
-      <w:r>
-        <w:t xml:space="preserve"> restent positifs). Les exemples dont alpha reste nul ne jouent aucun rôle ; seuls les vecteurs de support (alpha &gt; 0) définissent la frontière. Le point fort est le kernel trick : en remplaçant le produit scalaire par un noyau RBF, on obtient une frontière non linéaire sans calculer les coordonnées dans un espace de dimension supérieure.</w:t>
-      </w:r>
-    </w:p>
-    <w:p>
-      <w:pPr>
-        <w:shd w:val="clear" w:color="auto" w:fill="EDEFF2"/>
-        <w:spacing w:before="60"/>
-      </w:pPr>
-      <w:proofErr w:type="gramStart"/>
-      <w:r>
-        <w:rPr>
-          <w:rFonts w:ascii="Consolas" w:eastAsia="Consolas" w:hAnsi="Consolas" w:cs="Consolas"/>
-          <w:sz w:val="19"/>
-          <w:szCs w:val="19"/>
-        </w:rPr>
-        <w:t>alpha</w:t>
-      </w:r>
-      <w:proofErr w:type="gramEnd"/>
-      <w:r>
-        <w:rPr>
-          <w:rFonts w:ascii="Consolas" w:eastAsia="Consolas" w:hAnsi="Consolas" w:cs="Consolas"/>
-          <w:sz w:val="19"/>
-          <w:szCs w:val="19"/>
-        </w:rPr>
-        <w:t xml:space="preserve"> &lt;- 0 (un par exemple)</w:t>
-      </w:r>
-    </w:p>
-    <w:p>
-      <w:pPr>
-        <w:shd w:val="clear" w:color="auto" w:fill="EDEFF2"/>
-      </w:pPr>
-      <w:proofErr w:type="spellStart"/>
-      <w:proofErr w:type="gramStart"/>
-      <w:r>
-        <w:rPr>
-          <w:rFonts w:ascii="Consolas" w:eastAsia="Consolas" w:hAnsi="Consolas" w:cs="Consolas"/>
-          <w:sz w:val="19"/>
-          <w:szCs w:val="19"/>
-        </w:rPr>
-        <w:t>decision</w:t>
-      </w:r>
-      <w:proofErr w:type="spellEnd"/>
-      <w:proofErr w:type="gramEnd"/>
-      <w:r>
-        <w:rPr>
-          <w:rFonts w:ascii="Consolas" w:eastAsia="Consolas" w:hAnsi="Consolas" w:cs="Consolas"/>
-          <w:sz w:val="19"/>
-          <w:szCs w:val="19"/>
-        </w:rPr>
-        <w:t xml:space="preserve">(x) = b + </w:t>
-      </w:r>
-      <w:proofErr w:type="gramStart"/>
-      <w:r>
-        <w:rPr>
-          <w:rFonts w:ascii="Consolas" w:eastAsia="Consolas" w:hAnsi="Consolas" w:cs="Consolas"/>
-          <w:sz w:val="19"/>
-          <w:szCs w:val="19"/>
-        </w:rPr>
-        <w:t xml:space="preserve">somme( </w:t>
-      </w:r>
-      <w:proofErr w:type="spellStart"/>
-      <w:r>
-        <w:rPr>
-          <w:rFonts w:ascii="Consolas" w:eastAsia="Consolas" w:hAnsi="Consolas" w:cs="Consolas"/>
-          <w:sz w:val="19"/>
-          <w:szCs w:val="19"/>
-        </w:rPr>
-        <w:t>alpha</w:t>
-      </w:r>
-      <w:proofErr w:type="gramEnd"/>
-      <w:r>
-        <w:rPr>
-          <w:rFonts w:ascii="Consolas" w:eastAsia="Consolas" w:hAnsi="Consolas" w:cs="Consolas"/>
-          <w:sz w:val="19"/>
-          <w:szCs w:val="19"/>
-        </w:rPr>
-        <w:t>_n</w:t>
-      </w:r>
-      <w:proofErr w:type="spellEnd"/>
-      <w:r>
-        <w:rPr>
-          <w:rFonts w:ascii="Consolas" w:eastAsia="Consolas" w:hAnsi="Consolas" w:cs="Consolas"/>
-          <w:sz w:val="19"/>
-          <w:szCs w:val="19"/>
-        </w:rPr>
-        <w:t xml:space="preserve"> * </w:t>
-      </w:r>
-      <w:proofErr w:type="spellStart"/>
-      <w:r>
-        <w:rPr>
-          <w:rFonts w:ascii="Consolas" w:eastAsia="Consolas" w:hAnsi="Consolas" w:cs="Consolas"/>
-          <w:sz w:val="19"/>
-          <w:szCs w:val="19"/>
-        </w:rPr>
-        <w:t>y_n</w:t>
-      </w:r>
-      <w:proofErr w:type="spellEnd"/>
-      <w:r>
-        <w:rPr>
-          <w:rFonts w:ascii="Consolas" w:eastAsia="Consolas" w:hAnsi="Consolas" w:cs="Consolas"/>
-          <w:sz w:val="19"/>
-          <w:szCs w:val="19"/>
-        </w:rPr>
-        <w:t xml:space="preserve"> * </w:t>
-      </w:r>
-      <w:proofErr w:type="gramStart"/>
-      <w:r>
-        <w:rPr>
-          <w:rFonts w:ascii="Consolas" w:eastAsia="Consolas" w:hAnsi="Consolas" w:cs="Consolas"/>
-          <w:sz w:val="19"/>
-          <w:szCs w:val="19"/>
-        </w:rPr>
-        <w:t>K(</w:t>
-      </w:r>
-      <w:proofErr w:type="gramEnd"/>
-      <w:r>
-        <w:rPr>
-          <w:rFonts w:ascii="Consolas" w:eastAsia="Consolas" w:hAnsi="Consolas" w:cs="Consolas"/>
-          <w:sz w:val="19"/>
-          <w:szCs w:val="19"/>
-        </w:rPr>
-        <w:t xml:space="preserve">x, </w:t>
-      </w:r>
-      <w:proofErr w:type="spellStart"/>
-      <w:r>
-        <w:rPr>
-          <w:rFonts w:ascii="Consolas" w:eastAsia="Consolas" w:hAnsi="Consolas" w:cs="Consolas"/>
-          <w:sz w:val="19"/>
-          <w:szCs w:val="19"/>
-        </w:rPr>
-        <w:t>x_n</w:t>
-      </w:r>
-      <w:proofErr w:type="spellEnd"/>
-      <w:proofErr w:type="gramStart"/>
-      <w:r>
-        <w:rPr>
-          <w:rFonts w:ascii="Consolas" w:eastAsia="Consolas" w:hAnsi="Consolas" w:cs="Consolas"/>
-          <w:sz w:val="19"/>
-          <w:szCs w:val="19"/>
-        </w:rPr>
-        <w:t>) )</w:t>
-      </w:r>
-      <w:proofErr w:type="gramEnd"/>
-    </w:p>
-    <w:p>
-      <w:pPr>
-        <w:shd w:val="clear" w:color="auto" w:fill="EDEFF2"/>
-      </w:pPr>
-      <w:proofErr w:type="gramStart"/>
-      <w:r>
-        <w:rPr>
-          <w:rFonts w:ascii="Consolas" w:eastAsia="Consolas" w:hAnsi="Consolas" w:cs="Consolas"/>
-          <w:sz w:val="19"/>
-          <w:szCs w:val="19"/>
-        </w:rPr>
-        <w:t>pour</w:t>
-      </w:r>
-      <w:proofErr w:type="gramEnd"/>
-      <w:r>
-        <w:rPr>
-          <w:rFonts w:ascii="Consolas" w:eastAsia="Consolas" w:hAnsi="Consolas" w:cs="Consolas"/>
-          <w:sz w:val="19"/>
-          <w:szCs w:val="19"/>
-        </w:rPr>
-        <w:t xml:space="preserve"> chaque i :</w:t>
-      </w:r>
-    </w:p>
-    <w:p>
-      <w:pPr>
-        <w:shd w:val="clear" w:color="auto" w:fill="EDEFF2"/>
-      </w:pPr>
-      <w:r>
-        <w:rPr>
-          <w:rFonts w:ascii="Consolas" w:eastAsia="Consolas" w:hAnsi="Consolas" w:cs="Consolas"/>
-          <w:sz w:val="19"/>
-          <w:szCs w:val="19"/>
-        </w:rPr>
-        <w:t xml:space="preserve">    </w:t>
-      </w:r>
-      <w:proofErr w:type="gramStart"/>
-      <w:r>
-        <w:rPr>
-          <w:rFonts w:ascii="Consolas" w:eastAsia="Consolas" w:hAnsi="Consolas" w:cs="Consolas"/>
-          <w:sz w:val="19"/>
-          <w:szCs w:val="19"/>
-        </w:rPr>
-        <w:t>s</w:t>
-      </w:r>
-      <w:proofErr w:type="gramEnd"/>
-      <w:r>
-        <w:rPr>
-          <w:rFonts w:ascii="Consolas" w:eastAsia="Consolas" w:hAnsi="Consolas" w:cs="Consolas"/>
-          <w:sz w:val="19"/>
-          <w:szCs w:val="19"/>
-        </w:rPr>
-        <w:t xml:space="preserve"> = </w:t>
-      </w:r>
-      <w:proofErr w:type="gramStart"/>
-      <w:r>
-        <w:rPr>
-          <w:rFonts w:ascii="Consolas" w:eastAsia="Consolas" w:hAnsi="Consolas" w:cs="Consolas"/>
-          <w:sz w:val="19"/>
-          <w:szCs w:val="19"/>
-        </w:rPr>
-        <w:t xml:space="preserve">somme( </w:t>
-      </w:r>
-      <w:proofErr w:type="spellStart"/>
-      <w:r>
-        <w:rPr>
-          <w:rFonts w:ascii="Consolas" w:eastAsia="Consolas" w:hAnsi="Consolas" w:cs="Consolas"/>
-          <w:sz w:val="19"/>
-          <w:szCs w:val="19"/>
-        </w:rPr>
-        <w:t>alpha</w:t>
-      </w:r>
-      <w:proofErr w:type="gramEnd"/>
-      <w:r>
-        <w:rPr>
-          <w:rFonts w:ascii="Consolas" w:eastAsia="Consolas" w:hAnsi="Consolas" w:cs="Consolas"/>
-          <w:sz w:val="19"/>
-          <w:szCs w:val="19"/>
-        </w:rPr>
-        <w:t>_j</w:t>
-      </w:r>
-      <w:proofErr w:type="spellEnd"/>
-      <w:r>
-        <w:rPr>
-          <w:rFonts w:ascii="Consolas" w:eastAsia="Consolas" w:hAnsi="Consolas" w:cs="Consolas"/>
-          <w:sz w:val="19"/>
-          <w:szCs w:val="19"/>
-        </w:rPr>
-        <w:t xml:space="preserve"> * </w:t>
-      </w:r>
-      <w:proofErr w:type="spellStart"/>
-      <w:r>
-        <w:rPr>
-          <w:rFonts w:ascii="Consolas" w:eastAsia="Consolas" w:hAnsi="Consolas" w:cs="Consolas"/>
-          <w:sz w:val="19"/>
-          <w:szCs w:val="19"/>
-        </w:rPr>
-        <w:t>y_j</w:t>
-      </w:r>
-      <w:proofErr w:type="spellEnd"/>
-      <w:r>
-        <w:rPr>
-          <w:rFonts w:ascii="Consolas" w:eastAsia="Consolas" w:hAnsi="Consolas" w:cs="Consolas"/>
-          <w:sz w:val="19"/>
-          <w:szCs w:val="19"/>
-        </w:rPr>
-        <w:t xml:space="preserve"> * </w:t>
-      </w:r>
-      <w:proofErr w:type="gramStart"/>
-      <w:r>
-        <w:rPr>
-          <w:rFonts w:ascii="Consolas" w:eastAsia="Consolas" w:hAnsi="Consolas" w:cs="Consolas"/>
-          <w:sz w:val="19"/>
-          <w:szCs w:val="19"/>
-        </w:rPr>
-        <w:t>K(</w:t>
-      </w:r>
-      <w:proofErr w:type="spellStart"/>
-      <w:proofErr w:type="gramEnd"/>
-      <w:r>
-        <w:rPr>
-          <w:rFonts w:ascii="Consolas" w:eastAsia="Consolas" w:hAnsi="Consolas" w:cs="Consolas"/>
-          <w:sz w:val="19"/>
-          <w:szCs w:val="19"/>
-        </w:rPr>
-        <w:t>x_i</w:t>
-      </w:r>
-      <w:proofErr w:type="spellEnd"/>
-      <w:r>
-        <w:rPr>
-          <w:rFonts w:ascii="Consolas" w:eastAsia="Consolas" w:hAnsi="Consolas" w:cs="Consolas"/>
-          <w:sz w:val="19"/>
-          <w:szCs w:val="19"/>
-        </w:rPr>
-        <w:t xml:space="preserve">, </w:t>
-      </w:r>
-      <w:proofErr w:type="spellStart"/>
-      <w:r>
-        <w:rPr>
-          <w:rFonts w:ascii="Consolas" w:eastAsia="Consolas" w:hAnsi="Consolas" w:cs="Consolas"/>
-          <w:sz w:val="19"/>
-          <w:szCs w:val="19"/>
-        </w:rPr>
-        <w:t>x_j</w:t>
-      </w:r>
-      <w:proofErr w:type="spellEnd"/>
-      <w:proofErr w:type="gramStart"/>
-      <w:r>
-        <w:rPr>
-          <w:rFonts w:ascii="Consolas" w:eastAsia="Consolas" w:hAnsi="Consolas" w:cs="Consolas"/>
-          <w:sz w:val="19"/>
-          <w:szCs w:val="19"/>
-        </w:rPr>
-        <w:t>) )</w:t>
-      </w:r>
-      <w:proofErr w:type="gramEnd"/>
+        <w:t xml:space="preserve">    s = somme( alpha_j * y_j * K(x_i, x_j) )</w:t>
+      </w:r>
     </w:p>
     <w:p>
       <w:pPr>
@@ -3721,7 +2804,7 @@
           <w:lang w:val="en-US"/>
         </w:rPr>
       </w:pPr>
-      <w:bookmarkStart w:id="12" w:name="_Toc235380955"/>
+      <w:bookmarkStart w:id="12" w:name="_Toc235392539"/>
       <w:r>
         <w:rPr>
           <w:rFonts w:ascii="Cambria" w:eastAsia="Cambria" w:hAnsi="Cambria" w:cs="Cambria"/>
@@ -3742,15 +2825,7 @@
         <w:jc w:val="both"/>
       </w:pPr>
       <w:r>
-        <w:t>Le RBF repose sur des représentants : plutôt que conserver tous les exemples, on élit des centres (par l'algorithme de Lloyd / k-</w:t>
-      </w:r>
-      <w:proofErr w:type="spellStart"/>
-      <w:r>
-        <w:t>means</w:t>
-      </w:r>
-      <w:proofErr w:type="spellEnd"/>
-      <w:r>
-        <w:t xml:space="preserve">). À chaque centre est associée une gaussienne, sa zone d'influence, de largeur contrôlée par gamma. La sortie est une combinaison pondérée de ces gaussiennes ; les poids de sortie sont obtenus directement par résolution d'un système aux moindres carrés. Le nombre de centres </w:t>
+        <w:t xml:space="preserve">Le RBF repose sur des représentants : plutôt que conserver tous les exemples, on élit des centres (par l'algorithme de Lloyd / k-means). À chaque centre est associée une gaussienne, sa zone d'influence, de largeur contrôlée par gamma. La sortie est une combinaison pondérée de ces gaussiennes ; les poids de sortie sont obtenus directement par résolution d'un système aux moindres carrés. Le nombre de centres </w:t>
       </w:r>
       <w:r>
         <w:lastRenderedPageBreak/>
@@ -3768,30 +2843,39 @@
           <w:sz w:val="19"/>
           <w:szCs w:val="19"/>
         </w:rPr>
-        <w:t>1. choisir K centres (k-</w:t>
-      </w:r>
-      <w:proofErr w:type="spellStart"/>
+        <w:t>1. choisir K centres (k-means / algorithme de Lloyd)</w:t>
+      </w:r>
+    </w:p>
+    <w:p>
+      <w:pPr>
+        <w:shd w:val="clear" w:color="auto" w:fill="EDEFF2"/>
+      </w:pPr>
       <w:r>
         <w:rPr>
           <w:rFonts w:ascii="Consolas" w:eastAsia="Consolas" w:hAnsi="Consolas" w:cs="Consolas"/>
           <w:sz w:val="19"/>
           <w:szCs w:val="19"/>
         </w:rPr>
-        <w:t>means</w:t>
-      </w:r>
-      <w:proofErr w:type="spellEnd"/>
+        <w:t>2. phi_j(x) = exp( -gamma * ||x - centre_j||^2 )</w:t>
+      </w:r>
+    </w:p>
+    <w:p>
+      <w:pPr>
+        <w:shd w:val="clear" w:color="auto" w:fill="EDEFF2"/>
+      </w:pPr>
       <w:r>
         <w:rPr>
           <w:rFonts w:ascii="Consolas" w:eastAsia="Consolas" w:hAnsi="Consolas" w:cs="Consolas"/>
           <w:sz w:val="19"/>
           <w:szCs w:val="19"/>
         </w:rPr>
-        <w:t xml:space="preserve"> / algorithme de Lloyd)</w:t>
+        <w:t>3. sortie = somme( w_j * phi_j(x) )</w:t>
       </w:r>
     </w:p>
     <w:p>
       <w:pPr>
         <w:shd w:val="clear" w:color="auto" w:fill="EDEFF2"/>
+        <w:spacing w:after="170"/>
       </w:pPr>
       <w:r>
         <w:rPr>
@@ -3799,244 +2883,7 @@
           <w:sz w:val="19"/>
           <w:szCs w:val="19"/>
         </w:rPr>
-        <w:t xml:space="preserve">2. </w:t>
-      </w:r>
-      <w:proofErr w:type="spellStart"/>
-      <w:r>
-        <w:rPr>
-          <w:rFonts w:ascii="Consolas" w:eastAsia="Consolas" w:hAnsi="Consolas" w:cs="Consolas"/>
-          <w:sz w:val="19"/>
-          <w:szCs w:val="19"/>
-        </w:rPr>
-        <w:t>phi_j</w:t>
-      </w:r>
-      <w:proofErr w:type="spellEnd"/>
-      <w:r>
-        <w:rPr>
-          <w:rFonts w:ascii="Consolas" w:eastAsia="Consolas" w:hAnsi="Consolas" w:cs="Consolas"/>
-          <w:sz w:val="19"/>
-          <w:szCs w:val="19"/>
-        </w:rPr>
-        <w:t xml:space="preserve">(x) = </w:t>
-      </w:r>
-      <w:proofErr w:type="spellStart"/>
-      <w:proofErr w:type="gramStart"/>
-      <w:r>
-        <w:rPr>
-          <w:rFonts w:ascii="Consolas" w:eastAsia="Consolas" w:hAnsi="Consolas" w:cs="Consolas"/>
-          <w:sz w:val="19"/>
-          <w:szCs w:val="19"/>
-        </w:rPr>
-        <w:t>exp</w:t>
-      </w:r>
-      <w:proofErr w:type="spellEnd"/>
-      <w:r>
-        <w:rPr>
-          <w:rFonts w:ascii="Consolas" w:eastAsia="Consolas" w:hAnsi="Consolas" w:cs="Consolas"/>
-          <w:sz w:val="19"/>
-          <w:szCs w:val="19"/>
-        </w:rPr>
-        <w:t>( -</w:t>
-      </w:r>
-      <w:proofErr w:type="gramEnd"/>
-      <w:r>
-        <w:rPr>
-          <w:rFonts w:ascii="Consolas" w:eastAsia="Consolas" w:hAnsi="Consolas" w:cs="Consolas"/>
-          <w:sz w:val="19"/>
-          <w:szCs w:val="19"/>
-        </w:rPr>
-        <w:t xml:space="preserve">gamma * ||x - </w:t>
-      </w:r>
-      <w:proofErr w:type="spellStart"/>
-      <w:r>
-        <w:rPr>
-          <w:rFonts w:ascii="Consolas" w:eastAsia="Consolas" w:hAnsi="Consolas" w:cs="Consolas"/>
-          <w:sz w:val="19"/>
-          <w:szCs w:val="19"/>
-        </w:rPr>
-        <w:t>centre_j</w:t>
-      </w:r>
-      <w:proofErr w:type="spellEnd"/>
-      <w:r>
-        <w:rPr>
-          <w:rFonts w:ascii="Consolas" w:eastAsia="Consolas" w:hAnsi="Consolas" w:cs="Consolas"/>
-          <w:sz w:val="19"/>
-          <w:szCs w:val="19"/>
-        </w:rPr>
-        <w:t>||^</w:t>
-      </w:r>
-      <w:proofErr w:type="gramStart"/>
-      <w:r>
-        <w:rPr>
-          <w:rFonts w:ascii="Consolas" w:eastAsia="Consolas" w:hAnsi="Consolas" w:cs="Consolas"/>
-          <w:sz w:val="19"/>
-          <w:szCs w:val="19"/>
-        </w:rPr>
-        <w:t>2 )</w:t>
-      </w:r>
-      <w:proofErr w:type="gramEnd"/>
-    </w:p>
-    <w:p>
-      <w:pPr>
-        <w:shd w:val="clear" w:color="auto" w:fill="EDEFF2"/>
-      </w:pPr>
-      <w:r>
-        <w:rPr>
-          <w:rFonts w:ascii="Consolas" w:eastAsia="Consolas" w:hAnsi="Consolas" w:cs="Consolas"/>
-          <w:sz w:val="19"/>
-          <w:szCs w:val="19"/>
-        </w:rPr>
-        <w:t xml:space="preserve">3. sortie = </w:t>
-      </w:r>
-      <w:proofErr w:type="gramStart"/>
-      <w:r>
-        <w:rPr>
-          <w:rFonts w:ascii="Consolas" w:eastAsia="Consolas" w:hAnsi="Consolas" w:cs="Consolas"/>
-          <w:sz w:val="19"/>
-          <w:szCs w:val="19"/>
-        </w:rPr>
-        <w:t xml:space="preserve">somme( </w:t>
-      </w:r>
-      <w:proofErr w:type="spellStart"/>
-      <w:r>
-        <w:rPr>
-          <w:rFonts w:ascii="Consolas" w:eastAsia="Consolas" w:hAnsi="Consolas" w:cs="Consolas"/>
-          <w:sz w:val="19"/>
-          <w:szCs w:val="19"/>
-        </w:rPr>
-        <w:t>w</w:t>
-      </w:r>
-      <w:proofErr w:type="gramEnd"/>
-      <w:r>
-        <w:rPr>
-          <w:rFonts w:ascii="Consolas" w:eastAsia="Consolas" w:hAnsi="Consolas" w:cs="Consolas"/>
-          <w:sz w:val="19"/>
-          <w:szCs w:val="19"/>
-        </w:rPr>
-        <w:t>_j</w:t>
-      </w:r>
-      <w:proofErr w:type="spellEnd"/>
-      <w:r>
-        <w:rPr>
-          <w:rFonts w:ascii="Consolas" w:eastAsia="Consolas" w:hAnsi="Consolas" w:cs="Consolas"/>
-          <w:sz w:val="19"/>
-          <w:szCs w:val="19"/>
-        </w:rPr>
-        <w:t xml:space="preserve"> * </w:t>
-      </w:r>
-      <w:proofErr w:type="spellStart"/>
-      <w:r>
-        <w:rPr>
-          <w:rFonts w:ascii="Consolas" w:eastAsia="Consolas" w:hAnsi="Consolas" w:cs="Consolas"/>
-          <w:sz w:val="19"/>
-          <w:szCs w:val="19"/>
-        </w:rPr>
-        <w:t>phi_j</w:t>
-      </w:r>
-      <w:proofErr w:type="spellEnd"/>
-      <w:r>
-        <w:rPr>
-          <w:rFonts w:ascii="Consolas" w:eastAsia="Consolas" w:hAnsi="Consolas" w:cs="Consolas"/>
-          <w:sz w:val="19"/>
-          <w:szCs w:val="19"/>
-        </w:rPr>
-        <w:t>(x</w:t>
-      </w:r>
-      <w:proofErr w:type="gramStart"/>
-      <w:r>
-        <w:rPr>
-          <w:rFonts w:ascii="Consolas" w:eastAsia="Consolas" w:hAnsi="Consolas" w:cs="Consolas"/>
-          <w:sz w:val="19"/>
-          <w:szCs w:val="19"/>
-        </w:rPr>
-        <w:t>) )</w:t>
-      </w:r>
-      <w:proofErr w:type="gramEnd"/>
-    </w:p>
-    <w:p>
-      <w:pPr>
-        <w:shd w:val="clear" w:color="auto" w:fill="EDEFF2"/>
-        <w:spacing w:after="170"/>
-      </w:pPr>
-      <w:r>
-        <w:rPr>
-          <w:rFonts w:ascii="Consolas" w:eastAsia="Consolas" w:hAnsi="Consolas" w:cs="Consolas"/>
-          <w:sz w:val="19"/>
-          <w:szCs w:val="19"/>
-        </w:rPr>
-        <w:t>4. poids : W = (</w:t>
-      </w:r>
-      <w:proofErr w:type="spellStart"/>
-      <w:r>
-        <w:rPr>
-          <w:rFonts w:ascii="Consolas" w:eastAsia="Consolas" w:hAnsi="Consolas" w:cs="Consolas"/>
-          <w:sz w:val="19"/>
-          <w:szCs w:val="19"/>
-        </w:rPr>
-        <w:t>Phi^T</w:t>
-      </w:r>
-      <w:proofErr w:type="spellEnd"/>
-      <w:r>
-        <w:rPr>
-          <w:rFonts w:ascii="Consolas" w:eastAsia="Consolas" w:hAnsi="Consolas" w:cs="Consolas"/>
-          <w:sz w:val="19"/>
-          <w:szCs w:val="19"/>
-        </w:rPr>
-        <w:t xml:space="preserve"> </w:t>
-      </w:r>
-      <w:proofErr w:type="gramStart"/>
-      <w:r>
-        <w:rPr>
-          <w:rFonts w:ascii="Consolas" w:eastAsia="Consolas" w:hAnsi="Consolas" w:cs="Consolas"/>
-          <w:sz w:val="19"/>
-          <w:szCs w:val="19"/>
-        </w:rPr>
-        <w:t>Phi)^</w:t>
-      </w:r>
-      <w:proofErr w:type="gramEnd"/>
-      <w:r>
-        <w:rPr>
-          <w:rFonts w:ascii="Consolas" w:eastAsia="Consolas" w:hAnsi="Consolas" w:cs="Consolas"/>
-          <w:sz w:val="19"/>
-          <w:szCs w:val="19"/>
-        </w:rPr>
-        <w:t xml:space="preserve">-1 </w:t>
-      </w:r>
-      <w:proofErr w:type="spellStart"/>
-      <w:r>
-        <w:rPr>
-          <w:rFonts w:ascii="Consolas" w:eastAsia="Consolas" w:hAnsi="Consolas" w:cs="Consolas"/>
-          <w:sz w:val="19"/>
-          <w:szCs w:val="19"/>
-        </w:rPr>
-        <w:t>Phi^T</w:t>
-      </w:r>
-      <w:proofErr w:type="spellEnd"/>
-      <w:r>
-        <w:rPr>
-          <w:rFonts w:ascii="Consolas" w:eastAsia="Consolas" w:hAnsi="Consolas" w:cs="Consolas"/>
-          <w:sz w:val="19"/>
-          <w:szCs w:val="19"/>
-        </w:rPr>
-        <w:t xml:space="preserve"> </w:t>
-      </w:r>
-      <w:proofErr w:type="gramStart"/>
-      <w:r>
-        <w:rPr>
-          <w:rFonts w:ascii="Consolas" w:eastAsia="Consolas" w:hAnsi="Consolas" w:cs="Consolas"/>
-          <w:sz w:val="19"/>
-          <w:szCs w:val="19"/>
-        </w:rPr>
-        <w:t>Y  (</w:t>
-      </w:r>
-      <w:proofErr w:type="gramEnd"/>
-      <w:r>
-        <w:rPr>
-          <w:rFonts w:ascii="Consolas" w:eastAsia="Consolas" w:hAnsi="Consolas" w:cs="Consolas"/>
-          <w:sz w:val="19"/>
-          <w:szCs w:val="19"/>
-        </w:rPr>
-        <w:t>moindres carres)</w:t>
+        <w:t>4. poids : W = (Phi^T Phi)^-1 Phi^T Y  (moindres carres)</w:t>
       </w:r>
     </w:p>
     <w:p>
@@ -4044,7 +2891,7 @@
         <w:pStyle w:val="Titre2"/>
         <w:spacing w:before="220" w:after="100"/>
       </w:pPr>
-      <w:bookmarkStart w:id="13" w:name="_Toc235380956"/>
+      <w:bookmarkStart w:id="13" w:name="_Toc235392540"/>
       <w:r>
         <w:rPr>
           <w:rFonts w:ascii="Cambria" w:eastAsia="Cambria" w:hAnsi="Cambria" w:cs="Cambria"/>
@@ -4064,23 +2911,7 @@
         <w:jc w:val="both"/>
       </w:pPr>
       <w:r>
-        <w:t xml:space="preserve">Les exemples du cours sont binaires (étiquettes +1 / −1, une seule sortie). Pour nos trois classes, nous utilisons un codage </w:t>
-      </w:r>
-      <w:proofErr w:type="spellStart"/>
-      <w:r>
-        <w:t>one-hot</w:t>
-      </w:r>
-      <w:proofErr w:type="spellEnd"/>
-      <w:r>
-        <w:t xml:space="preserve"> à trois sorties pour le seul PMC : chaque classe est un vecteur (humain = [1, −1, −1]), la classe prédite étant celle de plus forte sortie (</w:t>
-      </w:r>
-      <w:proofErr w:type="spellStart"/>
-      <w:r>
-        <w:t>argmax</w:t>
-      </w:r>
-      <w:proofErr w:type="spellEnd"/>
-      <w:r>
-        <w:t>). Le modèle linéaire, le SVM et le RBF sont, eux, intrinsèquement binaires ; nous les employons en stratégie un-contre-tous (un classifieur par classe, la décision finale revenant au plus confiant). Le RBF n'est donc pas multi-sorties : ce sont trois réseaux RBF binaires combinés. Cette adaptation était un point d'attention, car une erreur de codage des sorties fausse silencieusement l'apprentissage.</w:t>
+        <w:t>Les exemples du cours sont binaires (étiquettes +1 / −1, une seule sortie). Pour nos trois classes, nous utilisons un codage one-hot à trois sorties pour le seul PMC : chaque classe est un vecteur (humain = [1, −1, −1]), la classe prédite étant celle de plus forte sortie (argmax). Le modèle linéaire, le SVM et le RBF sont, eux, intrinsèquement binaires ; nous les employons en stratégie un-contre-tous (un classifieur par classe, la décision finale revenant au plus confiant). Le RBF n'est donc pas multi-sorties : ce sont trois réseaux RBF binaires combinés. Cette adaptation était un point d'attention, car une erreur de codage des sorties fausse silencieusement l'apprentissage.</w:t>
       </w:r>
     </w:p>
     <w:p>
@@ -4088,7 +2919,7 @@
         <w:pStyle w:val="Titre2"/>
         <w:spacing w:before="220" w:after="100"/>
       </w:pPr>
-      <w:bookmarkStart w:id="14" w:name="_Toc235380957"/>
+      <w:bookmarkStart w:id="14" w:name="_Toc235392541"/>
       <w:r>
         <w:rPr>
           <w:rFonts w:ascii="Cambria" w:eastAsia="Cambria" w:hAnsi="Cambria" w:cs="Cambria"/>
@@ -4116,7 +2947,7 @@
         <w:pStyle w:val="Titre1"/>
         <w:spacing w:before="300" w:after="140"/>
       </w:pPr>
-      <w:bookmarkStart w:id="15" w:name="_Toc235380958"/>
+      <w:bookmarkStart w:id="15" w:name="_Toc235392542"/>
       <w:r>
         <w:rPr>
           <w:rFonts w:ascii="Cambria" w:eastAsia="Cambria" w:hAnsi="Cambria" w:cs="Cambria"/>
@@ -4149,7 +2980,7 @@
           <w:noProof/>
         </w:rPr>
         <w:drawing>
-          <wp:inline distT="0" distB="0" distL="0" distR="0" wp14:anchorId="7A98CA53" wp14:editId="5296BF66">
+          <wp:inline distT="0" distB="0" distL="0" distR="0" wp14:anchorId="2DCF4AA9" wp14:editId="047007F8">
             <wp:extent cx="5715000" cy="1104900"/>
             <wp:effectExtent l="0" t="0" r="0" b="0"/>
             <wp:docPr id="1" name="Image 1"/>
@@ -4224,10 +3055,10 @@
           <w:noProof/>
         </w:rPr>
         <w:drawing>
-          <wp:inline distT="0" distB="0" distL="0" distR="0" wp14:anchorId="7C397F99" wp14:editId="44E0FEBA">
+          <wp:inline distT="0" distB="0" distL="0" distR="0" wp14:anchorId="58EE6F03" wp14:editId="4E25AF97">
             <wp:extent cx="5715000" cy="1104900"/>
             <wp:effectExtent l="0" t="0" r="0" b="0"/>
-            <wp:docPr id="718777583" name="Image 718777583"/>
+            <wp:docPr id="333228819" name="Image 333228819"/>
             <wp:cNvGraphicFramePr>
               <a:graphicFrameLocks xmlns:a="http://schemas.openxmlformats.org/drawingml/2006/main" noChangeAspect="1"/>
             </wp:cNvGraphicFramePr>
@@ -4289,10 +3120,10 @@
           <w:noProof/>
         </w:rPr>
         <w:drawing>
-          <wp:inline distT="0" distB="0" distL="0" distR="0" wp14:anchorId="06990003" wp14:editId="36A22FC8">
+          <wp:inline distT="0" distB="0" distL="0" distR="0" wp14:anchorId="16CE041B" wp14:editId="788047E3">
             <wp:extent cx="5715000" cy="1104900"/>
             <wp:effectExtent l="0" t="0" r="0" b="0"/>
-            <wp:docPr id="1499795502" name="Image 1499795502"/>
+            <wp:docPr id="1443290096" name="Image 1443290096"/>
             <wp:cNvGraphicFramePr>
               <a:graphicFrameLocks xmlns:a="http://schemas.openxmlformats.org/drawingml/2006/main" noChangeAspect="1"/>
             </wp:cNvGraphicFramePr>
@@ -4363,10 +3194,10 @@
           <w:noProof/>
         </w:rPr>
         <w:drawing>
-          <wp:inline distT="0" distB="0" distL="0" distR="0" wp14:anchorId="070FEA72" wp14:editId="08A1C247">
+          <wp:inline distT="0" distB="0" distL="0" distR="0" wp14:anchorId="6C52C5A0" wp14:editId="3E747633">
             <wp:extent cx="5715000" cy="1104900"/>
             <wp:effectExtent l="0" t="0" r="0" b="0"/>
-            <wp:docPr id="1287961048" name="Image 1287961048"/>
+            <wp:docPr id="2034488150" name="Image 2034488150"/>
             <wp:cNvGraphicFramePr>
               <a:graphicFrameLocks xmlns:a="http://schemas.openxmlformats.org/drawingml/2006/main" noChangeAspect="1"/>
             </wp:cNvGraphicFramePr>
@@ -4437,10 +3268,10 @@
           <w:noProof/>
         </w:rPr>
         <w:drawing>
-          <wp:inline distT="0" distB="0" distL="0" distR="0" wp14:anchorId="40A6CD5F" wp14:editId="5A219C76">
+          <wp:inline distT="0" distB="0" distL="0" distR="0" wp14:anchorId="14E74BBC" wp14:editId="08513089">
             <wp:extent cx="5715000" cy="1104900"/>
             <wp:effectExtent l="0" t="0" r="0" b="0"/>
-            <wp:docPr id="1900445092" name="Image 1900445092"/>
+            <wp:docPr id="1797292282" name="Image 1797292282"/>
             <wp:cNvGraphicFramePr>
               <a:graphicFrameLocks xmlns:a="http://schemas.openxmlformats.org/drawingml/2006/main" noChangeAspect="1"/>
             </wp:cNvGraphicFramePr>
@@ -4512,10 +3343,10 @@
           <w:noProof/>
         </w:rPr>
         <w:drawing>
-          <wp:inline distT="0" distB="0" distL="0" distR="0" wp14:anchorId="567C4ABC" wp14:editId="794BEF67">
-            <wp:extent cx="5715000" cy="1104900"/>
+          <wp:inline distT="0" distB="0" distL="0" distR="0" wp14:anchorId="2DBFA4F4" wp14:editId="4A1FB650">
+            <wp:extent cx="5715000" cy="3314700"/>
             <wp:effectExtent l="0" t="0" r="0" b="0"/>
-            <wp:docPr id="2141690303" name="Image 2141690303"/>
+            <wp:docPr id="54142597" name="Image 54142597"/>
             <wp:cNvGraphicFramePr>
               <a:graphicFrameLocks xmlns:a="http://schemas.openxmlformats.org/drawingml/2006/main" noChangeAspect="1"/>
             </wp:cNvGraphicFramePr>
@@ -4538,7 +3369,7 @@
                   <pic:spPr bwMode="auto">
                     <a:xfrm>
                       <a:off x="0" y="0"/>
-                      <a:ext cx="5715000" cy="1104900"/>
+                      <a:ext cx="5715000" cy="3314700"/>
                     </a:xfrm>
                     <a:prstGeom prst="rect">
                       <a:avLst/>
@@ -4577,10 +3408,10 @@
           <w:noProof/>
         </w:rPr>
         <w:drawing>
-          <wp:inline distT="0" distB="0" distL="0" distR="0" wp14:anchorId="712C2BD7" wp14:editId="469AC6D3">
-            <wp:extent cx="5715000" cy="1104900"/>
+          <wp:inline distT="0" distB="0" distL="0" distR="0" wp14:anchorId="12A5C587" wp14:editId="52626A0B">
+            <wp:extent cx="5715000" cy="2266950"/>
             <wp:effectExtent l="0" t="0" r="0" b="0"/>
-            <wp:docPr id="517748286" name="Image 517748286"/>
+            <wp:docPr id="29439823" name="Image 29439823"/>
             <wp:cNvGraphicFramePr>
               <a:graphicFrameLocks xmlns:a="http://schemas.openxmlformats.org/drawingml/2006/main" noChangeAspect="1"/>
             </wp:cNvGraphicFramePr>
@@ -4603,7 +3434,7 @@
                   <pic:spPr bwMode="auto">
                     <a:xfrm>
                       <a:off x="0" y="0"/>
-                      <a:ext cx="5715000" cy="1104900"/>
+                      <a:ext cx="5715000" cy="2266950"/>
                     </a:xfrm>
                     <a:prstGeom prst="rect">
                       <a:avLst/>
@@ -4646,7 +3477,7 @@
         <w:pStyle w:val="Titre1"/>
         <w:spacing w:before="300" w:after="140"/>
       </w:pPr>
-      <w:bookmarkStart w:id="16" w:name="_Toc235380959"/>
+      <w:bookmarkStart w:id="16" w:name="_Toc235392543"/>
       <w:r>
         <w:rPr>
           <w:rFonts w:ascii="Cambria" w:eastAsia="Cambria" w:hAnsi="Cambria" w:cs="Cambria"/>
@@ -4656,9 +3487,63 @@
           <w:sz w:val="30"/>
           <w:szCs w:val="30"/>
         </w:rPr>
-        <w:t xml:space="preserve">7. Constitution du </w:t>
-      </w:r>
-      <w:proofErr w:type="spellStart"/>
+        <w:lastRenderedPageBreak/>
+        <w:t>7. Constitution du dataset</w:t>
+      </w:r>
+      <w:bookmarkEnd w:id="16"/>
+    </w:p>
+    <w:p>
+      <w:pPr>
+        <w:spacing w:after="200" w:line="320" w:lineRule="auto"/>
+        <w:jc w:val="both"/>
+      </w:pPr>
+      <w:r>
+        <w:t>Nous avons constitué un dataset de 750 images, réparties en trois classes équilibrées de 250 images (humain, animal, aucun). Les images collectées ont des résolutions d'origine variables : aucune taille n'a été imposée à la collecte. C'est l'étape de prétraitement qui uniformise les données.</w:t>
+      </w:r>
+    </w:p>
+    <w:p>
+      <w:pPr>
+        <w:spacing w:after="200" w:line="320" w:lineRule="auto"/>
+        <w:jc w:val="both"/>
+      </w:pPr>
+      <w:r>
+        <w:t>Le prétraitement transforme chaque image en un vecteur de taille fixe, seul format acceptable en entrée. Chaque image est redimensionnée en 64×64 pixels — c'est cette opération qui absorbe la diversité des résolutions. Les trois canaux RGB donnent 64×64×3 = 12288 valeurs. Les pixels, initialement entre 0 et 255, sont ramenés dans [0, 1] pour stabiliser l'apprentissage. Enfin la grille est aplatie en un vecteur de 12288 nombres. Le jeu est découpé en apprentissage/test selon un ratio 80/20 stratifié, préservant la proportion de chaque classe. Cette dimension d'entrée élevée (12288) sur un effectif modeste est un facteur explicatif majeur des performances observées.</w:t>
+      </w:r>
+    </w:p>
+    <w:p>
+      <w:pPr>
+        <w:pStyle w:val="Titre2"/>
+        <w:spacing w:before="220" w:after="100"/>
+      </w:pPr>
+      <w:bookmarkStart w:id="17" w:name="_Toc235392544"/>
+      <w:r>
+        <w:rPr>
+          <w:rFonts w:ascii="Cambria" w:eastAsia="Cambria" w:hAnsi="Cambria" w:cs="Cambria"/>
+          <w:b/>
+          <w:bCs/>
+          <w:color w:val="1E2761"/>
+          <w:sz w:val="25"/>
+          <w:szCs w:val="25"/>
+        </w:rPr>
+        <w:t>7.1 Protocole expérimental</w:t>
+      </w:r>
+      <w:bookmarkEnd w:id="17"/>
+    </w:p>
+    <w:p>
+      <w:pPr>
+        <w:spacing w:after="200" w:line="320" w:lineRule="auto"/>
+        <w:jc w:val="both"/>
+      </w:pPr>
+      <w:r>
+        <w:t>Toutes les mesures suivent le même protocole. La métrique est la précision (proportion de prédictions correctes), rapportée séparément sur l'ensemble d'apprentissage et sur l'ensemble de test, afin de distinguer mémorisation et généralisation. La référence est la baseline du hasard (33,3 % pour trois classes équilibrées). Pour chaque hyperparamètre étudié (nombre de neurones, learning rate, nombre d'itérations, gamma, nombre de centres, nombre d'exemples), nous faisons varier un seul paramètre à la fois, les autres étant fixés, puis nous traçons la précision correspondante. Cette approche, un facteur à la fois, permet d'isoler l'effet de chaque réglage et de justifier nos choix finaux.</w:t>
+      </w:r>
+    </w:p>
+    <w:p>
+      <w:pPr>
+        <w:pStyle w:val="Titre1"/>
+        <w:spacing w:before="300" w:after="140"/>
+      </w:pPr>
+      <w:bookmarkStart w:id="18" w:name="_Toc235392545"/>
       <w:r>
         <w:rPr>
           <w:rFonts w:ascii="Cambria" w:eastAsia="Cambria" w:hAnsi="Cambria" w:cs="Cambria"/>
@@ -4668,10 +3553,9 @@
           <w:sz w:val="30"/>
           <w:szCs w:val="30"/>
         </w:rPr>
-        <w:t>dataset</w:t>
-      </w:r>
-      <w:bookmarkEnd w:id="16"/>
-      <w:proofErr w:type="spellEnd"/>
+        <w:t>8. Expérimentations et résultats</w:t>
+      </w:r>
+      <w:bookmarkEnd w:id="18"/>
     </w:p>
     <w:p>
       <w:pPr>
@@ -4679,105 +3563,7 @@
         <w:jc w:val="both"/>
       </w:pPr>
       <w:r>
-        <w:t xml:space="preserve">Nous avons constitué un </w:t>
-      </w:r>
-      <w:proofErr w:type="spellStart"/>
-      <w:r>
-        <w:t>dataset</w:t>
-      </w:r>
-      <w:proofErr w:type="spellEnd"/>
-      <w:r>
-        <w:t xml:space="preserve"> de 750 images, réparties en trois classes équilibrées de 250 images (humain, animal, aucun). Les images collectées ont des résolutions d'origine variables : aucune taille n'a été imposée à la collecte. C'est l'étape de prétraitement qui uniformise les données.</w:t>
-      </w:r>
-    </w:p>
-    <w:p>
-      <w:pPr>
-        <w:spacing w:after="200" w:line="320" w:lineRule="auto"/>
-        <w:jc w:val="both"/>
-      </w:pPr>
-      <w:r>
-        <w:t>Le prétraitement transforme chaque image en un vecteur de taille fixe, seul format acceptable en entrée. Chaque image est redimensionnée en 64×64 pixels — c'est cette opération qui absorbe la diversité des résolutions. Les trois canaux RGB donnent 64×64×3 = 12288 valeurs. Les pixels, initialement entre 0 et 255, sont ramenés dans [0, 1] pour stabiliser l'apprentissage. Enfin la grille est aplatie en un vecteur de 12288 nombres. Le jeu est découpé en apprentissage/test selon un ratio 80/20 stratifié, préservant la proportion de chaque classe. Cette dimension d'entrée élevée (12288) sur un effectif modeste est un facteur explicatif majeur des performances observées.</w:t>
-      </w:r>
-    </w:p>
-    <w:p>
-      <w:pPr>
-        <w:pStyle w:val="Titre2"/>
-        <w:spacing w:before="220" w:after="100"/>
-      </w:pPr>
-      <w:bookmarkStart w:id="17" w:name="_Toc235380960"/>
-      <w:r>
-        <w:rPr>
-          <w:rFonts w:ascii="Cambria" w:eastAsia="Cambria" w:hAnsi="Cambria" w:cs="Cambria"/>
-          <w:b/>
-          <w:bCs/>
-          <w:color w:val="1E2761"/>
-          <w:sz w:val="25"/>
-          <w:szCs w:val="25"/>
-        </w:rPr>
-        <w:t>7.1 Protocole expérimental</w:t>
-      </w:r>
-      <w:bookmarkEnd w:id="17"/>
-    </w:p>
-    <w:p>
-      <w:pPr>
-        <w:spacing w:after="200" w:line="320" w:lineRule="auto"/>
-        <w:jc w:val="both"/>
-      </w:pPr>
-      <w:r>
-        <w:lastRenderedPageBreak/>
-        <w:t xml:space="preserve">Toutes les mesures suivent le même protocole. La métrique est la précision (proportion de prédictions correctes), rapportée séparément sur l'ensemble d'apprentissage et sur l'ensemble de test, afin de distinguer mémorisation et généralisation. La référence est la </w:t>
-      </w:r>
-      <w:proofErr w:type="spellStart"/>
-      <w:r>
-        <w:t>baseline</w:t>
-      </w:r>
-      <w:proofErr w:type="spellEnd"/>
-      <w:r>
-        <w:t xml:space="preserve"> du hasard (33,3 % pour trois classes équilibrées). Pour chaque hyperparamètre étudié (nombre de neurones, </w:t>
-      </w:r>
-      <w:proofErr w:type="spellStart"/>
-      <w:r>
-        <w:t>learning</w:t>
-      </w:r>
-      <w:proofErr w:type="spellEnd"/>
-      <w:r>
-        <w:t xml:space="preserve"> rate, nombre d'itérations, gamma, nombre de centres, nombre d'exemples), nous faisons varier un seul paramètre à la fois, les autres étant fixés, puis nous traçons la précision correspondante. Cette approche, un facteur à la fois, permet d'isoler l'effet de chaque réglage et de justifier nos choix finaux.</w:t>
-      </w:r>
-    </w:p>
-    <w:p>
-      <w:pPr>
-        <w:pStyle w:val="Titre1"/>
-        <w:spacing w:before="300" w:after="140"/>
-      </w:pPr>
-      <w:bookmarkStart w:id="18" w:name="_Toc235380961"/>
-      <w:r>
-        <w:rPr>
-          <w:rFonts w:ascii="Cambria" w:eastAsia="Cambria" w:hAnsi="Cambria" w:cs="Cambria"/>
-          <w:b/>
-          <w:bCs/>
-          <w:color w:val="1E2761"/>
-          <w:sz w:val="30"/>
-          <w:szCs w:val="30"/>
-        </w:rPr>
-        <w:t>8. Expérimentations et résultats</w:t>
-      </w:r>
-      <w:bookmarkEnd w:id="18"/>
-    </w:p>
-    <w:p>
-      <w:pPr>
-        <w:spacing w:after="200" w:line="320" w:lineRule="auto"/>
-        <w:jc w:val="both"/>
-      </w:pPr>
-      <w:r>
-        <w:t xml:space="preserve">Nous présentons les résultats du pire au meilleur. La référence à battre est la </w:t>
-      </w:r>
-      <w:proofErr w:type="spellStart"/>
-      <w:r>
-        <w:t>baseline</w:t>
-      </w:r>
-      <w:proofErr w:type="spellEnd"/>
-      <w:r>
-        <w:t xml:space="preserve"> du hasard sur trois classes équilibrées, soit 33,3 %.</w:t>
+        <w:t>Nous présentons les résultats du pire au meilleur. La référence à battre est la baseline du hasard sur trois classes équilibrées, soit 33,3 %.</w:t>
       </w:r>
     </w:p>
     <w:p>
@@ -4789,11 +3575,12 @@
         <w:rPr>
           <w:noProof/>
         </w:rPr>
+        <w:lastRenderedPageBreak/>
         <w:drawing>
-          <wp:inline distT="0" distB="0" distL="0" distR="0" wp14:anchorId="3ACA5FE6" wp14:editId="00CDCCD5">
+          <wp:inline distT="0" distB="0" distL="0" distR="0" wp14:anchorId="5A4ECB22" wp14:editId="1BD3CE44">
             <wp:extent cx="5715000" cy="3429000"/>
             <wp:effectExtent l="0" t="0" r="0" b="0"/>
-            <wp:docPr id="446807911" name="Image 446807911"/>
+            <wp:docPr id="801135960" name="Image 801135960"/>
             <wp:cNvGraphicFramePr>
               <a:graphicFrameLocks xmlns:a="http://schemas.openxmlformats.org/drawingml/2006/main" noChangeAspect="1"/>
             </wp:cNvGraphicFramePr>
@@ -4842,29 +3629,7 @@
           <w:sz w:val="18"/>
           <w:szCs w:val="18"/>
         </w:rPr>
-        <w:t xml:space="preserve">Précision en apprentissage et en test pour les quatre modèles (MLP en configuration initiale, </w:t>
-      </w:r>
-      <w:proofErr w:type="spellStart"/>
-      <w:r>
-        <w:rPr>
-          <w:i/>
-          <w:iCs/>
-          <w:color w:val="666666"/>
-          <w:sz w:val="18"/>
-          <w:szCs w:val="18"/>
-        </w:rPr>
-        <w:t>tanh</w:t>
-      </w:r>
-      <w:proofErr w:type="spellEnd"/>
-      <w:r>
-        <w:rPr>
-          <w:i/>
-          <w:iCs/>
-          <w:color w:val="666666"/>
-          <w:sz w:val="18"/>
-          <w:szCs w:val="18"/>
-        </w:rPr>
-        <w:t>).</w:t>
+        <w:t>Précision en apprentissage et en test pour les quatre modèles.</w:t>
       </w:r>
     </w:p>
     <w:p>
@@ -4873,23 +3638,7 @@
         <w:jc w:val="both"/>
       </w:pPr>
       <w:r>
-        <w:t xml:space="preserve">La vue d'ensemble est sans appel : sur des pixels bruts, nos modèles plafonnent. Le linéaire ne dépasse pas la </w:t>
-      </w:r>
-      <w:proofErr w:type="spellStart"/>
-      <w:r>
-        <w:t>baseline</w:t>
-      </w:r>
-      <w:proofErr w:type="spellEnd"/>
-      <w:r>
-        <w:t>. Le SVM atteint 98 % en apprentissage mais 41 % en test, signe d'un fort sur-apprentissage. Le RBF offre la meilleure généralisation, autour de 48 % en test, avec un écart apprentissage/test faible. Le MLP y apparaît dans sa configuration initiale (</w:t>
-      </w:r>
-      <w:proofErr w:type="spellStart"/>
-      <w:r>
-        <w:t>tanh</w:t>
-      </w:r>
-      <w:proofErr w:type="spellEnd"/>
-      <w:r>
-        <w:t>) ; corrigé en sigmoïde, il atteint 45,3 % en test (voir section 8.2).</w:t>
+        <w:t>La vue d'ensemble est sans appel : sur des pixels bruts, nos modèles plafonnent. Le linéaire reste juste au-dessus de la baseline (environ 38 % en test). Le SVM atteint 98 % en apprentissage mais seulement 41 % en test, signe d'un fort sur-apprentissage. Le RBF offre la meilleure généralisation, autour de 49 % en test, avec un écart apprentissage/test quasi nul. Le MLP, déployé en sigmoïde, atteint de l'ordre de 47 % en test.</w:t>
       </w:r>
     </w:p>
     <w:p>
@@ -4898,19 +3647,7 @@
         <w:jc w:val="both"/>
       </w:pPr>
       <w:r>
-        <w:t>Dans toutes les figures qui suivent, la courbe d'apprentissage et la courbe de test sont représentées séparément. C'est leur écart qui est informatif : deux courbes proches et basses indiquent un sous-</w:t>
-      </w:r>
-      <w:r>
-        <w:lastRenderedPageBreak/>
-        <w:t xml:space="preserve">apprentissage ; un apprentissage élevé accompagné d'un test bien plus faible signale un sur-apprentissage. La ligne pointillée rappelle systématiquement la </w:t>
-      </w:r>
-      <w:proofErr w:type="spellStart"/>
-      <w:r>
-        <w:t>baseline</w:t>
-      </w:r>
-      <w:proofErr w:type="spellEnd"/>
-      <w:r>
-        <w:t xml:space="preserve"> du hasard.</w:t>
+        <w:t>Dans toutes les figures qui suivent, la courbe d'apprentissage et la courbe de test sont représentées séparément. C'est leur écart qui est informatif : deux courbes proches et basses indiquent un sous-apprentissage ; un apprentissage élevé accompagné d'un test bien plus faible signale un sur-apprentissage. La ligne pointillée rappelle systématiquement la baseline du hasard.</w:t>
       </w:r>
     </w:p>
     <w:p>
@@ -4918,7 +3655,7 @@
         <w:pStyle w:val="Titre2"/>
         <w:spacing w:before="220" w:after="100"/>
       </w:pPr>
-      <w:bookmarkStart w:id="19" w:name="_Toc235380962"/>
+      <w:bookmarkStart w:id="19" w:name="_Toc235392546"/>
       <w:r>
         <w:rPr>
           <w:rFonts w:ascii="Cambria" w:eastAsia="Cambria" w:hAnsi="Cambria" w:cs="Cambria"/>
@@ -4941,11 +3678,12 @@
         <w:rPr>
           <w:noProof/>
         </w:rPr>
+        <w:lastRenderedPageBreak/>
         <w:drawing>
-          <wp:inline distT="0" distB="0" distL="0" distR="0" wp14:anchorId="7237A56C" wp14:editId="5BD21A38">
+          <wp:inline distT="0" distB="0" distL="0" distR="0" wp14:anchorId="279CC44C" wp14:editId="442356ED">
             <wp:extent cx="5715000" cy="3429000"/>
             <wp:effectExtent l="0" t="0" r="0" b="0"/>
-            <wp:docPr id="356499581" name="Image 356499581"/>
+            <wp:docPr id="11234442" name="Image 11234442"/>
             <wp:cNvGraphicFramePr>
               <a:graphicFrameLocks xmlns:a="http://schemas.openxmlformats.org/drawingml/2006/main" noChangeAspect="1"/>
             </wp:cNvGraphicFramePr>
@@ -4994,29 +3732,7 @@
           <w:sz w:val="18"/>
           <w:szCs w:val="18"/>
         </w:rPr>
-        <w:t>Modèle linéaire : effet du nombre d'</w:t>
-      </w:r>
-      <w:proofErr w:type="spellStart"/>
-      <w:r>
-        <w:rPr>
-          <w:i/>
-          <w:iCs/>
-          <w:color w:val="666666"/>
-          <w:sz w:val="18"/>
-          <w:szCs w:val="18"/>
-        </w:rPr>
-        <w:t>epochs</w:t>
-      </w:r>
-      <w:proofErr w:type="spellEnd"/>
-      <w:r>
-        <w:rPr>
-          <w:i/>
-          <w:iCs/>
-          <w:color w:val="666666"/>
-          <w:sz w:val="18"/>
-          <w:szCs w:val="18"/>
-        </w:rPr>
-        <w:t>.</w:t>
+        <w:t>Modèle linéaire : effet du nombre d'epochs.</w:t>
       </w:r>
     </w:p>
     <w:p>
@@ -5025,23 +3741,7 @@
         <w:jc w:val="both"/>
       </w:pPr>
       <w:r>
-        <w:t xml:space="preserve">Le modèle linéaire reste au niveau de la </w:t>
-      </w:r>
-      <w:proofErr w:type="spellStart"/>
-      <w:r>
-        <w:t>baseline</w:t>
-      </w:r>
-      <w:proofErr w:type="spellEnd"/>
-      <w:r>
-        <w:t xml:space="preserve"> quel que soit le réglage ; augmenter le nombre d'</w:t>
-      </w:r>
-      <w:proofErr w:type="spellStart"/>
-      <w:r>
-        <w:t>epochs</w:t>
-      </w:r>
-      <w:proofErr w:type="spellEnd"/>
-      <w:r>
-        <w:t xml:space="preserve"> n'apporte qu'un gain marginal. Résultat attendu et logique : une image ne se sépare pas avec une simple droite, comme le XOR. Ce n'est pas un défaut d'implémentation mais une limite théorique.</w:t>
+        <w:t>Le modèle linéaire reste tout juste au-dessus de la baseline quel que soit le réglage (au mieux environ 38 % en test) ; augmenter le nombre d'epochs n'apporte qu'un gain marginal. Résultat attendu et logique : une image ne se sépare pas avec une simple droite, comme le XOR. Ce n'est pas un défaut d'implémentation mais une limite théorique.</w:t>
       </w:r>
     </w:p>
     <w:p>
@@ -5049,7 +3749,7 @@
         <w:pStyle w:val="Titre2"/>
         <w:spacing w:before="220" w:after="100"/>
       </w:pPr>
-      <w:bookmarkStart w:id="20" w:name="_Toc235380963"/>
+      <w:bookmarkStart w:id="20" w:name="_Toc235392547"/>
       <w:r>
         <w:rPr>
           <w:rFonts w:ascii="Cambria" w:eastAsia="Cambria" w:hAnsi="Cambria" w:cs="Cambria"/>
@@ -5059,22 +3759,9 @@
           <w:sz w:val="25"/>
           <w:szCs w:val="25"/>
         </w:rPr>
-        <w:t xml:space="preserve">8.2 Perceptron </w:t>
-      </w:r>
-      <w:proofErr w:type="spellStart"/>
-      <w:r>
-        <w:rPr>
-          <w:rFonts w:ascii="Cambria" w:eastAsia="Cambria" w:hAnsi="Cambria" w:cs="Cambria"/>
-          <w:b/>
-          <w:bCs/>
-          <w:color w:val="1E2761"/>
-          <w:sz w:val="25"/>
-          <w:szCs w:val="25"/>
-        </w:rPr>
-        <w:t>Multi-Couches</w:t>
+        <w:t>8.2 Perceptron Multi-Couches</w:t>
       </w:r>
       <w:bookmarkEnd w:id="20"/>
-      <w:proofErr w:type="spellEnd"/>
     </w:p>
     <w:p>
       <w:pPr>
@@ -5087,10 +3774,10 @@
         </w:rPr>
         <w:lastRenderedPageBreak/>
         <w:drawing>
-          <wp:inline distT="0" distB="0" distL="0" distR="0" wp14:anchorId="2644B0A2" wp14:editId="34390BF9">
+          <wp:inline distT="0" distB="0" distL="0" distR="0" wp14:anchorId="1ACA883C" wp14:editId="66D919DF">
             <wp:extent cx="5715000" cy="3429000"/>
             <wp:effectExtent l="0" t="0" r="0" b="0"/>
-            <wp:docPr id="1749376821" name="Image 1749376821"/>
+            <wp:docPr id="1007661404" name="Image 1007661404"/>
             <wp:cNvGraphicFramePr>
               <a:graphicFrameLocks xmlns:a="http://schemas.openxmlformats.org/drawingml/2006/main" noChangeAspect="1"/>
             </wp:cNvGraphicFramePr>
@@ -5148,39 +3835,7 @@
         <w:jc w:val="both"/>
       </w:pPr>
       <w:r>
-        <w:t xml:space="preserve">Le choix de l'activation s'est révélé décisif. L'étude comparative (figure ci-dessous) montre la nette supériorité de la sigmoïde sur les couches cachées : de l'ordre de 50 % en test dans cette étude, contre environ 32 % pour </w:t>
-      </w:r>
-      <w:proofErr w:type="spellStart"/>
-      <w:r>
-        <w:t>tanh</w:t>
-      </w:r>
-      <w:proofErr w:type="spellEnd"/>
-      <w:r>
-        <w:t xml:space="preserve"> ou </w:t>
-      </w:r>
-      <w:proofErr w:type="spellStart"/>
-      <w:r>
-        <w:t>ReLU</w:t>
-      </w:r>
-      <w:proofErr w:type="spellEnd"/>
-      <w:r>
-        <w:t xml:space="preserve">. Nous étions initialement partis sur </w:t>
-      </w:r>
-      <w:proofErr w:type="spellStart"/>
-      <w:r>
-        <w:t>tanh</w:t>
-      </w:r>
-      <w:proofErr w:type="spellEnd"/>
-      <w:r>
-        <w:t xml:space="preserve">. Une fois la sigmoïde retenue et le taux d'apprentissage abaissé à 0,001 (10 000 itérations), le modèle finalement déployé atteint 52,7 % en apprentissage et 45,3 % en test — un net progrès par rapport à la version </w:t>
-      </w:r>
-      <w:proofErr w:type="spellStart"/>
-      <w:r>
-        <w:t>tanh</w:t>
-      </w:r>
-      <w:proofErr w:type="spellEnd"/>
-      <w:r>
-        <w:t xml:space="preserve"> initiale. Ce constat, obtenu en traçant systématiquement les courbes, illustre à quel point un modèle correct peut sous-performer à cause d'un seul mauvais réglage.</w:t>
+        <w:t>Le choix de l'activation s'est révélé décisif. L'étude comparative (figure ci-dessus) place la sigmoïde en tête sur les couches cachées : de l'ordre de 41 % en test, contre environ 39 % pour tanh et seulement 33 % (soit la baseline) pour ReLU, qui s'effondre. Nous étions initialement partis sur tanh. Une fois la sigmoïde retenue et le taux d'apprentissage fixé à 0,001 (10 000 itérations), le modèle déployé atteint de l'ordre de 49 % en apprentissage et 47 % en test. Ce constat, obtenu en traçant systématiquement les courbes, illustre à quel point un modèle correct peut sous-performer à cause d'un seul mauvais réglage.</w:t>
       </w:r>
     </w:p>
     <w:p>
@@ -5194,10 +3849,10 @@
         </w:rPr>
         <w:lastRenderedPageBreak/>
         <w:drawing>
-          <wp:inline distT="0" distB="0" distL="0" distR="0" wp14:anchorId="0B8D1020" wp14:editId="3DB045BC">
+          <wp:inline distT="0" distB="0" distL="0" distR="0" wp14:anchorId="31C26311" wp14:editId="095F61F7">
             <wp:extent cx="5715000" cy="3429000"/>
             <wp:effectExtent l="0" t="0" r="0" b="0"/>
-            <wp:docPr id="126514784" name="Image 126514784"/>
+            <wp:docPr id="83816760" name="Image 83816760"/>
             <wp:cNvGraphicFramePr>
               <a:graphicFrameLocks xmlns:a="http://schemas.openxmlformats.org/drawingml/2006/main" noChangeAspect="1"/>
             </wp:cNvGraphicFramePr>
@@ -5259,10 +3914,10 @@
           <w:noProof/>
         </w:rPr>
         <w:drawing>
-          <wp:inline distT="0" distB="0" distL="0" distR="0" wp14:anchorId="2E701A49" wp14:editId="1DAD25F5">
+          <wp:inline distT="0" distB="0" distL="0" distR="0" wp14:anchorId="2B3DEB97" wp14:editId="0183D5CD">
             <wp:extent cx="5715000" cy="3429000"/>
             <wp:effectExtent l="0" t="0" r="0" b="0"/>
-            <wp:docPr id="718367748" name="Image 718367748"/>
+            <wp:docPr id="894914409" name="Image 894914409"/>
             <wp:cNvGraphicFramePr>
               <a:graphicFrameLocks xmlns:a="http://schemas.openxmlformats.org/drawingml/2006/main" noChangeAspect="1"/>
             </wp:cNvGraphicFramePr>
@@ -5332,7 +3987,7 @@
         <w:pStyle w:val="Titre2"/>
         <w:spacing w:before="220" w:after="100"/>
       </w:pPr>
-      <w:bookmarkStart w:id="21" w:name="_Toc235380964"/>
+      <w:bookmarkStart w:id="21" w:name="_Toc235392548"/>
       <w:r>
         <w:rPr>
           <w:rFonts w:ascii="Cambria" w:eastAsia="Cambria" w:hAnsi="Cambria" w:cs="Cambria"/>
@@ -5342,31 +3997,7 @@
           <w:sz w:val="25"/>
           <w:szCs w:val="25"/>
         </w:rPr>
-        <w:t xml:space="preserve">8.3 Support </w:t>
-      </w:r>
-      <w:proofErr w:type="spellStart"/>
-      <w:r>
-        <w:rPr>
-          <w:rFonts w:ascii="Cambria" w:eastAsia="Cambria" w:hAnsi="Cambria" w:cs="Cambria"/>
-          <w:b/>
-          <w:bCs/>
-          <w:color w:val="1E2761"/>
-          <w:sz w:val="25"/>
-          <w:szCs w:val="25"/>
-        </w:rPr>
-        <w:t>Vector</w:t>
-      </w:r>
-      <w:proofErr w:type="spellEnd"/>
-      <w:r>
-        <w:rPr>
-          <w:rFonts w:ascii="Cambria" w:eastAsia="Cambria" w:hAnsi="Cambria" w:cs="Cambria"/>
-          <w:b/>
-          <w:bCs/>
-          <w:color w:val="1E2761"/>
-          <w:sz w:val="25"/>
-          <w:szCs w:val="25"/>
-        </w:rPr>
-        <w:t xml:space="preserve"> Machine</w:t>
+        <w:t>8.3 Support Vector Machine</w:t>
       </w:r>
       <w:bookmarkEnd w:id="21"/>
     </w:p>
@@ -5380,10 +4011,10 @@
           <w:noProof/>
         </w:rPr>
         <w:drawing>
-          <wp:inline distT="0" distB="0" distL="0" distR="0" wp14:anchorId="1695EDC4" wp14:editId="10CF2FCE">
+          <wp:inline distT="0" distB="0" distL="0" distR="0" wp14:anchorId="39ADDA10" wp14:editId="5D936151">
             <wp:extent cx="5715000" cy="3429000"/>
             <wp:effectExtent l="0" t="0" r="0" b="0"/>
-            <wp:docPr id="1857518800" name="Image 1857518800"/>
+            <wp:docPr id="1947976691" name="Image 1947976691"/>
             <wp:cNvGraphicFramePr>
               <a:graphicFrameLocks xmlns:a="http://schemas.openxmlformats.org/drawingml/2006/main" noChangeAspect="1"/>
             </wp:cNvGraphicFramePr>
@@ -5445,10 +4076,10 @@
           <w:noProof/>
         </w:rPr>
         <w:drawing>
-          <wp:inline distT="0" distB="0" distL="0" distR="0" wp14:anchorId="77699CC4" wp14:editId="29B00E7B">
+          <wp:inline distT="0" distB="0" distL="0" distR="0" wp14:anchorId="7A094CFE" wp14:editId="51DBB40B">
             <wp:extent cx="5715000" cy="3429000"/>
             <wp:effectExtent l="0" t="0" r="0" b="0"/>
-            <wp:docPr id="1673325857" name="Image 1673325857"/>
+            <wp:docPr id="1843385867" name="Image 1843385867"/>
             <wp:cNvGraphicFramePr>
               <a:graphicFrameLocks xmlns:a="http://schemas.openxmlformats.org/drawingml/2006/main" noChangeAspect="1"/>
             </wp:cNvGraphicFramePr>
@@ -5507,7 +4138,7 @@
       </w:pPr>
       <w:r>
         <w:lastRenderedPageBreak/>
-        <w:t>Le SVM apprend le jeu d'entraînement quasiment par cœur (98 %) mais généralise mal (41 %) : cas d'école de sur-apprentissage. Par ailleurs, le coût de la méthode duale croît en O(n²) : le temps d'entraînement explose (près de dix minutes pour 150 exemples). Ce compromis précision/temps nous a conduits à limiter le nombre d'exemples utilisés par le SVM.</w:t>
+        <w:t>Le SVM apprend le jeu d'entraînement quasiment par cœur (98 %) mais généralise mal (41 %) : cas d'école de sur-apprentissage. Par ailleurs, le coût de la méthode duale croît en O(n²) : le temps d'entraînement explose (environ 160 secondes pour 150 exemples, contre 2 secondes pour 20). Ce compromis précision/temps nous a conduits à limiter le nombre d'exemples utilisés par le SVM.</w:t>
       </w:r>
     </w:p>
     <w:p>
@@ -5515,7 +4146,7 @@
         <w:pStyle w:val="Titre2"/>
         <w:spacing w:before="220" w:after="100"/>
       </w:pPr>
-      <w:bookmarkStart w:id="22" w:name="_Toc235380965"/>
+      <w:bookmarkStart w:id="22" w:name="_Toc235392549"/>
       <w:r>
         <w:rPr>
           <w:rFonts w:ascii="Cambria" w:eastAsia="Cambria" w:hAnsi="Cambria" w:cs="Cambria"/>
@@ -5525,31 +4156,7 @@
           <w:sz w:val="25"/>
           <w:szCs w:val="25"/>
         </w:rPr>
-        <w:t xml:space="preserve">8.4 Radial Basis </w:t>
-      </w:r>
-      <w:proofErr w:type="spellStart"/>
-      <w:r>
-        <w:rPr>
-          <w:rFonts w:ascii="Cambria" w:eastAsia="Cambria" w:hAnsi="Cambria" w:cs="Cambria"/>
-          <w:b/>
-          <w:bCs/>
-          <w:color w:val="1E2761"/>
-          <w:sz w:val="25"/>
-          <w:szCs w:val="25"/>
-        </w:rPr>
-        <w:t>Function</w:t>
-      </w:r>
-      <w:proofErr w:type="spellEnd"/>
-      <w:r>
-        <w:rPr>
-          <w:rFonts w:ascii="Cambria" w:eastAsia="Cambria" w:hAnsi="Cambria" w:cs="Cambria"/>
-          <w:b/>
-          <w:bCs/>
-          <w:color w:val="1E2761"/>
-          <w:sz w:val="25"/>
-          <w:szCs w:val="25"/>
-        </w:rPr>
-        <w:t xml:space="preserve"> Network</w:t>
+        <w:t>8.4 Radial Basis Function Network</w:t>
       </w:r>
       <w:bookmarkEnd w:id="22"/>
     </w:p>
@@ -5563,10 +4170,10 @@
           <w:noProof/>
         </w:rPr>
         <w:drawing>
-          <wp:inline distT="0" distB="0" distL="0" distR="0" wp14:anchorId="62284126" wp14:editId="3D583F0C">
+          <wp:inline distT="0" distB="0" distL="0" distR="0" wp14:anchorId="7496E8ED" wp14:editId="5C72D19E">
             <wp:extent cx="5715000" cy="3429000"/>
             <wp:effectExtent l="0" t="0" r="0" b="0"/>
-            <wp:docPr id="1920862921" name="Image 1920862921"/>
+            <wp:docPr id="1601300055" name="Image 1601300055"/>
             <wp:cNvGraphicFramePr>
               <a:graphicFrameLocks xmlns:a="http://schemas.openxmlformats.org/drawingml/2006/main" noChangeAspect="1"/>
             </wp:cNvGraphicFramePr>
@@ -5629,10 +4236,10 @@
         </w:rPr>
         <w:lastRenderedPageBreak/>
         <w:drawing>
-          <wp:inline distT="0" distB="0" distL="0" distR="0" wp14:anchorId="7D778CF1" wp14:editId="6E66F4BB">
+          <wp:inline distT="0" distB="0" distL="0" distR="0" wp14:anchorId="3BE08E9D" wp14:editId="30CBEC4F">
             <wp:extent cx="5715000" cy="3429000"/>
             <wp:effectExtent l="0" t="0" r="0" b="0"/>
-            <wp:docPr id="1559621724" name="Image 1559621724"/>
+            <wp:docPr id="1449314275" name="Image 1449314275"/>
             <wp:cNvGraphicFramePr>
               <a:graphicFrameLocks xmlns:a="http://schemas.openxmlformats.org/drawingml/2006/main" noChangeAspect="1"/>
             </wp:cNvGraphicFramePr>
@@ -5690,15 +4297,7 @@
         <w:jc w:val="both"/>
       </w:pPr>
       <w:r>
-        <w:t>Le RBF est notre meilleur modèle en généralisation (environ 48 % en test) avec un écart apprentissage/test faible. La précision de test se stabilise à partir d'une vingtaine de centres ; un gamma trop grand fait chuter les performances car les gaussiennes deviennent trop étroites. Nous avons retenu k = 20 centres (15 itérations de k-</w:t>
-      </w:r>
-      <w:proofErr w:type="spellStart"/>
-      <w:r>
-        <w:t>means</w:t>
-      </w:r>
-      <w:proofErr w:type="spellEnd"/>
-      <w:r>
-        <w:t>) et gamma = 0,01.</w:t>
+        <w:t>Le RBF est notre meilleur modèle en généralisation (environ 48 % en test) avec un écart apprentissage/test faible. La précision de test se stabilise à partir d'une vingtaine de centres ; un gamma trop grand fait chuter les performances car les gaussiennes deviennent trop étroites. Nous avons retenu k = 20 centres (15 itérations de k-means) et gamma = 0,01.</w:t>
       </w:r>
     </w:p>
     <w:p>
@@ -5706,7 +4305,7 @@
         <w:pStyle w:val="Titre2"/>
         <w:spacing w:before="220" w:after="100"/>
       </w:pPr>
-      <w:bookmarkStart w:id="23" w:name="_Toc235380966"/>
+      <w:bookmarkStart w:id="23" w:name="_Toc235392550"/>
       <w:r>
         <w:rPr>
           <w:rFonts w:ascii="Cambria" w:eastAsia="Cambria" w:hAnsi="Cambria" w:cs="Cambria"/>
@@ -5726,15 +4325,7 @@
         <w:jc w:val="both"/>
       </w:pPr>
       <w:r>
-        <w:t xml:space="preserve">Le tableau ci-dessous résume les performances des quatre modèles. La </w:t>
-      </w:r>
-      <w:proofErr w:type="spellStart"/>
-      <w:r>
-        <w:t>baseline</w:t>
-      </w:r>
-      <w:proofErr w:type="spellEnd"/>
-      <w:r>
-        <w:t xml:space="preserve"> du hasard est de 33,3 %.</w:t>
+        <w:t>Le tableau ci-dessous résume les performances des quatre modèles. La baseline du hasard est de 33,3 %.</w:t>
       </w:r>
     </w:p>
     <w:tbl>
@@ -5803,7 +4394,6 @@
             </w:tcMar>
           </w:tcPr>
           <w:p>
-            <w:proofErr w:type="spellStart"/>
             <w:r>
               <w:rPr>
                 <w:b/>
@@ -5812,31 +4402,8 @@
                 <w:sz w:val="20"/>
                 <w:szCs w:val="20"/>
               </w:rPr>
-              <w:t>Préc</w:t>
-            </w:r>
-            <w:proofErr w:type="spellEnd"/>
-            <w:r>
-              <w:rPr>
-                <w:b/>
-                <w:bCs/>
-                <w:color w:val="FFFFFF"/>
-                <w:sz w:val="20"/>
-                <w:szCs w:val="20"/>
-              </w:rPr>
-              <w:t xml:space="preserve">. </w:t>
-            </w:r>
-            <w:proofErr w:type="gramStart"/>
-            <w:r>
-              <w:rPr>
-                <w:b/>
-                <w:bCs/>
-                <w:color w:val="FFFFFF"/>
-                <w:sz w:val="20"/>
-                <w:szCs w:val="20"/>
-              </w:rPr>
-              <w:t>train</w:t>
-            </w:r>
-            <w:proofErr w:type="gramEnd"/>
+              <w:t>Préc. train</w:t>
+            </w:r>
           </w:p>
         </w:tc>
         <w:tc>
@@ -5851,7 +4418,6 @@
             </w:tcMar>
           </w:tcPr>
           <w:p>
-            <w:proofErr w:type="spellStart"/>
             <w:r>
               <w:rPr>
                 <w:b/>
@@ -5860,31 +4426,8 @@
                 <w:sz w:val="20"/>
                 <w:szCs w:val="20"/>
               </w:rPr>
-              <w:t>Préc</w:t>
-            </w:r>
-            <w:proofErr w:type="spellEnd"/>
-            <w:r>
-              <w:rPr>
-                <w:b/>
-                <w:bCs/>
-                <w:color w:val="FFFFFF"/>
-                <w:sz w:val="20"/>
-                <w:szCs w:val="20"/>
-              </w:rPr>
-              <w:t xml:space="preserve">. </w:t>
-            </w:r>
-            <w:proofErr w:type="gramStart"/>
-            <w:r>
-              <w:rPr>
-                <w:b/>
-                <w:bCs/>
-                <w:color w:val="FFFFFF"/>
-                <w:sz w:val="20"/>
-                <w:szCs w:val="20"/>
-              </w:rPr>
-              <w:t>test</w:t>
-            </w:r>
-            <w:proofErr w:type="gramEnd"/>
+              <w:t>Préc. test</w:t>
+            </w:r>
           </w:p>
         </w:tc>
         <w:tc>
@@ -5959,7 +4502,7 @@
                 <w:sz w:val="20"/>
                 <w:szCs w:val="20"/>
               </w:rPr>
-              <w:t>~33 %</w:t>
+              <w:t>~45 %</w:t>
             </w:r>
           </w:p>
         </w:tc>
@@ -5981,7 +4524,7 @@
                 <w:sz w:val="20"/>
                 <w:szCs w:val="20"/>
               </w:rPr>
-              <w:t>~33 %</w:t>
+              <w:t>~38 %</w:t>
             </w:r>
           </w:p>
         </w:tc>
@@ -6003,25 +4546,7 @@
                 <w:sz w:val="20"/>
                 <w:szCs w:val="20"/>
               </w:rPr>
-              <w:t xml:space="preserve">= </w:t>
-            </w:r>
-            <w:proofErr w:type="spellStart"/>
-            <w:r>
-              <w:rPr>
-                <w:color w:val="1F2A37"/>
-                <w:sz w:val="20"/>
-                <w:szCs w:val="20"/>
-              </w:rPr>
-              <w:t>baseline</w:t>
-            </w:r>
-            <w:proofErr w:type="spellEnd"/>
-            <w:r>
-              <w:rPr>
-                <w:color w:val="1F2A37"/>
-                <w:sz w:val="20"/>
-                <w:szCs w:val="20"/>
-              </w:rPr>
-              <w:t xml:space="preserve"> ; ne sépare pas (droite unique)</w:t>
+              <w:t>à peine au-dessus de la baseline (une seule droite)</w:t>
             </w:r>
           </w:p>
         </w:tc>
@@ -6073,7 +4598,7 @@
                 <w:sz w:val="20"/>
                 <w:szCs w:val="20"/>
               </w:rPr>
-              <w:t>52,7 %</w:t>
+              <w:t>~49 %</w:t>
             </w:r>
           </w:p>
         </w:tc>
@@ -6095,7 +4620,7 @@
                 <w:sz w:val="20"/>
                 <w:szCs w:val="20"/>
               </w:rPr>
-              <w:t>45,3 %</w:t>
+              <w:t>~47 %</w:t>
             </w:r>
           </w:p>
         </w:tc>
@@ -6111,52 +4636,14 @@
             </w:tcMar>
           </w:tcPr>
           <w:p>
-            <w:proofErr w:type="gramStart"/>
             <w:r>
               <w:rPr>
                 <w:color w:val="1F2A37"/>
                 <w:sz w:val="20"/>
                 <w:szCs w:val="20"/>
               </w:rPr>
-              <w:t>sigmoïde</w:t>
-            </w:r>
-            <w:proofErr w:type="gramEnd"/>
-            <w:r>
-              <w:rPr>
-                <w:color w:val="1F2A37"/>
-                <w:sz w:val="20"/>
-                <w:szCs w:val="20"/>
-              </w:rPr>
-              <w:t xml:space="preserve"> déployée (</w:t>
-            </w:r>
-            <w:proofErr w:type="spellStart"/>
-            <w:r>
-              <w:rPr>
-                <w:color w:val="1F2A37"/>
-                <w:sz w:val="20"/>
-                <w:szCs w:val="20"/>
-              </w:rPr>
-              <w:t>lr</w:t>
-            </w:r>
-            <w:proofErr w:type="spellEnd"/>
-            <w:r>
-              <w:rPr>
-                <w:color w:val="1F2A37"/>
-                <w:sz w:val="20"/>
-                <w:szCs w:val="20"/>
-              </w:rPr>
-              <w:t xml:space="preserve"> 0,001) ; nettement meilleure que </w:t>
-            </w:r>
-            <w:proofErr w:type="spellStart"/>
-            <w:r>
-              <w:rPr>
-                <w:color w:val="1F2A37"/>
-                <w:sz w:val="20"/>
-                <w:szCs w:val="20"/>
-              </w:rPr>
-              <w:t>tanh</w:t>
-            </w:r>
-            <w:proofErr w:type="spellEnd"/>
+              <w:t>sigmoïde déployée (lr 0,001) ; s'effondre en ReLU</w:t>
+            </w:r>
           </w:p>
         </w:tc>
       </w:tr>
@@ -6245,23 +4732,13 @@
             </w:tcMar>
           </w:tcPr>
           <w:p>
-            <w:proofErr w:type="gramStart"/>
             <w:r>
               <w:rPr>
                 <w:color w:val="1F2A37"/>
                 <w:sz w:val="20"/>
                 <w:szCs w:val="20"/>
               </w:rPr>
-              <w:t>sur</w:t>
-            </w:r>
-            <w:proofErr w:type="gramEnd"/>
-            <w:r>
-              <w:rPr>
-                <w:color w:val="1F2A37"/>
-                <w:sz w:val="20"/>
-                <w:szCs w:val="20"/>
-              </w:rPr>
-              <w:t>-apprentissage marqué ; coût en O(n²)</w:t>
+              <w:t>sur-apprentissage marqué ; coût en O(n²)</w:t>
             </w:r>
           </w:p>
         </w:tc>
@@ -6351,23 +4828,13 @@
             </w:tcMar>
           </w:tcPr>
           <w:p>
-            <w:proofErr w:type="gramStart"/>
             <w:r>
               <w:rPr>
                 <w:color w:val="1F2A37"/>
                 <w:sz w:val="20"/>
                 <w:szCs w:val="20"/>
               </w:rPr>
-              <w:t>meilleure</w:t>
-            </w:r>
-            <w:proofErr w:type="gramEnd"/>
-            <w:r>
-              <w:rPr>
-                <w:color w:val="1F2A37"/>
-                <w:sz w:val="20"/>
-                <w:szCs w:val="20"/>
-              </w:rPr>
-              <w:t xml:space="preserve"> généralisation ; comportement équilibré</w:t>
+              <w:t>meilleure généralisation ; écart train/test quasi nul</w:t>
             </w:r>
           </w:p>
         </w:tc>
@@ -6392,7 +4859,7 @@
         <w:pStyle w:val="Titre2"/>
         <w:spacing w:before="220" w:after="100"/>
       </w:pPr>
-      <w:bookmarkStart w:id="24" w:name="_Toc235380967"/>
+      <w:bookmarkStart w:id="24" w:name="_Toc235392551"/>
       <w:r>
         <w:rPr>
           <w:rFonts w:ascii="Cambria" w:eastAsia="Cambria" w:hAnsi="Cambria" w:cs="Cambria"/>
@@ -6402,6 +4869,7 @@
           <w:sz w:val="25"/>
           <w:szCs w:val="25"/>
         </w:rPr>
+        <w:lastRenderedPageBreak/>
         <w:t>8.6 Coût computationnel et choix d'implémentation</w:t>
       </w:r>
       <w:bookmarkEnd w:id="24"/>
@@ -6412,16 +4880,7 @@
         <w:jc w:val="both"/>
       </w:pPr>
       <w:r>
-        <w:lastRenderedPageBreak/>
-        <w:t>Les modèles n'ont pas le même coût. Le modèle linéaire et le MLP s'entraînent en un temps raisonnable, proportionnel au nombre d'exemples et d'itérations. Le RBF nécessite la recherche des centres (k-</w:t>
-      </w:r>
-      <w:proofErr w:type="spellStart"/>
-      <w:r>
-        <w:t>means</w:t>
-      </w:r>
-      <w:proofErr w:type="spellEnd"/>
-      <w:r>
-        <w:t>) puis une résolution aux moindres carrés dont le coût croît avec le nombre de centres. Le SVM dual est le plus coûteux : sa complexité en O(n²) sur le nombre d'exemples, mesurée en figure dédiée, nous a contraints à travailler sur un sous-ensemble. Ces considérations de coût, souvent absentes des présentations purement théoriques, font partie intégrante du choix d'un modèle face à un problème réel.</w:t>
+        <w:t>Les modèles n'ont pas le même coût. Le modèle linéaire et le MLP s'entraînent en un temps raisonnable, proportionnel au nombre d'exemples et d'itérations. Le RBF nécessite la recherche des centres (k-means) puis une résolution aux moindres carrés dont le coût croît avec le nombre de centres. Le SVM dual est le plus coûteux : sa complexité en O(n²) sur le nombre d'exemples, mesurée en figure dédiée, nous a contraints à travailler sur un sous-ensemble. Ces considérations de coût, souvent absentes des présentations purement théoriques, font partie intégrante du choix d'un modèle face à un problème réel.</w:t>
       </w:r>
     </w:p>
     <w:p>
@@ -6429,7 +4888,7 @@
         <w:pStyle w:val="Titre1"/>
         <w:spacing w:before="300" w:after="140"/>
       </w:pPr>
-      <w:bookmarkStart w:id="25" w:name="_Toc235380968"/>
+      <w:bookmarkStart w:id="25" w:name="_Toc235392552"/>
       <w:r>
         <w:rPr>
           <w:rFonts w:ascii="Cambria" w:eastAsia="Cambria" w:hAnsi="Cambria" w:cs="Cambria"/>
@@ -6462,10 +4921,10 @@
           <w:noProof/>
         </w:rPr>
         <w:drawing>
-          <wp:inline distT="0" distB="0" distL="0" distR="0" wp14:anchorId="7EC79B72" wp14:editId="4AA36BCF">
+          <wp:inline distT="0" distB="0" distL="0" distR="0" wp14:anchorId="1A357349" wp14:editId="0F94702B">
             <wp:extent cx="5715000" cy="3429000"/>
             <wp:effectExtent l="0" t="0" r="0" b="0"/>
-            <wp:docPr id="325689059" name="Image 325689059"/>
+            <wp:docPr id="1618928921" name="Image 1618928921"/>
             <wp:cNvGraphicFramePr>
               <a:graphicFrameLocks xmlns:a="http://schemas.openxmlformats.org/drawingml/2006/main" noChangeAspect="1"/>
             </wp:cNvGraphicFramePr>
@@ -6514,29 +4973,7 @@
           <w:sz w:val="18"/>
           <w:szCs w:val="18"/>
         </w:rPr>
-        <w:t xml:space="preserve">Précision par classe : quel modèle s'effondre sur une classe ? (MLP en configuration initiale, </w:t>
-      </w:r>
-      <w:proofErr w:type="spellStart"/>
-      <w:r>
-        <w:rPr>
-          <w:i/>
-          <w:iCs/>
-          <w:color w:val="666666"/>
-          <w:sz w:val="18"/>
-          <w:szCs w:val="18"/>
-        </w:rPr>
-        <w:t>tanh</w:t>
-      </w:r>
-      <w:proofErr w:type="spellEnd"/>
-      <w:r>
-        <w:rPr>
-          <w:i/>
-          <w:iCs/>
-          <w:color w:val="666666"/>
-          <w:sz w:val="18"/>
-          <w:szCs w:val="18"/>
-        </w:rPr>
-        <w:t>)</w:t>
+        <w:t>Précision par classe : quel modèle s'effondre sur une classe ?</w:t>
       </w:r>
     </w:p>
     <w:p>
@@ -6545,23 +4982,7 @@
         <w:jc w:val="both"/>
       </w:pPr>
       <w:r>
-        <w:t xml:space="preserve">Ce graphique est le plus instructif du projet. Le modèle linéaire et le MLP (en configuration </w:t>
-      </w:r>
-      <w:proofErr w:type="spellStart"/>
-      <w:r>
-        <w:t>tanh</w:t>
-      </w:r>
-      <w:proofErr w:type="spellEnd"/>
-      <w:r>
-        <w:t xml:space="preserve">) prédisent presque systématiquement </w:t>
-      </w:r>
-      <w:proofErr w:type="gramStart"/>
-      <w:r>
-        <w:t>la classe animal</w:t>
-      </w:r>
-      <w:proofErr w:type="gramEnd"/>
-      <w:r>
-        <w:t xml:space="preserve"> : leur précision est proche de 0 % sur humain et aucun, ils s'effondrent sur une seule classe. À l'inverse, le SVM est le modèle le plus équilibré entre les trois classes (de l'ordre de 36 / 40 / 48 % sur aucun / humain / animal). Le RBF, lui, obtient la meilleure précision globale mais reste déséquilibré : bon sur aucun et animal, il ne reconnaît qu'environ 14 à 16 % des humains. Meilleure précision globale (RBF) et meilleur équilibre entre classes (SVM) ne coïncident donc pas — un enseignement important : la métrique agrégée ne suffit jamais, il faut examiner la précision par classe. Le MLP finalement déployé (sigmoïde) est d'ailleurs nettement plus équilibré que sa version initiale : environ 24 % sur aucun, 48 % sur humain et 64 % sur animal.</w:t>
+        <w:t>Ce graphique est le plus instructif du projet. Le modèle linéaire prédit presque systématiquement la classe animal (environ 90 %) : sa précision tombe à 2 % sur aucun et 22 % sur humain, il s'effondre sur une seule classe. Le MLP, en sigmoïde, est au contraire assez équilibré (de l'ordre de 50 / 34 / 56 % sur aucun / humain / animal). Le SVM est lui aussi équilibré entre les trois classes (36 / 40 / 48 %). Le RBF obtient la meilleure précision globale mais reste déséquilibré : bon sur aucun (66 %) et animal (66 %), il ne reconnaît qu'environ 14 % des humains. Meilleure précision globale (RBF) et meilleur équilibre entre classes (SVM et MLP) ne coïncident donc pas — un enseignement important : la métrique agrégée ne suffit jamais, il faut examiner la précision par classe.</w:t>
       </w:r>
     </w:p>
     <w:p>
@@ -6588,7 +5009,7 @@
         <w:pStyle w:val="Titre1"/>
         <w:spacing w:before="300" w:after="140"/>
       </w:pPr>
-      <w:bookmarkStart w:id="26" w:name="_Toc235380969"/>
+      <w:bookmarkStart w:id="26" w:name="_Toc235392553"/>
       <w:r>
         <w:rPr>
           <w:rFonts w:ascii="Cambria" w:eastAsia="Cambria" w:hAnsi="Cambria" w:cs="Cambria"/>
@@ -6608,15 +5029,7 @@
         <w:jc w:val="both"/>
       </w:pPr>
       <w:r>
-        <w:t>La difficulté la plus structurante n'a pas été technique au sens strict, mais méthodologique. Lors d'un point d'étape devant l'enseignant début juillet, celui-ci a constaté que notre calcul de la fonction de coût (</w:t>
-      </w:r>
-      <w:proofErr w:type="spellStart"/>
-      <w:r>
-        <w:t>loss</w:t>
-      </w:r>
-      <w:proofErr w:type="spellEnd"/>
-      <w:r>
-        <w:t>) était erroné. Ce constat remettait en cause la validité de résultats que nous pensions acquis.</w:t>
+        <w:t>La difficulté la plus structurante n'a pas été technique au sens strict, mais méthodologique. Lors d'un point d'étape devant l'enseignant début juillet, celui-ci a constaté que notre calcul de la fonction de coût (loss) était erroné. Ce constat remettait en cause la validité de résultats que nous pensions acquis.</w:t>
       </w:r>
     </w:p>
     <w:p>
@@ -6625,23 +5038,7 @@
         <w:jc w:val="both"/>
       </w:pPr>
       <w:r>
-        <w:t xml:space="preserve">Plutôt que de corriger superficiellement, nous avons fait le choix assumé de tout remettre à plat. Nous sommes repartis sur des bases propres, en reprenant chaque fichier à zéro pour nous assurer que chaque ligne de code était comprise, justifiée et conforme à la théorie. Cette décision a été bénéfique pour la solidité et la maîtrise du code final, mais elle a eu un coût : le temps consacré à cette reconstruction nous a empêchés de mener à bien certains objectifs prévus, notamment la comparaison de nos implémentations avec </w:t>
-      </w:r>
-      <w:proofErr w:type="spellStart"/>
-      <w:r>
-        <w:t>TensorFlow</w:t>
-      </w:r>
-      <w:proofErr w:type="spellEnd"/>
-      <w:r>
-        <w:t>/</w:t>
-      </w:r>
-      <w:proofErr w:type="spellStart"/>
-      <w:r>
-        <w:t>Keras</w:t>
-      </w:r>
-      <w:proofErr w:type="spellEnd"/>
-      <w:r>
-        <w:t xml:space="preserve"> (pourtant autorisée à titre comparatif) et quelques modèles et optimisations supplémentaires que nous souhaitions explorer.</w:t>
+        <w:t>Plutôt que de corriger superficiellement, nous avons fait le choix assumé de tout remettre à plat. Nous sommes repartis sur des bases propres, en reprenant chaque fichier à zéro pour nous assurer que chaque ligne de code était comprise, justifiée et conforme à la théorie. Cette décision a été bénéfique pour la solidité et la maîtrise du code final, mais elle a eu un coût : le temps consacré à cette reconstruction nous a empêchés de mener à bien certains objectifs prévus, notamment la comparaison de nos implémentations avec TensorFlow/Keras (pourtant autorisée à titre comparatif) et quelques modèles et optimisations supplémentaires que nous souhaitions explorer.</w:t>
       </w:r>
     </w:p>
     <w:p>
@@ -6650,15 +5047,7 @@
         <w:jc w:val="both"/>
       </w:pPr>
       <w:r>
-        <w:t xml:space="preserve">Cet épisode illustre un principe important : dans un projet où le code doit être parfaitement maîtrisé, une base saine mais incomplète vaut mieux qu'une base plus fournie mais mal comprise. La validation sur les cas de tests a joué ici un rôle central : c'est en revérifiant systématiquement le comportement de chaque modèle sur ces cas connus (linéaire KO sur le XOR, MLP et RBF OK) que nous avons pu confirmer que les implémentations reconstruites étaient cette fois correctes avant de les réappliquer à notre </w:t>
-      </w:r>
-      <w:proofErr w:type="spellStart"/>
-      <w:r>
-        <w:t>dataset</w:t>
-      </w:r>
-      <w:proofErr w:type="spellEnd"/>
-      <w:r>
-        <w:t>.</w:t>
+        <w:t>Cet épisode illustre un principe important : dans un projet où le code doit être parfaitement maîtrisé, une base saine mais incomplète vaut mieux qu'une base plus fournie mais mal comprise. La validation sur les cas de tests a joué ici un rôle central : c'est en revérifiant systématiquement le comportement de chaque modèle sur ces cas connus (linéaire KO sur le XOR, MLP et RBF OK) que nous avons pu confirmer que les implémentations reconstruites étaient cette fois correctes avant de les réappliquer à notre dataset.</w:t>
       </w:r>
     </w:p>
     <w:p>
@@ -6685,7 +5074,7 @@
         <w:pStyle w:val="Titre1"/>
         <w:spacing w:before="300" w:after="140"/>
       </w:pPr>
-      <w:bookmarkStart w:id="27" w:name="_Toc235380970"/>
+      <w:bookmarkStart w:id="27" w:name="_Toc235392554"/>
       <w:r>
         <w:rPr>
           <w:rFonts w:ascii="Cambria" w:eastAsia="Cambria" w:hAnsi="Cambria" w:cs="Cambria"/>
@@ -6721,23 +5110,25 @@
         <w:t xml:space="preserve">Valentin BROUC — </w:t>
       </w:r>
       <w:r>
-        <w:t xml:space="preserve">modèle linéaire et SVM en Rust, bindings </w:t>
-      </w:r>
-      <w:proofErr w:type="spellStart"/>
-      <w:r>
-        <w:t>ctypes</w:t>
-      </w:r>
-      <w:proofErr w:type="spellEnd"/>
-      <w:r>
-        <w:t xml:space="preserve"> (Rust ↔ Python), cas de tests des modèles linéaire et SVM. Ma contribution s'est surtout concentrée sur la compréhension approfondie des mathématiques derrière chaque modèle. À la suite de la remise à plat, j'ai passé beaucoup de temps à m'assurer que le code produit et intégré traduisait fidèlement la théorie : que la règle du perceptron, la rétropropagation du MLP, la formulation duale du SVM et le noyau RBF correspondaient bien à ce que nous attendions d'abord sur les cas de tests de l'enseignant, puis sur notre </w:t>
-      </w:r>
-      <w:proofErr w:type="spellStart"/>
-      <w:r>
-        <w:t>dataset</w:t>
-      </w:r>
-      <w:proofErr w:type="spellEnd"/>
-      <w:r>
-        <w:t>. Cet effort de vérification mathématique a été la garantie que nos résultats reposaient sur des implémentations correctes et défendables.</w:t>
+        <w:t xml:space="preserve">modèle linéaire et SVM en Rust, bindings ctypes (Rust ↔ Python), cas de tests des modèles linéaire et SVM. </w:t>
+      </w:r>
+      <w:r>
+        <w:t>S</w:t>
+      </w:r>
+      <w:r>
+        <w:t xml:space="preserve">urtout concentrée sur la compréhension approfondie des mathématiques derrière chaque modèle. À la suite de la remise à plat, </w:t>
+      </w:r>
+      <w:r>
+        <w:t>a</w:t>
+      </w:r>
+      <w:r>
+        <w:t xml:space="preserve"> passé beaucoup de temps à </w:t>
+      </w:r>
+      <w:r>
+        <w:t>s</w:t>
+      </w:r>
+      <w:r>
+        <w:t>'assurer que le code produit et intégré traduisait fidèlement la théorie : que la règle du perceptron, la rétropropagation du MLP, la formulation duale du SVM et le noyau RBF correspondaient bien à ce que nous attendions d'abord sur les cas de tests de l'enseignant, puis sur notre dataset. Cet effort de vérification mathématique a été la garantie que nos résultats reposaient sur des implémentations correctes et défendables.</w:t>
       </w:r>
     </w:p>
     <w:p>
@@ -6745,72 +5136,31 @@
         <w:spacing w:after="200" w:line="320" w:lineRule="auto"/>
         <w:jc w:val="both"/>
       </w:pPr>
-      <w:proofErr w:type="spellStart"/>
       <w:r>
         <w:rPr>
           <w:b/>
           <w:bCs/>
         </w:rPr>
-        <w:t>Thinina</w:t>
-      </w:r>
-      <w:proofErr w:type="spellEnd"/>
+        <w:t xml:space="preserve">Thinina HADDAD — </w:t>
+      </w:r>
+      <w:r>
+        <w:t>Perceptron Multi-Couches (PMC) en Rust, API serveur (FastAPI) et prétraitement/constitution du dataset ; a refait les notebooks de cas de tests et d'expérimentation pour coller aux cas de l'enseignant, ajouté la sauvegarde/chargement de plusieurs modèles, nettoyé le dépôt et fusionné les branches.</w:t>
+      </w:r>
+    </w:p>
+    <w:p>
+      <w:pPr>
+        <w:spacing w:after="200" w:line="320" w:lineRule="auto"/>
+        <w:jc w:val="both"/>
+      </w:pPr>
       <w:r>
         <w:rPr>
           <w:b/>
           <w:bCs/>
         </w:rPr>
-        <w:t xml:space="preserve"> HADDAD — </w:t>
-      </w:r>
-      <w:r>
-        <w:t xml:space="preserve">Perceptron </w:t>
-      </w:r>
-      <w:proofErr w:type="spellStart"/>
-      <w:r>
-        <w:t>Multi-Couches</w:t>
-      </w:r>
-      <w:proofErr w:type="spellEnd"/>
-      <w:r>
-        <w:t xml:space="preserve"> (PMC) en Rust, API serveur (</w:t>
-      </w:r>
-      <w:proofErr w:type="spellStart"/>
-      <w:r>
-        <w:t>FastAPI</w:t>
-      </w:r>
-      <w:proofErr w:type="spellEnd"/>
-      <w:r>
-        <w:t xml:space="preserve">) et prétraitement/constitution du </w:t>
-      </w:r>
-      <w:proofErr w:type="spellStart"/>
-      <w:r>
-        <w:t>dataset</w:t>
-      </w:r>
-      <w:proofErr w:type="spellEnd"/>
-      <w:r>
-        <w:t xml:space="preserve"> ; a refait les notebooks de cas de tests et d'expérimentation pour coller aux cas de l'enseignant, ajouté la sauvegarde/chargement de plusieurs modèles, nettoyé le dépôt et fusionné les branches.</w:t>
-      </w:r>
-    </w:p>
-    <w:p>
-      <w:pPr>
-        <w:spacing w:after="200" w:line="320" w:lineRule="auto"/>
-        <w:jc w:val="both"/>
-      </w:pPr>
-      <w:r>
-        <w:rPr>
-          <w:b/>
-          <w:bCs/>
-        </w:rPr>
         <w:t xml:space="preserve">Ali SINCER — </w:t>
       </w:r>
       <w:r>
-        <w:t xml:space="preserve">Radial Basis </w:t>
-      </w:r>
-      <w:proofErr w:type="spellStart"/>
-      <w:r>
-        <w:t>Function</w:t>
-      </w:r>
-      <w:proofErr w:type="spellEnd"/>
-      <w:r>
-        <w:t xml:space="preserve"> Network en Rust, client web relié à l'API, expérimentations et courbes (linéaire, SVM, RBF), intégration et fusion des branches.</w:t>
+        <w:t>Radial Basis Function Network en Rust, client web relié à l'API, expérimentations et courbes (linéaire, SVM, RBF), intégration et fusion des branches.</w:t>
       </w:r>
     </w:p>
     <w:p>
@@ -6818,7 +5168,7 @@
         <w:pStyle w:val="Titre1"/>
         <w:spacing w:before="300" w:after="140"/>
       </w:pPr>
-      <w:bookmarkStart w:id="28" w:name="_Toc235380971"/>
+      <w:bookmarkStart w:id="28" w:name="_Toc235392555"/>
       <w:r>
         <w:rPr>
           <w:rFonts w:ascii="Cambria" w:eastAsia="Cambria" w:hAnsi="Cambria" w:cs="Cambria"/>
@@ -6838,7 +5188,7 @@
         <w:jc w:val="both"/>
       </w:pPr>
       <w:r>
-        <w:t>Nous avons implémenté nous-mêmes, en Rust, quatre modèles de Machine Learning, validés sur les cas de tests du cours, puis appliqués à une tâche réelle de classification d'images à trois classes, le tout intégré dans une chaîne complète (bibliothèque, interopérabilité, API, client web). L'étude comparative montre que, sur des pixels bruts, le RBF généralise le mieux (~48 %), le SVM sur-apprend, et le modèle linéaire reste au niveau du hasard — résultats modestes mais cohérents et pleinement expliqués.</w:t>
+        <w:t>Nous avons implémenté nous-mêmes, en Rust, quatre modèles de Machine Learning, validés sur les cas de tests du cours, puis appliqués à une tâche réelle de classification d'images à trois classes, le tout intégré dans une chaîne complète (bibliothèque, interopérabilité, API, client web). L'étude comparative montre que, sur des pixels bruts, le RBF généralise le mieux (~48 %), le SVM sur-apprend, et le modèle linéaire reste tout juste au-dessus du hasard — résultats modestes mais cohérents et pleinement expliqués.</w:t>
       </w:r>
     </w:p>
     <w:p>
@@ -6847,35 +5197,11 @@
         <w:jc w:val="both"/>
       </w:pPr>
       <w:r>
-        <w:t xml:space="preserve">Avec le recul, plusieurs choses seraient à refaire différemment. Sur l'organisation, il aurait fallu cadrer plus tôt le </w:t>
-      </w:r>
-      <w:proofErr w:type="spellStart"/>
-      <w:r>
-        <w:t>dataset</w:t>
-      </w:r>
-      <w:proofErr w:type="spellEnd"/>
-      <w:r>
-        <w:t xml:space="preserve"> et les métriques, et travailler dès le départ sur une architecture et </w:t>
-      </w:r>
-      <w:proofErr w:type="gramStart"/>
-      <w:r>
-        <w:t>une branche uniques</w:t>
-      </w:r>
-      <w:proofErr w:type="gramEnd"/>
-      <w:r>
-        <w:t xml:space="preserve"> pour éviter la coexistence de versions concurrentes. Sur la méthode, le réglage des hyperparamètres </w:t>
+        <w:t xml:space="preserve">Avec le recul, plusieurs choses seraient à refaire différemment. Sur l'organisation, il aurait fallu cadrer plus tôt le dataset et les métriques, et travailler dès le départ sur une architecture et une branche uniques pour éviter la coexistence de versions concurrentes. Sur la méthode, le réglage des hyperparamètres aurait gagné à être systématique dès le début. Enfin, la vérification de la fonction de coût aurait dû être </w:t>
       </w:r>
       <w:r>
         <w:lastRenderedPageBreak/>
-        <w:t xml:space="preserve">aurait gagné à être systématique dès le début. Enfin, la vérification de la fonction de coût aurait dû être faite plus tôt : l'avoir détectée tardivement nous a coûté la comparaison avec </w:t>
-      </w:r>
-      <w:proofErr w:type="spellStart"/>
-      <w:r>
-        <w:t>Keras</w:t>
-      </w:r>
-      <w:proofErr w:type="spellEnd"/>
-      <w:r>
-        <w:t xml:space="preserve"> et quelques extensions.</w:t>
+        <w:t>faite plus tôt : l'avoir détectée tardivement nous a coûté la comparaison avec Keras et quelques extensions.</w:t>
       </w:r>
     </w:p>
     <w:p>
@@ -6884,15 +5210,7 @@
         <w:jc w:val="both"/>
       </w:pPr>
       <w:r>
-        <w:t xml:space="preserve">En ouverture, la limite principale de notre approche est claire : les modèles traitent l'image comme un vecteur de pixels à plat et n'exploitent pas sa structure spatiale. Un réseau de neurones convolutif (CNN) serait l'outil adapté et constituerait la suite naturelle du projet, en le comparant à nos implémentations. Un </w:t>
-      </w:r>
-      <w:proofErr w:type="spellStart"/>
-      <w:r>
-        <w:t>dataset</w:t>
-      </w:r>
-      <w:proofErr w:type="spellEnd"/>
-      <w:r>
-        <w:t xml:space="preserve"> plus grand, plus varié et mieux équilibré, ainsi qu'un travail explicite sur les biais observés, permettraient également d'améliorer sensiblement les performances et l'équité entre classes.</w:t>
+        <w:t>En ouverture, la limite principale de notre approche est claire : les modèles traitent l'image comme un vecteur de pixels à plat et n'exploitent pas sa structure spatiale. Un réseau de neurones convolutif (CNN) serait l'outil adapté et constituerait la suite naturelle du projet, en le comparant à nos implémentations. Un dataset plus grand, plus varié et mieux équilibré, ainsi qu'un travail explicite sur les biais observés, permettraient également d'améliorer sensiblement les performances et l'équité entre classes.</w:t>
       </w:r>
     </w:p>
     <w:p>
@@ -6905,7 +5223,7 @@
         <w:pStyle w:val="Titre1"/>
         <w:spacing w:before="300" w:after="140"/>
       </w:pPr>
-      <w:bookmarkStart w:id="29" w:name="_Toc235380972"/>
+      <w:bookmarkStart w:id="29" w:name="_Toc235392556"/>
       <w:r>
         <w:rPr>
           <w:rFonts w:ascii="Cambria" w:eastAsia="Cambria" w:hAnsi="Cambria" w:cs="Cambria"/>
@@ -6939,23 +5257,19 @@
         <w:spacing w:after="90"/>
       </w:pPr>
       <w:r>
-        <w:t xml:space="preserve">Modèle linéaire : </w:t>
-      </w:r>
-      <w:proofErr w:type="spellStart"/>
-      <w:r>
-        <w:t>learning</w:t>
-      </w:r>
-      <w:proofErr w:type="spellEnd"/>
-      <w:r>
-        <w:t xml:space="preserve"> rate 0,01, 50 </w:t>
-      </w:r>
-      <w:proofErr w:type="spellStart"/>
-      <w:r>
-        <w:t>epochs</w:t>
-      </w:r>
-      <w:proofErr w:type="spellEnd"/>
-      <w:r>
-        <w:t xml:space="preserve"> ; stratégie un-contre-tous pour les trois classes.</w:t>
+        <w:t>Modèle linéaire : learning rate 0,0</w:t>
+      </w:r>
+      <w:r>
+        <w:t>0</w:t>
+      </w:r>
+      <w:r>
+        <w:t xml:space="preserve">1, </w:t>
+      </w:r>
+      <w:r>
+        <w:t>200</w:t>
+      </w:r>
+      <w:r>
+        <w:t xml:space="preserve"> epochs ; stratégie un-contre-tous pour les trois classes.</w:t>
       </w:r>
     </w:p>
     <w:p>
@@ -6968,15 +5282,7 @@
         <w:spacing w:after="90"/>
       </w:pPr>
       <w:r>
-        <w:t xml:space="preserve">PMC / MLP : architecture [12288, 32, 3], activation sigmoïde sur les couches cachées, </w:t>
-      </w:r>
-      <w:proofErr w:type="spellStart"/>
-      <w:r>
-        <w:t>learning</w:t>
-      </w:r>
-      <w:proofErr w:type="spellEnd"/>
-      <w:r>
-        <w:t xml:space="preserve"> rate 0,001, arrêt autour de 10 000 itérations.</w:t>
+        <w:t>PMC / MLP : architecture [12288, 32, 3], activation sigmoïde sur les couches cachées, learning rate 0,001, arrêt autour de 10 000 itérations.</w:t>
       </w:r>
     </w:p>
     <w:p>
@@ -7002,15 +5308,7 @@
         <w:spacing w:after="90"/>
       </w:pPr>
       <w:r>
-        <w:t>RBF : 20 centres (k-</w:t>
-      </w:r>
-      <w:proofErr w:type="spellStart"/>
-      <w:r>
-        <w:t>means</w:t>
-      </w:r>
-      <w:proofErr w:type="spellEnd"/>
-      <w:r>
-        <w:t>, 15 itérations), gamma = 0,01, poids résolus aux moindres carrés ; employé en un-contre-tous (3 réseaux binaires, sauvegardés dans un seul fichier).</w:t>
+        <w:t>RBF : 20 centres (k-means, 15 itérations), gamma = 0,01, poids résolus aux moindres carrés ; employé en un-contre-tous (3 réseaux binaires, sauvegardés dans un seul fichier).</w:t>
       </w:r>
     </w:p>
     <w:p>
@@ -7032,7 +5330,7 @@
         <w:pStyle w:val="Titre1"/>
         <w:spacing w:before="300" w:after="140"/>
       </w:pPr>
-      <w:bookmarkStart w:id="30" w:name="_Toc235380973"/>
+      <w:bookmarkStart w:id="30" w:name="_Toc235392557"/>
       <w:r>
         <w:rPr>
           <w:rFonts w:ascii="Cambria" w:eastAsia="Cambria" w:hAnsi="Cambria" w:cs="Cambria"/>
@@ -7088,31 +5386,7 @@
         <w:spacing w:after="90"/>
       </w:pPr>
       <w:r>
-        <w:t>Documentation Rust (</w:t>
-      </w:r>
-      <w:proofErr w:type="spellStart"/>
-      <w:r>
-        <w:t>crate</w:t>
-      </w:r>
-      <w:proofErr w:type="spellEnd"/>
-      <w:r>
-        <w:t xml:space="preserve">-type </w:t>
-      </w:r>
-      <w:proofErr w:type="spellStart"/>
-      <w:r>
-        <w:t>cdylib</w:t>
-      </w:r>
-      <w:proofErr w:type="spellEnd"/>
-      <w:r>
-        <w:t xml:space="preserve">) et Python </w:t>
-      </w:r>
-      <w:proofErr w:type="spellStart"/>
-      <w:r>
-        <w:t>ctypes</w:t>
-      </w:r>
-      <w:proofErr w:type="spellEnd"/>
-      <w:r>
-        <w:t xml:space="preserve"> pour l'interopérabilité.</w:t>
+        <w:t>Documentation Rust (crate-type cdylib) et Python ctypes pour l'interopérabilité.</w:t>
       </w:r>
     </w:p>
     <w:sectPr>
@@ -7226,96 +5500,10 @@
 <file path=word/numbering.xml><?xml version="1.0" encoding="utf-8"?>
 <w:numbering xmlns:wpc="http://schemas.microsoft.com/office/word/2010/wordprocessingCanvas" xmlns:cx="http://schemas.microsoft.com/office/drawing/2014/chartex" xmlns:cx1="http://schemas.microsoft.com/office/drawing/2015/9/8/chartex" xmlns:cx2="http://schemas.microsoft.com/office/drawing/2015/10/21/chartex" xmlns:cx3="http://schemas.microsoft.com/office/drawing/2016/5/9/chartex" xmlns:cx4="http://schemas.microsoft.com/office/drawing/2016/5/10/chartex" xmlns:cx5="http://schemas.microsoft.com/office/drawing/2016/5/11/chartex" xmlns:cx6="http://schemas.microsoft.com/office/drawing/2016/5/12/chartex" xmlns:cx7="http://schemas.microsoft.com/office/drawing/2016/5/13/chartex" xmlns:cx8="http://schemas.microsoft.com/office/drawing/2016/5/14/chartex" xmlns:mc="http://schemas.openxmlformats.org/markup-compatibility/2006" xmlns:aink="http://schemas.microsoft.com/office/drawing/2016/ink" xmlns:am3d="http://schemas.microsoft.com/office/drawing/2017/model3d" xmlns:o="urn:schemas-microsoft-com:office:office" xmlns:oel="http://schemas.microsoft.com/office/2019/extlst" xmlns:r="http://schemas.openxmlformats.org/officeDocument/2006/relationships" xmlns:m="http://schemas.openxmlformats.org/officeDocument/2006/math" xmlns:v="urn:schemas-microsoft-com:vml" xmlns:wp14="http://schemas.microsoft.com/office/word/2010/wordprocessingDrawing" xmlns:wp="http://schemas.openxmlformats.org/drawingml/2006/wordprocessingDrawing" xmlns:w10="urn:schemas-microsoft-com:office:word" xmlns:w="http://schemas.openxmlformats.org/wordprocessingml/2006/main" xmlns:w14="http://schemas.microsoft.com/office/word/2010/wordml" xmlns:w15="http://schemas.microsoft.com/office/word/2012/wordml" xmlns:w16cex="http://schemas.microsoft.com/office/word/2018/wordml/cex" xmlns:w16cid="http://schemas.microsoft.com/office/word/2016/wordml/cid" xmlns:w16="http://schemas.microsoft.com/office/word/2018/wordml" xmlns:w16du="http://schemas.microsoft.com/office/word/2023/wordml/word16du" xmlns:w16sdtdh="http://schemas.microsoft.com/office/word/2020/wordml/sdtdatahash" xmlns:w16sdtfl="http://schemas.microsoft.com/office/word/2024/wordml/sdtformatlock" xmlns:w16se="http://schemas.microsoft.com/office/word/2015/wordml/symex" xmlns:wpg="http://schemas.microsoft.com/office/word/2010/wordprocessingGroup" xmlns:wpi="http://schemas.microsoft.com/office/word/2010/wordprocessingInk" xmlns:wne="http://schemas.microsoft.com/office/word/2006/wordml" xmlns:wps="http://schemas.microsoft.com/office/word/2010/wordprocessingShape" mc:Ignorable="w14 w15 w16se w16cid w16 w16cex w16sdtdh w16sdtfl w16du wp14">
   <w:abstractNum w:abstractNumId="0" w15:restartNumberingAfterBreak="0">
-    <w:nsid w:val="09D5599E"/>
+    <w:nsid w:val="0D787563"/>
     <w:multiLevelType w:val="hybridMultilevel"/>
-    <w:tmpl w:val="024EA232"/>
-    <w:lvl w:ilvl="0" w:tplc="EC0C33C6">
-      <w:start w:val="1"/>
-      <w:numFmt w:val="bullet"/>
-      <w:lvlText w:val="●"/>
-      <w:lvlJc w:val="left"/>
-      <w:pPr>
-        <w:ind w:left="720" w:hanging="360"/>
-      </w:pPr>
-    </w:lvl>
-    <w:lvl w:ilvl="1" w:tplc="9C7E09AC">
-      <w:start w:val="1"/>
-      <w:numFmt w:val="bullet"/>
-      <w:lvlText w:val="○"/>
-      <w:lvlJc w:val="left"/>
-      <w:pPr>
-        <w:ind w:left="1440" w:hanging="360"/>
-      </w:pPr>
-    </w:lvl>
-    <w:lvl w:ilvl="2" w:tplc="6128BD3A">
-      <w:start w:val="1"/>
-      <w:numFmt w:val="bullet"/>
-      <w:lvlText w:val="■"/>
-      <w:lvlJc w:val="left"/>
-      <w:pPr>
-        <w:ind w:left="2160" w:hanging="360"/>
-      </w:pPr>
-    </w:lvl>
-    <w:lvl w:ilvl="3" w:tplc="FCBC5346">
-      <w:start w:val="1"/>
-      <w:numFmt w:val="bullet"/>
-      <w:lvlText w:val="●"/>
-      <w:lvlJc w:val="left"/>
-      <w:pPr>
-        <w:ind w:left="2880" w:hanging="360"/>
-      </w:pPr>
-    </w:lvl>
-    <w:lvl w:ilvl="4" w:tplc="208CFFE4">
-      <w:start w:val="1"/>
-      <w:numFmt w:val="bullet"/>
-      <w:lvlText w:val="○"/>
-      <w:lvlJc w:val="left"/>
-      <w:pPr>
-        <w:ind w:left="3600" w:hanging="360"/>
-      </w:pPr>
-    </w:lvl>
-    <w:lvl w:ilvl="5" w:tplc="855A3F10">
-      <w:start w:val="1"/>
-      <w:numFmt w:val="bullet"/>
-      <w:lvlText w:val="■"/>
-      <w:lvlJc w:val="left"/>
-      <w:pPr>
-        <w:ind w:left="4320" w:hanging="360"/>
-      </w:pPr>
-    </w:lvl>
-    <w:lvl w:ilvl="6" w:tplc="B3F65576">
-      <w:start w:val="1"/>
-      <w:numFmt w:val="bullet"/>
-      <w:lvlText w:val="●"/>
-      <w:lvlJc w:val="left"/>
-      <w:pPr>
-        <w:ind w:left="5040" w:hanging="360"/>
-      </w:pPr>
-    </w:lvl>
-    <w:lvl w:ilvl="7" w:tplc="1E6422A4">
-      <w:start w:val="1"/>
-      <w:numFmt w:val="bullet"/>
-      <w:lvlText w:val="●"/>
-      <w:lvlJc w:val="left"/>
-      <w:pPr>
-        <w:ind w:left="5760" w:hanging="360"/>
-      </w:pPr>
-    </w:lvl>
-    <w:lvl w:ilvl="8" w:tplc="58DA15F6">
-      <w:start w:val="1"/>
-      <w:numFmt w:val="bullet"/>
-      <w:lvlText w:val="●"/>
-      <w:lvlJc w:val="left"/>
-      <w:pPr>
-        <w:ind w:left="6480" w:hanging="360"/>
-      </w:pPr>
-    </w:lvl>
-  </w:abstractNum>
-  <w:abstractNum w:abstractNumId="1" w15:restartNumberingAfterBreak="0">
-    <w:nsid w:val="2CD3520F"/>
-    <w:multiLevelType w:val="hybridMultilevel"/>
-    <w:tmpl w:val="BDD402D6"/>
-    <w:lvl w:ilvl="0" w:tplc="40FC97A4">
+    <w:tmpl w:val="441EC9A0"/>
+    <w:lvl w:ilvl="0" w:tplc="7C0A0788">
       <w:start w:val="1"/>
       <w:numFmt w:val="bullet"/>
       <w:lvlText w:val="•"/>
@@ -7328,55 +5516,141 @@
         <w:szCs w:val="22"/>
       </w:rPr>
     </w:lvl>
-    <w:lvl w:ilvl="1" w:tplc="D4F40DA6">
+    <w:lvl w:ilvl="1" w:tplc="3564B826">
       <w:numFmt w:val="decimal"/>
       <w:lvlText w:val=""/>
       <w:lvlJc w:val="left"/>
     </w:lvl>
-    <w:lvl w:ilvl="2" w:tplc="1226B03C">
+    <w:lvl w:ilvl="2" w:tplc="4330D5EA">
       <w:numFmt w:val="decimal"/>
       <w:lvlText w:val=""/>
       <w:lvlJc w:val="left"/>
     </w:lvl>
-    <w:lvl w:ilvl="3" w:tplc="864CAA2E">
+    <w:lvl w:ilvl="3" w:tplc="21D440BE">
       <w:numFmt w:val="decimal"/>
       <w:lvlText w:val=""/>
       <w:lvlJc w:val="left"/>
     </w:lvl>
-    <w:lvl w:ilvl="4" w:tplc="4EDCE22C">
+    <w:lvl w:ilvl="4" w:tplc="301CEF2A">
       <w:numFmt w:val="decimal"/>
       <w:lvlText w:val=""/>
       <w:lvlJc w:val="left"/>
     </w:lvl>
-    <w:lvl w:ilvl="5" w:tplc="417A68B4">
+    <w:lvl w:ilvl="5" w:tplc="E5A441E6">
       <w:numFmt w:val="decimal"/>
       <w:lvlText w:val=""/>
       <w:lvlJc w:val="left"/>
     </w:lvl>
-    <w:lvl w:ilvl="6" w:tplc="20A227D2">
+    <w:lvl w:ilvl="6" w:tplc="8640A952">
       <w:numFmt w:val="decimal"/>
       <w:lvlText w:val=""/>
       <w:lvlJc w:val="left"/>
     </w:lvl>
-    <w:lvl w:ilvl="7" w:tplc="1E96DF38">
+    <w:lvl w:ilvl="7" w:tplc="198EA972">
       <w:numFmt w:val="decimal"/>
       <w:lvlText w:val=""/>
       <w:lvlJc w:val="left"/>
     </w:lvl>
-    <w:lvl w:ilvl="8" w:tplc="FA8A0FB2">
+    <w:lvl w:ilvl="8" w:tplc="F6D03908">
       <w:numFmt w:val="decimal"/>
       <w:lvlText w:val=""/>
       <w:lvlJc w:val="left"/>
     </w:lvl>
   </w:abstractNum>
-  <w:num w:numId="1" w16cid:durableId="1939219365">
-    <w:abstractNumId w:val="0"/>
+  <w:abstractNum w:abstractNumId="1" w15:restartNumberingAfterBreak="0">
+    <w:nsid w:val="7FD725EB"/>
+    <w:multiLevelType w:val="hybridMultilevel"/>
+    <w:tmpl w:val="8F18014E"/>
+    <w:lvl w:ilvl="0" w:tplc="87DC99BC">
+      <w:start w:val="1"/>
+      <w:numFmt w:val="bullet"/>
+      <w:lvlText w:val="●"/>
+      <w:lvlJc w:val="left"/>
+      <w:pPr>
+        <w:ind w:left="720" w:hanging="360"/>
+      </w:pPr>
+    </w:lvl>
+    <w:lvl w:ilvl="1" w:tplc="3E00D6D2">
+      <w:start w:val="1"/>
+      <w:numFmt w:val="bullet"/>
+      <w:lvlText w:val="○"/>
+      <w:lvlJc w:val="left"/>
+      <w:pPr>
+        <w:ind w:left="1440" w:hanging="360"/>
+      </w:pPr>
+    </w:lvl>
+    <w:lvl w:ilvl="2" w:tplc="E49A9178">
+      <w:start w:val="1"/>
+      <w:numFmt w:val="bullet"/>
+      <w:lvlText w:val="■"/>
+      <w:lvlJc w:val="left"/>
+      <w:pPr>
+        <w:ind w:left="2160" w:hanging="360"/>
+      </w:pPr>
+    </w:lvl>
+    <w:lvl w:ilvl="3" w:tplc="3EBE62FA">
+      <w:start w:val="1"/>
+      <w:numFmt w:val="bullet"/>
+      <w:lvlText w:val="●"/>
+      <w:lvlJc w:val="left"/>
+      <w:pPr>
+        <w:ind w:left="2880" w:hanging="360"/>
+      </w:pPr>
+    </w:lvl>
+    <w:lvl w:ilvl="4" w:tplc="7C3C7374">
+      <w:start w:val="1"/>
+      <w:numFmt w:val="bullet"/>
+      <w:lvlText w:val="○"/>
+      <w:lvlJc w:val="left"/>
+      <w:pPr>
+        <w:ind w:left="3600" w:hanging="360"/>
+      </w:pPr>
+    </w:lvl>
+    <w:lvl w:ilvl="5" w:tplc="8672340A">
+      <w:start w:val="1"/>
+      <w:numFmt w:val="bullet"/>
+      <w:lvlText w:val="■"/>
+      <w:lvlJc w:val="left"/>
+      <w:pPr>
+        <w:ind w:left="4320" w:hanging="360"/>
+      </w:pPr>
+    </w:lvl>
+    <w:lvl w:ilvl="6" w:tplc="AD0C44C0">
+      <w:start w:val="1"/>
+      <w:numFmt w:val="bullet"/>
+      <w:lvlText w:val="●"/>
+      <w:lvlJc w:val="left"/>
+      <w:pPr>
+        <w:ind w:left="5040" w:hanging="360"/>
+      </w:pPr>
+    </w:lvl>
+    <w:lvl w:ilvl="7" w:tplc="C97643F2">
+      <w:start w:val="1"/>
+      <w:numFmt w:val="bullet"/>
+      <w:lvlText w:val="●"/>
+      <w:lvlJc w:val="left"/>
+      <w:pPr>
+        <w:ind w:left="5760" w:hanging="360"/>
+      </w:pPr>
+    </w:lvl>
+    <w:lvl w:ilvl="8" w:tplc="E6328CEE">
+      <w:start w:val="1"/>
+      <w:numFmt w:val="bullet"/>
+      <w:lvlText w:val="●"/>
+      <w:lvlJc w:val="left"/>
+      <w:pPr>
+        <w:ind w:left="6480" w:hanging="360"/>
+      </w:pPr>
+    </w:lvl>
+  </w:abstractNum>
+  <w:num w:numId="1" w16cid:durableId="838545560">
+    <w:abstractNumId w:val="1"/>
     <w:lvlOverride w:ilvl="0">
       <w:startOverride w:val="1"/>
     </w:lvlOverride>
   </w:num>
-  <w:num w:numId="2" w16cid:durableId="1303997963">
-    <w:abstractNumId w:val="1"/>
+  <w:num w:numId="2" w16cid:durableId="1132598462">
+    <w:abstractNumId w:val="0"/>
     <w:lvlOverride w:ilvl="0">
       <w:startOverride w:val="1"/>
     </w:lvlOverride>
@@ -7988,7 +6262,7 @@
     <w:autoRedefine/>
     <w:uiPriority w:val="39"/>
     <w:unhideWhenUsed/>
-    <w:rsid w:val="008E594B"/>
+    <w:rsid w:val="00A90CF6"/>
     <w:pPr>
       <w:spacing w:after="100"/>
     </w:pPr>
@@ -8000,7 +6274,7 @@
     <w:autoRedefine/>
     <w:uiPriority w:val="39"/>
     <w:unhideWhenUsed/>
-    <w:rsid w:val="008E594B"/>
+    <w:rsid w:val="00A90CF6"/>
     <w:pPr>
       <w:spacing w:after="100"/>
       <w:ind w:left="220"/>

</xml_diff>